<commit_message>
Mapa, método de busca cep usando o viacep
</commit_message>
<xml_diff>
--- a/ProjetoLogistica/Documentação - Logística.docx
+++ b/ProjetoLogistica/Documentação - Logística.docx
@@ -1,6 +1,6 @@
 
 <file path=word/document.xml><?xml version="1.0" encoding="utf-8"?>
-<w:document xmlns:wpc="http://schemas.microsoft.com/office/word/2010/wordprocessingCanvas" xmlns:cx="http://schemas.microsoft.com/office/drawing/2014/chartex" xmlns:cx1="http://schemas.microsoft.com/office/drawing/2015/9/8/chartex" xmlns:mc="http://schemas.openxmlformats.org/markup-compatibility/2006" xmlns:o="urn:schemas-microsoft-com:office:office" xmlns:r="http://schemas.openxmlformats.org/officeDocument/2006/relationships" xmlns:m="http://schemas.openxmlformats.org/officeDocument/2006/math" xmlns:v="urn:schemas-microsoft-com:vml" xmlns:wp14="http://schemas.microsoft.com/office/word/2010/wordprocessingDrawing" xmlns:wp="http://schemas.openxmlformats.org/drawingml/2006/wordprocessingDrawing" xmlns:w10="urn:schemas-microsoft-com:office:word" xmlns:w="http://schemas.openxmlformats.org/wordprocessingml/2006/main" xmlns:w14="http://schemas.microsoft.com/office/word/2010/wordml" xmlns:w15="http://schemas.microsoft.com/office/word/2012/wordml" xmlns:w16se="http://schemas.microsoft.com/office/word/2015/wordml/symex" xmlns:wpg="http://schemas.microsoft.com/office/word/2010/wordprocessingGroup" xmlns:wpi="http://schemas.microsoft.com/office/word/2010/wordprocessingInk" xmlns:wne="http://schemas.microsoft.com/office/word/2006/wordml" xmlns:wps="http://schemas.microsoft.com/office/word/2010/wordprocessingShape" mc:Ignorable="w14 w15 w16se wp14">
+<w:document xmlns:wpc="http://schemas.microsoft.com/office/word/2010/wordprocessingCanvas" xmlns:cx="http://schemas.microsoft.com/office/drawing/2014/chartex" xmlns:cx1="http://schemas.microsoft.com/office/drawing/2015/9/8/chartex" xmlns:cx2="http://schemas.microsoft.com/office/drawing/2015/10/21/chartex" xmlns:cx3="http://schemas.microsoft.com/office/drawing/2016/5/9/chartex" xmlns:cx4="http://schemas.microsoft.com/office/drawing/2016/5/10/chartex" xmlns:cx5="http://schemas.microsoft.com/office/drawing/2016/5/11/chartex" xmlns:cx6="http://schemas.microsoft.com/office/drawing/2016/5/12/chartex" xmlns:cx7="http://schemas.microsoft.com/office/drawing/2016/5/13/chartex" xmlns:cx8="http://schemas.microsoft.com/office/drawing/2016/5/14/chartex" xmlns:mc="http://schemas.openxmlformats.org/markup-compatibility/2006" xmlns:aink="http://schemas.microsoft.com/office/drawing/2016/ink" xmlns:am3d="http://schemas.microsoft.com/office/drawing/2017/model3d" xmlns:o="urn:schemas-microsoft-com:office:office" xmlns:oel="http://schemas.microsoft.com/office/2019/extlst" xmlns:r="http://schemas.openxmlformats.org/officeDocument/2006/relationships" xmlns:m="http://schemas.openxmlformats.org/officeDocument/2006/math" xmlns:v="urn:schemas-microsoft-com:vml" xmlns:wp14="http://schemas.microsoft.com/office/word/2010/wordprocessingDrawing" xmlns:wp="http://schemas.openxmlformats.org/drawingml/2006/wordprocessingDrawing" xmlns:w10="urn:schemas-microsoft-com:office:word" xmlns:w="http://schemas.openxmlformats.org/wordprocessingml/2006/main" xmlns:w14="http://schemas.microsoft.com/office/word/2010/wordml" xmlns:w15="http://schemas.microsoft.com/office/word/2012/wordml" xmlns:w16cex="http://schemas.microsoft.com/office/word/2018/wordml/cex" xmlns:w16cid="http://schemas.microsoft.com/office/word/2016/wordml/cid" xmlns:w16="http://schemas.microsoft.com/office/word/2018/wordml" xmlns:w16du="http://schemas.microsoft.com/office/word/2023/wordml/word16du" xmlns:w16sdtdh="http://schemas.microsoft.com/office/word/2020/wordml/sdtdatahash" xmlns:w16sdtfl="http://schemas.microsoft.com/office/word/2024/wordml/sdtformatlock" xmlns:w16se="http://schemas.microsoft.com/office/word/2015/wordml/symex" xmlns:wpg="http://schemas.microsoft.com/office/word/2010/wordprocessingGroup" xmlns:wpi="http://schemas.microsoft.com/office/word/2010/wordprocessingInk" xmlns:wne="http://schemas.microsoft.com/office/word/2006/wordml" xmlns:wps="http://schemas.microsoft.com/office/word/2010/wordprocessingShape" mc:Ignorable="w14 w15 w16se w16cid w16 w16cex w16sdtdh w16sdtfl w16du wp14">
   <w:body>
     <w:p>
       <w:pPr>
@@ -641,13 +641,13 @@
         <w:tblLook w:val="04A0" w:firstRow="1" w:lastRow="0" w:firstColumn="1" w:lastColumn="0" w:noHBand="0" w:noVBand="1"/>
       </w:tblPr>
       <w:tblGrid>
-        <w:gridCol w:w="2023"/>
-        <w:gridCol w:w="1575"/>
-        <w:gridCol w:w="787"/>
-        <w:gridCol w:w="946"/>
-        <w:gridCol w:w="1607"/>
-        <w:gridCol w:w="1491"/>
-        <w:gridCol w:w="2037"/>
+        <w:gridCol w:w="1708"/>
+        <w:gridCol w:w="1608"/>
+        <w:gridCol w:w="821"/>
+        <w:gridCol w:w="980"/>
+        <w:gridCol w:w="1714"/>
+        <w:gridCol w:w="1593"/>
+        <w:gridCol w:w="2042"/>
       </w:tblGrid>
       <w:tr>
         <w:trPr>
@@ -668,7 +668,6 @@
                 <w:bCs/>
               </w:rPr>
             </w:pPr>
-            <w:bookmarkStart w:id="0" w:name="_GoBack"/>
             <w:r>
               <w:rPr>
                 <w:rFonts w:ascii="Candara" w:hAnsi="Candara"/>
@@ -1723,7 +1722,6 @@
           <w:tcPr>
             <w:tcW w:w="0" w:type="auto"/>
             <w:vAlign w:val="center"/>
-            <w:hideMark/>
           </w:tcPr>
           <w:p>
             <w:pPr>
@@ -1733,21 +1731,21 @@
                 <w:bCs/>
               </w:rPr>
             </w:pPr>
-            <w:r>
+          </w:p>
+          <w:p>
+            <w:pPr>
               <w:rPr>
                 <w:rFonts w:ascii="Candara" w:hAnsi="Candara"/>
                 <w:b/>
                 <w:bCs/>
               </w:rPr>
-              <w:t>Caminhão Baú Médio (Semipesado)</w:t>
-            </w:r>
+            </w:pPr>
           </w:p>
         </w:tc>
         <w:tc>
           <w:tcPr>
             <w:tcW w:w="0" w:type="auto"/>
             <w:vAlign w:val="center"/>
-            <w:hideMark/>
           </w:tcPr>
           <w:p>
             <w:pPr>
@@ -1755,43 +1753,12 @@
                 <w:rFonts w:ascii="Candara" w:hAnsi="Candara"/>
               </w:rPr>
             </w:pPr>
-            <w:r>
-              <w:rPr>
-                <w:rFonts w:ascii="Candara" w:hAnsi="Candara"/>
-              </w:rPr>
-              <w:t>9,0</w:t>
-            </w:r>
-            <w:r>
-              <w:rPr>
-                <w:rFonts w:ascii="Arial" w:hAnsi="Arial" w:cs="Arial"/>
-              </w:rPr>
-              <w:t> </w:t>
-            </w:r>
-            <w:r>
-              <w:rPr>
-                <w:rFonts w:ascii="Candara" w:hAnsi="Candara" w:cs="Candara"/>
-              </w:rPr>
-              <w:t>–</w:t>
-            </w:r>
-            <w:r>
-              <w:rPr>
-                <w:rFonts w:ascii="Arial" w:hAnsi="Arial" w:cs="Arial"/>
-              </w:rPr>
-              <w:t> </w:t>
-            </w:r>
-            <w:r>
-              <w:rPr>
-                <w:rFonts w:ascii="Candara" w:hAnsi="Candara"/>
-              </w:rPr>
-              <w:t>11,0</w:t>
-            </w:r>
           </w:p>
         </w:tc>
         <w:tc>
           <w:tcPr>
             <w:tcW w:w="0" w:type="auto"/>
             <w:vAlign w:val="center"/>
-            <w:hideMark/>
           </w:tcPr>
           <w:p>
             <w:pPr>
@@ -1799,19 +1766,12 @@
                 <w:rFonts w:ascii="Candara" w:hAnsi="Candara"/>
               </w:rPr>
             </w:pPr>
-            <w:r>
-              <w:rPr>
-                <w:rFonts w:ascii="Candara" w:hAnsi="Candara"/>
-              </w:rPr>
-              <w:t>2,8</w:t>
-            </w:r>
           </w:p>
         </w:tc>
         <w:tc>
           <w:tcPr>
             <w:tcW w:w="0" w:type="auto"/>
             <w:vAlign w:val="center"/>
-            <w:hideMark/>
           </w:tcPr>
           <w:p>
             <w:pPr>
@@ -1819,19 +1779,12 @@
                 <w:rFonts w:ascii="Candara" w:hAnsi="Candara"/>
               </w:rPr>
             </w:pPr>
-            <w:r>
-              <w:rPr>
-                <w:rFonts w:ascii="Candara" w:hAnsi="Candara"/>
-              </w:rPr>
-              <w:t>2,5</w:t>
-            </w:r>
           </w:p>
         </w:tc>
         <w:tc>
           <w:tcPr>
             <w:tcW w:w="0" w:type="auto"/>
             <w:vAlign w:val="center"/>
-            <w:hideMark/>
           </w:tcPr>
           <w:p>
             <w:pPr>
@@ -1839,43 +1792,12 @@
                 <w:rFonts w:ascii="Candara" w:hAnsi="Candara"/>
               </w:rPr>
             </w:pPr>
-            <w:r>
-              <w:rPr>
-                <w:rFonts w:ascii="Candara" w:hAnsi="Candara"/>
-              </w:rPr>
-              <w:t>45</w:t>
-            </w:r>
-            <w:r>
-              <w:rPr>
-                <w:rFonts w:ascii="Arial" w:hAnsi="Arial" w:cs="Arial"/>
-              </w:rPr>
-              <w:t> </w:t>
-            </w:r>
-            <w:r>
-              <w:rPr>
-                <w:rFonts w:ascii="Candara" w:hAnsi="Candara" w:cs="Candara"/>
-              </w:rPr>
-              <w:t>–</w:t>
-            </w:r>
-            <w:r>
-              <w:rPr>
-                <w:rFonts w:ascii="Arial" w:hAnsi="Arial" w:cs="Arial"/>
-              </w:rPr>
-              <w:t> </w:t>
-            </w:r>
-            <w:r>
-              <w:rPr>
-                <w:rFonts w:ascii="Candara" w:hAnsi="Candara"/>
-              </w:rPr>
-              <w:t>55</w:t>
-            </w:r>
           </w:p>
         </w:tc>
         <w:tc>
           <w:tcPr>
             <w:tcW w:w="0" w:type="auto"/>
             <w:vAlign w:val="center"/>
-            <w:hideMark/>
           </w:tcPr>
           <w:p>
             <w:pPr>
@@ -1883,43 +1805,12 @@
                 <w:rFonts w:ascii="Candara" w:hAnsi="Candara"/>
               </w:rPr>
             </w:pPr>
-            <w:r>
-              <w:rPr>
-                <w:rFonts w:ascii="Candara" w:hAnsi="Candara"/>
-              </w:rPr>
-              <w:t>16</w:t>
-            </w:r>
-            <w:r>
-              <w:rPr>
-                <w:rFonts w:ascii="Arial" w:hAnsi="Arial" w:cs="Arial"/>
-              </w:rPr>
-              <w:t> </w:t>
-            </w:r>
-            <w:r>
-              <w:rPr>
-                <w:rFonts w:ascii="Candara" w:hAnsi="Candara" w:cs="Candara"/>
-              </w:rPr>
-              <w:t>–</w:t>
-            </w:r>
-            <w:r>
-              <w:rPr>
-                <w:rFonts w:ascii="Arial" w:hAnsi="Arial" w:cs="Arial"/>
-              </w:rPr>
-              <w:t> </w:t>
-            </w:r>
-            <w:r>
-              <w:rPr>
-                <w:rFonts w:ascii="Candara" w:hAnsi="Candara"/>
-              </w:rPr>
-              <w:t>23</w:t>
-            </w:r>
           </w:p>
         </w:tc>
         <w:tc>
           <w:tcPr>
             <w:tcW w:w="0" w:type="auto"/>
             <w:vAlign w:val="center"/>
-            <w:hideMark/>
           </w:tcPr>
           <w:p>
             <w:pPr>
@@ -1927,12 +1818,6 @@
                 <w:rFonts w:ascii="Candara" w:hAnsi="Candara"/>
               </w:rPr>
             </w:pPr>
-            <w:r>
-              <w:rPr>
-                <w:rFonts w:ascii="Candara" w:hAnsi="Candara"/>
-              </w:rPr>
-              <w:t>Distribuição entre centros logísticos</w:t>
-            </w:r>
           </w:p>
         </w:tc>
       </w:tr>
@@ -1944,7 +1829,6 @@
           <w:tcPr>
             <w:tcW w:w="0" w:type="auto"/>
             <w:vAlign w:val="center"/>
-            <w:hideMark/>
           </w:tcPr>
           <w:p>
             <w:pPr>
@@ -1954,21 +1838,12 @@
                 <w:bCs/>
               </w:rPr>
             </w:pPr>
-            <w:r>
-              <w:rPr>
-                <w:rFonts w:ascii="Candara" w:hAnsi="Candara"/>
-                <w:b/>
-                <w:bCs/>
-              </w:rPr>
-              <w:t>Carreta Baú Simples (3 eixos)</w:t>
-            </w:r>
           </w:p>
         </w:tc>
         <w:tc>
           <w:tcPr>
             <w:tcW w:w="0" w:type="auto"/>
             <w:vAlign w:val="center"/>
-            <w:hideMark/>
           </w:tcPr>
           <w:p>
             <w:pPr>
@@ -1976,43 +1851,12 @@
                 <w:rFonts w:ascii="Candara" w:hAnsi="Candara"/>
               </w:rPr>
             </w:pPr>
-            <w:r>
-              <w:rPr>
-                <w:rFonts w:ascii="Candara" w:hAnsi="Candara"/>
-              </w:rPr>
-              <w:t>14,0</w:t>
-            </w:r>
-            <w:r>
-              <w:rPr>
-                <w:rFonts w:ascii="Arial" w:hAnsi="Arial" w:cs="Arial"/>
-              </w:rPr>
-              <w:t> </w:t>
-            </w:r>
-            <w:r>
-              <w:rPr>
-                <w:rFonts w:ascii="Candara" w:hAnsi="Candara" w:cs="Candara"/>
-              </w:rPr>
-              <w:t>–</w:t>
-            </w:r>
-            <w:r>
-              <w:rPr>
-                <w:rFonts w:ascii="Arial" w:hAnsi="Arial" w:cs="Arial"/>
-              </w:rPr>
-              <w:t> </w:t>
-            </w:r>
-            <w:r>
-              <w:rPr>
-                <w:rFonts w:ascii="Candara" w:hAnsi="Candara"/>
-              </w:rPr>
-              <w:t>15,0</w:t>
-            </w:r>
           </w:p>
         </w:tc>
         <w:tc>
           <w:tcPr>
             <w:tcW w:w="0" w:type="auto"/>
             <w:vAlign w:val="center"/>
-            <w:hideMark/>
           </w:tcPr>
           <w:p>
             <w:pPr>
@@ -2020,19 +1864,12 @@
                 <w:rFonts w:ascii="Candara" w:hAnsi="Candara"/>
               </w:rPr>
             </w:pPr>
-            <w:r>
-              <w:rPr>
-                <w:rFonts w:ascii="Candara" w:hAnsi="Candara"/>
-              </w:rPr>
-              <w:t>2,8</w:t>
-            </w:r>
           </w:p>
         </w:tc>
         <w:tc>
           <w:tcPr>
             <w:tcW w:w="0" w:type="auto"/>
             <w:vAlign w:val="center"/>
-            <w:hideMark/>
           </w:tcPr>
           <w:p>
             <w:pPr>
@@ -2040,19 +1877,12 @@
                 <w:rFonts w:ascii="Candara" w:hAnsi="Candara"/>
               </w:rPr>
             </w:pPr>
-            <w:r>
-              <w:rPr>
-                <w:rFonts w:ascii="Candara" w:hAnsi="Candara"/>
-              </w:rPr>
-              <w:t>2,6</w:t>
-            </w:r>
           </w:p>
         </w:tc>
         <w:tc>
           <w:tcPr>
             <w:tcW w:w="0" w:type="auto"/>
             <w:vAlign w:val="center"/>
-            <w:hideMark/>
           </w:tcPr>
           <w:p>
             <w:pPr>
@@ -2060,43 +1890,12 @@
                 <w:rFonts w:ascii="Candara" w:hAnsi="Candara"/>
               </w:rPr>
             </w:pPr>
-            <w:r>
-              <w:rPr>
-                <w:rFonts w:ascii="Candara" w:hAnsi="Candara"/>
-              </w:rPr>
-              <w:t>75</w:t>
-            </w:r>
-            <w:r>
-              <w:rPr>
-                <w:rFonts w:ascii="Arial" w:hAnsi="Arial" w:cs="Arial"/>
-              </w:rPr>
-              <w:t> </w:t>
-            </w:r>
-            <w:r>
-              <w:rPr>
-                <w:rFonts w:ascii="Candara" w:hAnsi="Candara" w:cs="Candara"/>
-              </w:rPr>
-              <w:t>–</w:t>
-            </w:r>
-            <w:r>
-              <w:rPr>
-                <w:rFonts w:ascii="Arial" w:hAnsi="Arial" w:cs="Arial"/>
-              </w:rPr>
-              <w:t> </w:t>
-            </w:r>
-            <w:r>
-              <w:rPr>
-                <w:rFonts w:ascii="Candara" w:hAnsi="Candara"/>
-              </w:rPr>
-              <w:t>85</w:t>
-            </w:r>
           </w:p>
         </w:tc>
         <w:tc>
           <w:tcPr>
             <w:tcW w:w="0" w:type="auto"/>
             <w:vAlign w:val="center"/>
-            <w:hideMark/>
           </w:tcPr>
           <w:p>
             <w:pPr>
@@ -2104,43 +1903,12 @@
                 <w:rFonts w:ascii="Candara" w:hAnsi="Candara"/>
               </w:rPr>
             </w:pPr>
-            <w:r>
-              <w:rPr>
-                <w:rFonts w:ascii="Candara" w:hAnsi="Candara"/>
-              </w:rPr>
-              <w:t>27</w:t>
-            </w:r>
-            <w:r>
-              <w:rPr>
-                <w:rFonts w:ascii="Arial" w:hAnsi="Arial" w:cs="Arial"/>
-              </w:rPr>
-              <w:t> </w:t>
-            </w:r>
-            <w:r>
-              <w:rPr>
-                <w:rFonts w:ascii="Candara" w:hAnsi="Candara" w:cs="Candara"/>
-              </w:rPr>
-              <w:t>–</w:t>
-            </w:r>
-            <w:r>
-              <w:rPr>
-                <w:rFonts w:ascii="Arial" w:hAnsi="Arial" w:cs="Arial"/>
-              </w:rPr>
-              <w:t> </w:t>
-            </w:r>
-            <w:r>
-              <w:rPr>
-                <w:rFonts w:ascii="Candara" w:hAnsi="Candara"/>
-              </w:rPr>
-              <w:t>33</w:t>
-            </w:r>
           </w:p>
         </w:tc>
         <w:tc>
           <w:tcPr>
             <w:tcW w:w="0" w:type="auto"/>
             <w:vAlign w:val="center"/>
-            <w:hideMark/>
           </w:tcPr>
           <w:p>
             <w:pPr>
@@ -2148,12 +1916,6 @@
                 <w:rFonts w:ascii="Candara" w:hAnsi="Candara"/>
               </w:rPr>
             </w:pPr>
-            <w:r>
-              <w:rPr>
-                <w:rFonts w:ascii="Candara" w:hAnsi="Candara"/>
-              </w:rPr>
-              <w:t>Transporte interestadual e exportação</w:t>
-            </w:r>
           </w:p>
         </w:tc>
       </w:tr>
@@ -2165,7 +1927,6 @@
           <w:tcPr>
             <w:tcW w:w="0" w:type="auto"/>
             <w:vAlign w:val="center"/>
-            <w:hideMark/>
           </w:tcPr>
           <w:p>
             <w:pPr>
@@ -2175,21 +1936,12 @@
                 <w:bCs/>
               </w:rPr>
             </w:pPr>
-            <w:r>
-              <w:rPr>
-                <w:rFonts w:ascii="Candara" w:hAnsi="Candara"/>
-                <w:b/>
-                <w:bCs/>
-              </w:rPr>
-              <w:t>Carreta Baú Trucada (4 eixos)</w:t>
-            </w:r>
           </w:p>
         </w:tc>
         <w:tc>
           <w:tcPr>
             <w:tcW w:w="0" w:type="auto"/>
             <w:vAlign w:val="center"/>
-            <w:hideMark/>
           </w:tcPr>
           <w:p>
             <w:pPr>
@@ -2197,43 +1949,12 @@
                 <w:rFonts w:ascii="Candara" w:hAnsi="Candara"/>
               </w:rPr>
             </w:pPr>
-            <w:r>
-              <w:rPr>
-                <w:rFonts w:ascii="Candara" w:hAnsi="Candara"/>
-              </w:rPr>
-              <w:t>16,0</w:t>
-            </w:r>
-            <w:r>
-              <w:rPr>
-                <w:rFonts w:ascii="Arial" w:hAnsi="Arial" w:cs="Arial"/>
-              </w:rPr>
-              <w:t> </w:t>
-            </w:r>
-            <w:r>
-              <w:rPr>
-                <w:rFonts w:ascii="Candara" w:hAnsi="Candara" w:cs="Candara"/>
-              </w:rPr>
-              <w:t>–</w:t>
-            </w:r>
-            <w:r>
-              <w:rPr>
-                <w:rFonts w:ascii="Arial" w:hAnsi="Arial" w:cs="Arial"/>
-              </w:rPr>
-              <w:t> </w:t>
-            </w:r>
-            <w:r>
-              <w:rPr>
-                <w:rFonts w:ascii="Candara" w:hAnsi="Candara"/>
-              </w:rPr>
-              <w:t>19,3</w:t>
-            </w:r>
           </w:p>
         </w:tc>
         <w:tc>
           <w:tcPr>
             <w:tcW w:w="0" w:type="auto"/>
             <w:vAlign w:val="center"/>
-            <w:hideMark/>
           </w:tcPr>
           <w:p>
             <w:pPr>
@@ -2241,19 +1962,12 @@
                 <w:rFonts w:ascii="Candara" w:hAnsi="Candara"/>
               </w:rPr>
             </w:pPr>
-            <w:r>
-              <w:rPr>
-                <w:rFonts w:ascii="Candara" w:hAnsi="Candara"/>
-              </w:rPr>
-              <w:t>2,8</w:t>
-            </w:r>
           </w:p>
         </w:tc>
         <w:tc>
           <w:tcPr>
             <w:tcW w:w="0" w:type="auto"/>
             <w:vAlign w:val="center"/>
-            <w:hideMark/>
           </w:tcPr>
           <w:p>
             <w:pPr>
@@ -2261,19 +1975,12 @@
                 <w:rFonts w:ascii="Candara" w:hAnsi="Candara"/>
               </w:rPr>
             </w:pPr>
-            <w:r>
-              <w:rPr>
-                <w:rFonts w:ascii="Candara" w:hAnsi="Candara"/>
-              </w:rPr>
-              <w:t>2,6</w:t>
-            </w:r>
           </w:p>
         </w:tc>
         <w:tc>
           <w:tcPr>
             <w:tcW w:w="0" w:type="auto"/>
             <w:vAlign w:val="center"/>
-            <w:hideMark/>
           </w:tcPr>
           <w:p>
             <w:pPr>
@@ -2281,43 +1988,12 @@
                 <w:rFonts w:ascii="Candara" w:hAnsi="Candara"/>
               </w:rPr>
             </w:pPr>
-            <w:r>
-              <w:rPr>
-                <w:rFonts w:ascii="Candara" w:hAnsi="Candara"/>
-              </w:rPr>
-              <w:t>90</w:t>
-            </w:r>
-            <w:r>
-              <w:rPr>
-                <w:rFonts w:ascii="Arial" w:hAnsi="Arial" w:cs="Arial"/>
-              </w:rPr>
-              <w:t> </w:t>
-            </w:r>
-            <w:r>
-              <w:rPr>
-                <w:rFonts w:ascii="Candara" w:hAnsi="Candara" w:cs="Candara"/>
-              </w:rPr>
-              <w:t>–</w:t>
-            </w:r>
-            <w:r>
-              <w:rPr>
-                <w:rFonts w:ascii="Arial" w:hAnsi="Arial" w:cs="Arial"/>
-              </w:rPr>
-              <w:t> </w:t>
-            </w:r>
-            <w:r>
-              <w:rPr>
-                <w:rFonts w:ascii="Candara" w:hAnsi="Candara"/>
-              </w:rPr>
-              <w:t>100</w:t>
-            </w:r>
           </w:p>
         </w:tc>
         <w:tc>
           <w:tcPr>
             <w:tcW w:w="0" w:type="auto"/>
             <w:vAlign w:val="center"/>
-            <w:hideMark/>
           </w:tcPr>
           <w:p>
             <w:pPr>
@@ -2325,43 +2001,12 @@
                 <w:rFonts w:ascii="Candara" w:hAnsi="Candara"/>
               </w:rPr>
             </w:pPr>
-            <w:r>
-              <w:rPr>
-                <w:rFonts w:ascii="Candara" w:hAnsi="Candara"/>
-              </w:rPr>
-              <w:t>40</w:t>
-            </w:r>
-            <w:r>
-              <w:rPr>
-                <w:rFonts w:ascii="Arial" w:hAnsi="Arial" w:cs="Arial"/>
-              </w:rPr>
-              <w:t> </w:t>
-            </w:r>
-            <w:r>
-              <w:rPr>
-                <w:rFonts w:ascii="Candara" w:hAnsi="Candara" w:cs="Candara"/>
-              </w:rPr>
-              <w:t>–</w:t>
-            </w:r>
-            <w:r>
-              <w:rPr>
-                <w:rFonts w:ascii="Arial" w:hAnsi="Arial" w:cs="Arial"/>
-              </w:rPr>
-              <w:t> </w:t>
-            </w:r>
-            <w:r>
-              <w:rPr>
-                <w:rFonts w:ascii="Candara" w:hAnsi="Candara"/>
-              </w:rPr>
-              <w:t>50</w:t>
-            </w:r>
           </w:p>
         </w:tc>
         <w:tc>
           <w:tcPr>
             <w:tcW w:w="0" w:type="auto"/>
             <w:vAlign w:val="center"/>
-            <w:hideMark/>
           </w:tcPr>
           <w:p>
             <w:pPr>
@@ -2369,12 +2014,6 @@
                 <w:rFonts w:ascii="Candara" w:hAnsi="Candara"/>
               </w:rPr>
             </w:pPr>
-            <w:r>
-              <w:rPr>
-                <w:rFonts w:ascii="Candara" w:hAnsi="Candara"/>
-              </w:rPr>
-              <w:t>Carga pesada e longa distância</w:t>
-            </w:r>
           </w:p>
         </w:tc>
       </w:tr>
@@ -2386,7 +2025,6 @@
           <w:tcPr>
             <w:tcW w:w="0" w:type="auto"/>
             <w:vAlign w:val="center"/>
-            <w:hideMark/>
           </w:tcPr>
           <w:p>
             <w:pPr>
@@ -2396,21 +2034,12 @@
                 <w:bCs/>
               </w:rPr>
             </w:pPr>
-            <w:r>
-              <w:rPr>
-                <w:rFonts w:ascii="Candara" w:hAnsi="Candara"/>
-                <w:b/>
-                <w:bCs/>
-              </w:rPr>
-              <w:t>Romeu e Julieta (Caminhão + Reboque)</w:t>
-            </w:r>
           </w:p>
         </w:tc>
         <w:tc>
           <w:tcPr>
             <w:tcW w:w="0" w:type="auto"/>
             <w:vAlign w:val="center"/>
-            <w:hideMark/>
           </w:tcPr>
           <w:p>
             <w:pPr>
@@ -2418,43 +2047,12 @@
                 <w:rFonts w:ascii="Candara" w:hAnsi="Candara"/>
               </w:rPr>
             </w:pPr>
-            <w:r>
-              <w:rPr>
-                <w:rFonts w:ascii="Candara" w:hAnsi="Candara"/>
-              </w:rPr>
-              <w:t>17,5</w:t>
-            </w:r>
-            <w:r>
-              <w:rPr>
-                <w:rFonts w:ascii="Arial" w:hAnsi="Arial" w:cs="Arial"/>
-              </w:rPr>
-              <w:t> </w:t>
-            </w:r>
-            <w:r>
-              <w:rPr>
-                <w:rFonts w:ascii="Candara" w:hAnsi="Candara" w:cs="Candara"/>
-              </w:rPr>
-              <w:t>–</w:t>
-            </w:r>
-            <w:r>
-              <w:rPr>
-                <w:rFonts w:ascii="Arial" w:hAnsi="Arial" w:cs="Arial"/>
-              </w:rPr>
-              <w:t> </w:t>
-            </w:r>
-            <w:r>
-              <w:rPr>
-                <w:rFonts w:ascii="Candara" w:hAnsi="Candara"/>
-              </w:rPr>
-              <w:t>19,8</w:t>
-            </w:r>
           </w:p>
         </w:tc>
         <w:tc>
           <w:tcPr>
             <w:tcW w:w="0" w:type="auto"/>
             <w:vAlign w:val="center"/>
-            <w:hideMark/>
           </w:tcPr>
           <w:p>
             <w:pPr>
@@ -2462,19 +2060,12 @@
                 <w:rFonts w:ascii="Candara" w:hAnsi="Candara"/>
               </w:rPr>
             </w:pPr>
-            <w:r>
-              <w:rPr>
-                <w:rFonts w:ascii="Candara" w:hAnsi="Candara"/>
-              </w:rPr>
-              <w:t>2,8</w:t>
-            </w:r>
           </w:p>
         </w:tc>
         <w:tc>
           <w:tcPr>
             <w:tcW w:w="0" w:type="auto"/>
             <w:vAlign w:val="center"/>
-            <w:hideMark/>
           </w:tcPr>
           <w:p>
             <w:pPr>
@@ -2482,19 +2073,12 @@
                 <w:rFonts w:ascii="Candara" w:hAnsi="Candara"/>
               </w:rPr>
             </w:pPr>
-            <w:r>
-              <w:rPr>
-                <w:rFonts w:ascii="Candara" w:hAnsi="Candara"/>
-              </w:rPr>
-              <w:t>2,6</w:t>
-            </w:r>
           </w:p>
         </w:tc>
         <w:tc>
           <w:tcPr>
             <w:tcW w:w="0" w:type="auto"/>
             <w:vAlign w:val="center"/>
-            <w:hideMark/>
           </w:tcPr>
           <w:p>
             <w:pPr>
@@ -2502,43 +2086,12 @@
                 <w:rFonts w:ascii="Candara" w:hAnsi="Candara"/>
               </w:rPr>
             </w:pPr>
-            <w:r>
-              <w:rPr>
-                <w:rFonts w:ascii="Candara" w:hAnsi="Candara"/>
-              </w:rPr>
-              <w:t>95</w:t>
-            </w:r>
-            <w:r>
-              <w:rPr>
-                <w:rFonts w:ascii="Arial" w:hAnsi="Arial" w:cs="Arial"/>
-              </w:rPr>
-              <w:t> </w:t>
-            </w:r>
-            <w:r>
-              <w:rPr>
-                <w:rFonts w:ascii="Candara" w:hAnsi="Candara" w:cs="Candara"/>
-              </w:rPr>
-              <w:t>–</w:t>
-            </w:r>
-            <w:r>
-              <w:rPr>
-                <w:rFonts w:ascii="Arial" w:hAnsi="Arial" w:cs="Arial"/>
-              </w:rPr>
-              <w:t> </w:t>
-            </w:r>
-            <w:r>
-              <w:rPr>
-                <w:rFonts w:ascii="Candara" w:hAnsi="Candara"/>
-              </w:rPr>
-              <w:t>110</w:t>
-            </w:r>
           </w:p>
         </w:tc>
         <w:tc>
           <w:tcPr>
             <w:tcW w:w="0" w:type="auto"/>
             <w:vAlign w:val="center"/>
-            <w:hideMark/>
           </w:tcPr>
           <w:p>
             <w:pPr>
@@ -2546,43 +2099,12 @@
                 <w:rFonts w:ascii="Candara" w:hAnsi="Candara"/>
               </w:rPr>
             </w:pPr>
-            <w:r>
-              <w:rPr>
-                <w:rFonts w:ascii="Candara" w:hAnsi="Candara"/>
-              </w:rPr>
-              <w:t>50</w:t>
-            </w:r>
-            <w:r>
-              <w:rPr>
-                <w:rFonts w:ascii="Arial" w:hAnsi="Arial" w:cs="Arial"/>
-              </w:rPr>
-              <w:t> </w:t>
-            </w:r>
-            <w:r>
-              <w:rPr>
-                <w:rFonts w:ascii="Candara" w:hAnsi="Candara" w:cs="Candara"/>
-              </w:rPr>
-              <w:t>–</w:t>
-            </w:r>
-            <w:r>
-              <w:rPr>
-                <w:rFonts w:ascii="Arial" w:hAnsi="Arial" w:cs="Arial"/>
-              </w:rPr>
-              <w:t> </w:t>
-            </w:r>
-            <w:r>
-              <w:rPr>
-                <w:rFonts w:ascii="Candara" w:hAnsi="Candara"/>
-              </w:rPr>
-              <w:t>52</w:t>
-            </w:r>
           </w:p>
         </w:tc>
         <w:tc>
           <w:tcPr>
             <w:tcW w:w="0" w:type="auto"/>
             <w:vAlign w:val="center"/>
-            <w:hideMark/>
           </w:tcPr>
           <w:p>
             <w:pPr>
@@ -2590,12 +2112,6 @@
                 <w:rFonts w:ascii="Candara" w:hAnsi="Candara"/>
               </w:rPr>
             </w:pPr>
-            <w:r>
-              <w:rPr>
-                <w:rFonts w:ascii="Candara" w:hAnsi="Candara"/>
-              </w:rPr>
-              <w:t>Grandes volumes, centros de distribuição</w:t>
-            </w:r>
           </w:p>
         </w:tc>
       </w:tr>
@@ -2607,7 +2123,6 @@
           <w:tcPr>
             <w:tcW w:w="0" w:type="auto"/>
             <w:vAlign w:val="center"/>
-            <w:hideMark/>
           </w:tcPr>
           <w:p>
             <w:pPr>
@@ -2617,37 +2132,12 @@
                 <w:bCs/>
               </w:rPr>
             </w:pPr>
-            <w:r>
-              <w:rPr>
-                <w:rFonts w:ascii="Candara" w:hAnsi="Candara"/>
-                <w:b/>
-                <w:bCs/>
-              </w:rPr>
-              <w:t>Treminhão (Caminhão + 2</w:t>
-            </w:r>
-            <w:r>
-              <w:rPr>
-                <w:rFonts w:ascii="Arial" w:hAnsi="Arial" w:cs="Arial"/>
-                <w:b/>
-                <w:bCs/>
-              </w:rPr>
-              <w:t> </w:t>
-            </w:r>
-            <w:r>
-              <w:rPr>
-                <w:rFonts w:ascii="Candara" w:hAnsi="Candara"/>
-                <w:b/>
-                <w:bCs/>
-              </w:rPr>
-              <w:t>Reboques)</w:t>
-            </w:r>
           </w:p>
         </w:tc>
         <w:tc>
           <w:tcPr>
             <w:tcW w:w="0" w:type="auto"/>
             <w:vAlign w:val="center"/>
-            <w:hideMark/>
           </w:tcPr>
           <w:p>
             <w:pPr>
@@ -2655,43 +2145,12 @@
                 <w:rFonts w:ascii="Candara" w:hAnsi="Candara"/>
               </w:rPr>
             </w:pPr>
-            <w:r>
-              <w:rPr>
-                <w:rFonts w:ascii="Candara" w:hAnsi="Candara"/>
-              </w:rPr>
-              <w:t>19,8</w:t>
-            </w:r>
-            <w:r>
-              <w:rPr>
-                <w:rFonts w:ascii="Arial" w:hAnsi="Arial" w:cs="Arial"/>
-              </w:rPr>
-              <w:t> </w:t>
-            </w:r>
-            <w:r>
-              <w:rPr>
-                <w:rFonts w:ascii="Candara" w:hAnsi="Candara" w:cs="Candara"/>
-              </w:rPr>
-              <w:t>–</w:t>
-            </w:r>
-            <w:r>
-              <w:rPr>
-                <w:rFonts w:ascii="Arial" w:hAnsi="Arial" w:cs="Arial"/>
-              </w:rPr>
-              <w:t> </w:t>
-            </w:r>
-            <w:r>
-              <w:rPr>
-                <w:rFonts w:ascii="Candara" w:hAnsi="Candara"/>
-              </w:rPr>
-              <w:t>25,0</w:t>
-            </w:r>
           </w:p>
         </w:tc>
         <w:tc>
           <w:tcPr>
             <w:tcW w:w="0" w:type="auto"/>
             <w:vAlign w:val="center"/>
-            <w:hideMark/>
           </w:tcPr>
           <w:p>
             <w:pPr>
@@ -2699,19 +2158,12 @@
                 <w:rFonts w:ascii="Candara" w:hAnsi="Candara"/>
               </w:rPr>
             </w:pPr>
-            <w:r>
-              <w:rPr>
-                <w:rFonts w:ascii="Candara" w:hAnsi="Candara"/>
-              </w:rPr>
-              <w:t>2,8</w:t>
-            </w:r>
           </w:p>
         </w:tc>
         <w:tc>
           <w:tcPr>
             <w:tcW w:w="0" w:type="auto"/>
             <w:vAlign w:val="center"/>
-            <w:hideMark/>
           </w:tcPr>
           <w:p>
             <w:pPr>
@@ -2719,19 +2171,12 @@
                 <w:rFonts w:ascii="Candara" w:hAnsi="Candara"/>
               </w:rPr>
             </w:pPr>
-            <w:r>
-              <w:rPr>
-                <w:rFonts w:ascii="Candara" w:hAnsi="Candara"/>
-              </w:rPr>
-              <w:t>2,6</w:t>
-            </w:r>
           </w:p>
         </w:tc>
         <w:tc>
           <w:tcPr>
             <w:tcW w:w="0" w:type="auto"/>
             <w:vAlign w:val="center"/>
-            <w:hideMark/>
           </w:tcPr>
           <w:p>
             <w:pPr>
@@ -2739,43 +2184,12 @@
                 <w:rFonts w:ascii="Candara" w:hAnsi="Candara"/>
               </w:rPr>
             </w:pPr>
-            <w:r>
-              <w:rPr>
-                <w:rFonts w:ascii="Candara" w:hAnsi="Candara"/>
-              </w:rPr>
-              <w:t>120</w:t>
-            </w:r>
-            <w:r>
-              <w:rPr>
-                <w:rFonts w:ascii="Arial" w:hAnsi="Arial" w:cs="Arial"/>
-              </w:rPr>
-              <w:t> </w:t>
-            </w:r>
-            <w:r>
-              <w:rPr>
-                <w:rFonts w:ascii="Candara" w:hAnsi="Candara" w:cs="Candara"/>
-              </w:rPr>
-              <w:t>–</w:t>
-            </w:r>
-            <w:r>
-              <w:rPr>
-                <w:rFonts w:ascii="Arial" w:hAnsi="Arial" w:cs="Arial"/>
-              </w:rPr>
-              <w:t> </w:t>
-            </w:r>
-            <w:r>
-              <w:rPr>
-                <w:rFonts w:ascii="Candara" w:hAnsi="Candara"/>
-              </w:rPr>
-              <w:t>150</w:t>
-            </w:r>
           </w:p>
         </w:tc>
         <w:tc>
           <w:tcPr>
             <w:tcW w:w="0" w:type="auto"/>
             <w:vAlign w:val="center"/>
-            <w:hideMark/>
           </w:tcPr>
           <w:p>
             <w:pPr>
@@ -2783,68 +2197,613 @@
                 <w:rFonts w:ascii="Candara" w:hAnsi="Candara"/>
               </w:rPr>
             </w:pPr>
-            <w:r>
-              <w:rPr>
-                <w:rFonts w:ascii="Candara" w:hAnsi="Candara"/>
-              </w:rPr>
-              <w:t>63</w:t>
-            </w:r>
-            <w:r>
-              <w:rPr>
-                <w:rFonts w:ascii="Arial" w:hAnsi="Arial" w:cs="Arial"/>
-              </w:rPr>
-              <w:t> </w:t>
-            </w:r>
-            <w:r>
-              <w:rPr>
-                <w:rFonts w:ascii="Candara" w:hAnsi="Candara" w:cs="Candara"/>
-              </w:rPr>
-              <w:t>–</w:t>
-            </w:r>
-            <w:r>
-              <w:rPr>
-                <w:rFonts w:ascii="Arial" w:hAnsi="Arial" w:cs="Arial"/>
-              </w:rPr>
-              <w:t> </w:t>
-            </w:r>
-            <w:r>
-              <w:rPr>
-                <w:rFonts w:ascii="Candara" w:hAnsi="Candara"/>
-              </w:rPr>
-              <w:t>66</w:t>
-            </w:r>
           </w:p>
         </w:tc>
         <w:tc>
           <w:tcPr>
             <w:tcW w:w="0" w:type="auto"/>
             <w:vAlign w:val="center"/>
+          </w:tcPr>
+          <w:p>
+            <w:pPr>
+              <w:rPr>
+                <w:rFonts w:ascii="Candara" w:hAnsi="Candara"/>
+              </w:rPr>
+            </w:pPr>
+          </w:p>
+        </w:tc>
+      </w:tr>
+    </w:tbl>
+    <w:p>
+      <w:pPr>
+        <w:rPr>
+          <w:rFonts w:ascii="Candara" w:hAnsi="Candara"/>
+        </w:rPr>
+      </w:pPr>
+    </w:p>
+    <w:p>
+      <w:pPr>
+        <w:rPr>
+          <w:rFonts w:ascii="Candara" w:hAnsi="Candara"/>
+        </w:rPr>
+      </w:pPr>
+    </w:p>
+    <w:p>
+      <w:pPr>
+        <w:rPr>
+          <w:rFonts w:ascii="Candara" w:hAnsi="Candara"/>
+        </w:rPr>
+      </w:pPr>
+    </w:p>
+    <w:p>
+      <w:pPr>
+        <w:rPr>
+          <w:rFonts w:ascii="Candara" w:hAnsi="Candara"/>
+        </w:rPr>
+      </w:pPr>
+    </w:p>
+    <w:p>
+      <w:pPr>
+        <w:rPr>
+          <w:rFonts w:ascii="Candara" w:hAnsi="Candara"/>
+        </w:rPr>
+      </w:pPr>
+    </w:p>
+    <w:tbl>
+      <w:tblPr>
+        <w:tblW w:w="0" w:type="auto"/>
+        <w:tblCellSpacing w:w="15" w:type="dxa"/>
+        <w:tblCellMar>
+          <w:top w:w="15" w:type="dxa"/>
+          <w:left w:w="15" w:type="dxa"/>
+          <w:bottom w:w="15" w:type="dxa"/>
+          <w:right w:w="15" w:type="dxa"/>
+        </w:tblCellMar>
+        <w:tblLook w:val="04A0" w:firstRow="1" w:lastRow="0" w:firstColumn="1" w:lastColumn="0" w:noHBand="0" w:noVBand="1"/>
+      </w:tblPr>
+      <w:tblGrid>
+        <w:gridCol w:w="1072"/>
+        <w:gridCol w:w="3973"/>
+        <w:gridCol w:w="5421"/>
+      </w:tblGrid>
+      <w:tr>
+        <w:trPr>
+          <w:tblCellSpacing w:w="15" w:type="dxa"/>
+        </w:trPr>
+        <w:tc>
+          <w:tcPr>
+            <w:tcW w:w="0" w:type="auto"/>
+            <w:tcBorders>
+              <w:bottom w:val="single" w:sz="6" w:space="0" w:color="363840"/>
+            </w:tcBorders>
+            <w:vAlign w:val="center"/>
             <w:hideMark/>
           </w:tcPr>
           <w:p>
             <w:pPr>
               <w:rPr>
                 <w:rFonts w:ascii="Candara" w:hAnsi="Candara"/>
+                <w:b/>
+                <w:bCs/>
               </w:rPr>
             </w:pPr>
             <w:r>
               <w:rPr>
                 <w:rFonts w:ascii="Candara" w:hAnsi="Candara"/>
-              </w:rPr>
-              <w:t>Transporte de alto volume e longa distância</w:t>
+                <w:b/>
+                <w:bCs/>
+              </w:rPr>
+              <w:lastRenderedPageBreak/>
+              <w:t>Categoria</w:t>
+            </w:r>
+          </w:p>
+        </w:tc>
+        <w:tc>
+          <w:tcPr>
+            <w:tcW w:w="0" w:type="auto"/>
+            <w:tcBorders>
+              <w:bottom w:val="single" w:sz="6" w:space="0" w:color="363840"/>
+            </w:tcBorders>
+            <w:vAlign w:val="center"/>
+            <w:hideMark/>
+          </w:tcPr>
+          <w:p>
+            <w:pPr>
+              <w:rPr>
+                <w:rFonts w:ascii="Candara" w:hAnsi="Candara"/>
+                <w:b/>
+                <w:bCs/>
+              </w:rPr>
+            </w:pPr>
+            <w:r>
+              <w:rPr>
+                <w:rFonts w:ascii="Candara" w:hAnsi="Candara"/>
+                <w:b/>
+                <w:bCs/>
+              </w:rPr>
+              <w:t>Tipo de Veículo</w:t>
+            </w:r>
+          </w:p>
+        </w:tc>
+        <w:tc>
+          <w:tcPr>
+            <w:tcW w:w="0" w:type="auto"/>
+            <w:tcBorders>
+              <w:bottom w:val="single" w:sz="6" w:space="0" w:color="363840"/>
+            </w:tcBorders>
+            <w:vAlign w:val="center"/>
+            <w:hideMark/>
+          </w:tcPr>
+          <w:p>
+            <w:pPr>
+              <w:rPr>
+                <w:rFonts w:ascii="Candara" w:hAnsi="Candara"/>
+                <w:b/>
+                <w:bCs/>
+              </w:rPr>
+            </w:pPr>
+            <w:r>
+              <w:rPr>
+                <w:rFonts w:ascii="Candara" w:hAnsi="Candara"/>
+                <w:b/>
+                <w:bCs/>
+              </w:rPr>
+              <w:t>Limite de Peso (PBT)</w:t>
             </w:r>
           </w:p>
         </w:tc>
       </w:tr>
-      <w:bookmarkEnd w:id="0"/>
+      <w:tr>
+        <w:trPr>
+          <w:tblCellSpacing w:w="15" w:type="dxa"/>
+        </w:trPr>
+        <w:tc>
+          <w:tcPr>
+            <w:tcW w:w="0" w:type="auto"/>
+            <w:tcBorders>
+              <w:bottom w:val="single" w:sz="6" w:space="0" w:color="363840"/>
+            </w:tcBorders>
+            <w:vAlign w:val="center"/>
+            <w:hideMark/>
+          </w:tcPr>
+          <w:p>
+            <w:pPr>
+              <w:rPr>
+                <w:rFonts w:ascii="Candara" w:hAnsi="Candara"/>
+              </w:rPr>
+            </w:pPr>
+            <w:r>
+              <w:rPr>
+                <w:rFonts w:ascii="Candara" w:hAnsi="Candara"/>
+                <w:b/>
+                <w:bCs/>
+              </w:rPr>
+              <w:t>A</w:t>
+            </w:r>
+          </w:p>
+        </w:tc>
+        <w:tc>
+          <w:tcPr>
+            <w:tcW w:w="0" w:type="auto"/>
+            <w:tcBorders>
+              <w:bottom w:val="single" w:sz="6" w:space="0" w:color="363840"/>
+            </w:tcBorders>
+            <w:vAlign w:val="center"/>
+            <w:hideMark/>
+          </w:tcPr>
+          <w:p>
+            <w:pPr>
+              <w:rPr>
+                <w:rFonts w:ascii="Candara" w:hAnsi="Candara"/>
+              </w:rPr>
+            </w:pPr>
+            <w:r>
+              <w:rPr>
+                <w:rFonts w:ascii="Candara" w:hAnsi="Candara"/>
+              </w:rPr>
+              <w:t>Motos, motonetas e triciclos (2 ou 3 rodas).</w:t>
+            </w:r>
+          </w:p>
+        </w:tc>
+        <w:tc>
+          <w:tcPr>
+            <w:tcW w:w="0" w:type="auto"/>
+            <w:tcBorders>
+              <w:bottom w:val="single" w:sz="6" w:space="0" w:color="363840"/>
+            </w:tcBorders>
+            <w:vAlign w:val="center"/>
+            <w:hideMark/>
+          </w:tcPr>
+          <w:p>
+            <w:pPr>
+              <w:rPr>
+                <w:rFonts w:ascii="Candara" w:hAnsi="Candara"/>
+              </w:rPr>
+            </w:pPr>
+            <w:r>
+              <w:rPr>
+                <w:rFonts w:ascii="Candara" w:hAnsi="Candara"/>
+              </w:rPr>
+              <w:t>Não há limite de peso específico.</w:t>
+            </w:r>
+          </w:p>
+        </w:tc>
+      </w:tr>
+      <w:tr>
+        <w:trPr>
+          <w:tblCellSpacing w:w="15" w:type="dxa"/>
+        </w:trPr>
+        <w:tc>
+          <w:tcPr>
+            <w:tcW w:w="0" w:type="auto"/>
+            <w:tcBorders>
+              <w:bottom w:val="single" w:sz="6" w:space="0" w:color="363840"/>
+            </w:tcBorders>
+            <w:vAlign w:val="center"/>
+            <w:hideMark/>
+          </w:tcPr>
+          <w:p>
+            <w:pPr>
+              <w:rPr>
+                <w:rFonts w:ascii="Candara" w:hAnsi="Candara"/>
+              </w:rPr>
+            </w:pPr>
+            <w:r>
+              <w:rPr>
+                <w:rFonts w:ascii="Candara" w:hAnsi="Candara"/>
+                <w:b/>
+                <w:bCs/>
+              </w:rPr>
+              <w:t>B</w:t>
+            </w:r>
+          </w:p>
+        </w:tc>
+        <w:tc>
+          <w:tcPr>
+            <w:tcW w:w="0" w:type="auto"/>
+            <w:tcBorders>
+              <w:bottom w:val="single" w:sz="6" w:space="0" w:color="363840"/>
+            </w:tcBorders>
+            <w:vAlign w:val="center"/>
+            <w:hideMark/>
+          </w:tcPr>
+          <w:p>
+            <w:pPr>
+              <w:rPr>
+                <w:rFonts w:ascii="Candara" w:hAnsi="Candara"/>
+              </w:rPr>
+            </w:pPr>
+            <w:r>
+              <w:rPr>
+                <w:rFonts w:ascii="Candara" w:hAnsi="Candara"/>
+              </w:rPr>
+              <w:t>Carros de passeio, SUVs, picapes e vans comuns.</w:t>
+            </w:r>
+          </w:p>
+        </w:tc>
+        <w:tc>
+          <w:tcPr>
+            <w:tcW w:w="0" w:type="auto"/>
+            <w:tcBorders>
+              <w:bottom w:val="single" w:sz="6" w:space="0" w:color="363840"/>
+            </w:tcBorders>
+            <w:vAlign w:val="center"/>
+            <w:hideMark/>
+          </w:tcPr>
+          <w:p>
+            <w:pPr>
+              <w:rPr>
+                <w:rFonts w:ascii="Candara" w:hAnsi="Candara"/>
+              </w:rPr>
+            </w:pPr>
+            <w:r>
+              <w:rPr>
+                <w:rFonts w:ascii="Candara" w:hAnsi="Candara"/>
+                <w:b/>
+                <w:bCs/>
+              </w:rPr>
+              <w:t>Até 3.500 kg</w:t>
+            </w:r>
+            <w:r>
+              <w:rPr>
+                <w:rFonts w:ascii="Candara" w:hAnsi="Candara"/>
+              </w:rPr>
+              <w:t xml:space="preserve">. </w:t>
+            </w:r>
+            <w:r>
+              <w:rPr>
+                <w:rFonts w:ascii="Candara" w:hAnsi="Candara"/>
+              </w:rPr>
+              <w:br/>
+            </w:r>
+            <w:r>
+              <w:rPr>
+                <w:rFonts w:ascii="Candara" w:hAnsi="Candara"/>
+                <w:i/>
+                <w:iCs/>
+              </w:rPr>
+              <w:t xml:space="preserve">(Exceção recente: </w:t>
+            </w:r>
+            <w:r>
+              <w:rPr>
+                <w:rFonts w:ascii="Candara" w:hAnsi="Candara"/>
+                <w:b/>
+                <w:bCs/>
+                <w:i/>
+                <w:iCs/>
+              </w:rPr>
+              <w:t>até 4.250 kg</w:t>
+            </w:r>
+            <w:r>
+              <w:rPr>
+                <w:rFonts w:ascii="Candara" w:hAnsi="Candara"/>
+                <w:i/>
+                <w:iCs/>
+              </w:rPr>
+              <w:t xml:space="preserve"> exclusivamente para veículos elétricos ou híbridos).</w:t>
+            </w:r>
+          </w:p>
+        </w:tc>
+      </w:tr>
+      <w:tr>
+        <w:trPr>
+          <w:tblCellSpacing w:w="15" w:type="dxa"/>
+        </w:trPr>
+        <w:tc>
+          <w:tcPr>
+            <w:tcW w:w="0" w:type="auto"/>
+            <w:tcBorders>
+              <w:bottom w:val="single" w:sz="6" w:space="0" w:color="363840"/>
+            </w:tcBorders>
+            <w:vAlign w:val="center"/>
+            <w:hideMark/>
+          </w:tcPr>
+          <w:p>
+            <w:pPr>
+              <w:rPr>
+                <w:rFonts w:ascii="Candara" w:hAnsi="Candara"/>
+              </w:rPr>
+            </w:pPr>
+            <w:r>
+              <w:rPr>
+                <w:rFonts w:ascii="Candara" w:hAnsi="Candara"/>
+                <w:b/>
+                <w:bCs/>
+              </w:rPr>
+              <w:t>C</w:t>
+            </w:r>
+          </w:p>
+        </w:tc>
+        <w:tc>
+          <w:tcPr>
+            <w:tcW w:w="0" w:type="auto"/>
+            <w:tcBorders>
+              <w:bottom w:val="single" w:sz="6" w:space="0" w:color="363840"/>
+            </w:tcBorders>
+            <w:vAlign w:val="center"/>
+            <w:hideMark/>
+          </w:tcPr>
+          <w:p>
+            <w:pPr>
+              <w:rPr>
+                <w:rFonts w:ascii="Candara" w:hAnsi="Candara"/>
+              </w:rPr>
+            </w:pPr>
+            <w:r>
+              <w:rPr>
+                <w:rFonts w:ascii="Candara" w:hAnsi="Candara"/>
+              </w:rPr>
+              <w:t>Caminhões rígidos, caminhonetes grandes (ex: RAM 2500) e vans de carga.</w:t>
+            </w:r>
+          </w:p>
+        </w:tc>
+        <w:tc>
+          <w:tcPr>
+            <w:tcW w:w="0" w:type="auto"/>
+            <w:tcBorders>
+              <w:bottom w:val="single" w:sz="6" w:space="0" w:color="363840"/>
+            </w:tcBorders>
+            <w:vAlign w:val="center"/>
+            <w:hideMark/>
+          </w:tcPr>
+          <w:p>
+            <w:pPr>
+              <w:rPr>
+                <w:rFonts w:ascii="Candara" w:hAnsi="Candara"/>
+              </w:rPr>
+            </w:pPr>
+            <w:r>
+              <w:rPr>
+                <w:rFonts w:ascii="Candara" w:hAnsi="Candara"/>
+                <w:b/>
+                <w:bCs/>
+              </w:rPr>
+              <w:t>Acima de 3.500 kg</w:t>
+            </w:r>
+            <w:r>
+              <w:rPr>
+                <w:rFonts w:ascii="Candara" w:hAnsi="Candara"/>
+              </w:rPr>
+              <w:t xml:space="preserve"> (sem limite máximo para veículos simples/trucados).</w:t>
+            </w:r>
+          </w:p>
+        </w:tc>
+      </w:tr>
+      <w:tr>
+        <w:trPr>
+          <w:tblCellSpacing w:w="15" w:type="dxa"/>
+        </w:trPr>
+        <w:tc>
+          <w:tcPr>
+            <w:tcW w:w="0" w:type="auto"/>
+            <w:tcBorders>
+              <w:bottom w:val="single" w:sz="6" w:space="0" w:color="363840"/>
+            </w:tcBorders>
+            <w:vAlign w:val="center"/>
+            <w:hideMark/>
+          </w:tcPr>
+          <w:p>
+            <w:pPr>
+              <w:rPr>
+                <w:rFonts w:ascii="Candara" w:hAnsi="Candara"/>
+              </w:rPr>
+            </w:pPr>
+            <w:r>
+              <w:rPr>
+                <w:rFonts w:ascii="Candara" w:hAnsi="Candara"/>
+                <w:b/>
+                <w:bCs/>
+              </w:rPr>
+              <w:t>D</w:t>
+            </w:r>
+          </w:p>
+        </w:tc>
+        <w:tc>
+          <w:tcPr>
+            <w:tcW w:w="0" w:type="auto"/>
+            <w:tcBorders>
+              <w:bottom w:val="single" w:sz="6" w:space="0" w:color="363840"/>
+            </w:tcBorders>
+            <w:vAlign w:val="center"/>
+            <w:hideMark/>
+          </w:tcPr>
+          <w:p>
+            <w:pPr>
+              <w:rPr>
+                <w:rFonts w:ascii="Candara" w:hAnsi="Candara"/>
+              </w:rPr>
+            </w:pPr>
+            <w:r>
+              <w:rPr>
+                <w:rFonts w:ascii="Candara" w:hAnsi="Candara"/>
+              </w:rPr>
+              <w:t>Ônibus, micro-ônibus e vans de passageiros.</w:t>
+            </w:r>
+          </w:p>
+        </w:tc>
+        <w:tc>
+          <w:tcPr>
+            <w:tcW w:w="0" w:type="auto"/>
+            <w:tcBorders>
+              <w:bottom w:val="single" w:sz="6" w:space="0" w:color="363840"/>
+            </w:tcBorders>
+            <w:vAlign w:val="center"/>
+            <w:hideMark/>
+          </w:tcPr>
+          <w:p>
+            <w:pPr>
+              <w:rPr>
+                <w:rFonts w:ascii="Candara" w:hAnsi="Candara"/>
+              </w:rPr>
+            </w:pPr>
+            <w:r>
+              <w:rPr>
+                <w:rFonts w:ascii="Candara" w:hAnsi="Candara"/>
+                <w:b/>
+                <w:bCs/>
+              </w:rPr>
+              <w:t>Focado em passageiros</w:t>
+            </w:r>
+            <w:r>
+              <w:rPr>
+                <w:rFonts w:ascii="Candara" w:hAnsi="Candara"/>
+              </w:rPr>
+              <w:t xml:space="preserve"> (mais de 8 lugares). Segue as mesmas regras de peso da categoria C para carga.</w:t>
+            </w:r>
+          </w:p>
+        </w:tc>
+      </w:tr>
+      <w:tr>
+        <w:trPr>
+          <w:tblCellSpacing w:w="15" w:type="dxa"/>
+        </w:trPr>
+        <w:tc>
+          <w:tcPr>
+            <w:tcW w:w="0" w:type="auto"/>
+            <w:tcBorders>
+              <w:bottom w:val="nil"/>
+            </w:tcBorders>
+            <w:vAlign w:val="center"/>
+            <w:hideMark/>
+          </w:tcPr>
+          <w:p>
+            <w:pPr>
+              <w:rPr>
+                <w:rFonts w:ascii="Candara" w:hAnsi="Candara"/>
+              </w:rPr>
+            </w:pPr>
+            <w:r>
+              <w:rPr>
+                <w:rFonts w:ascii="Candara" w:hAnsi="Candara"/>
+                <w:b/>
+                <w:bCs/>
+              </w:rPr>
+              <w:t>E</w:t>
+            </w:r>
+          </w:p>
+        </w:tc>
+        <w:tc>
+          <w:tcPr>
+            <w:tcW w:w="0" w:type="auto"/>
+            <w:tcBorders>
+              <w:bottom w:val="nil"/>
+            </w:tcBorders>
+            <w:vAlign w:val="center"/>
+            <w:hideMark/>
+          </w:tcPr>
+          <w:p>
+            <w:pPr>
+              <w:rPr>
+                <w:rFonts w:ascii="Candara" w:hAnsi="Candara"/>
+              </w:rPr>
+            </w:pPr>
+            <w:r>
+              <w:rPr>
+                <w:rFonts w:ascii="Candara" w:hAnsi="Candara"/>
+              </w:rPr>
+              <w:t>Veículos articulados, carretas, bitrens e trailers pesados.</w:t>
+            </w:r>
+          </w:p>
+        </w:tc>
+        <w:tc>
+          <w:tcPr>
+            <w:tcW w:w="0" w:type="auto"/>
+            <w:tcBorders>
+              <w:bottom w:val="nil"/>
+            </w:tcBorders>
+            <w:vAlign w:val="center"/>
+            <w:hideMark/>
+          </w:tcPr>
+          <w:p>
+            <w:pPr>
+              <w:rPr>
+                <w:rFonts w:ascii="Candara" w:hAnsi="Candara"/>
+              </w:rPr>
+            </w:pPr>
+            <w:r>
+              <w:rPr>
+                <w:rFonts w:ascii="Candara" w:hAnsi="Candara"/>
+              </w:rPr>
+              <w:t xml:space="preserve">Exigida quando a unidade acoplada/reboque tiver </w:t>
+            </w:r>
+            <w:r>
+              <w:rPr>
+                <w:rFonts w:ascii="Candara" w:hAnsi="Candara"/>
+                <w:b/>
+                <w:bCs/>
+              </w:rPr>
+              <w:t>6.000 kg ou mais</w:t>
+            </w:r>
+            <w:r>
+              <w:rPr>
+                <w:rFonts w:ascii="Candara" w:hAnsi="Candara"/>
+              </w:rPr>
+              <w:t>.</w:t>
+            </w:r>
+          </w:p>
+        </w:tc>
+      </w:tr>
     </w:tbl>
-    <w:p>
-      <w:pPr>
-        <w:rPr>
-          <w:rFonts w:ascii="Candara" w:hAnsi="Candara"/>
-        </w:rPr>
-      </w:pPr>
-    </w:p>
     <w:p>
       <w:pPr>
         <w:rPr>
@@ -2882,16 +2841,8 @@
         <w:rPr>
           <w:rFonts w:ascii="Candara" w:hAnsi="Candara"/>
         </w:rPr>
-        <w:t xml:space="preserve">Criar tela inicial com 3 </w:t>
-      </w:r>
-      <w:proofErr w:type="spellStart"/>
-      <w:r>
-        <w:rPr>
-          <w:rFonts w:ascii="Candara" w:hAnsi="Candara"/>
-        </w:rPr>
-        <w:t>botoes</w:t>
-      </w:r>
-      <w:proofErr w:type="spellEnd"/>
+        <w:t>Criar tela inicial com 3 botoes</w:t>
+      </w:r>
     </w:p>
     <w:p>
       <w:pPr>
@@ -2904,19 +2855,22 @@
           <w:rFonts w:ascii="Candara" w:hAnsi="Candara"/>
         </w:rPr>
       </w:pPr>
-      <w:commentRangeStart w:id="1"/>
+      <w:commentRangeStart w:id="0"/>
       <w:r>
         <w:rPr>
           <w:rFonts w:ascii="Candara" w:hAnsi="Candara"/>
         </w:rPr>
         <w:t>Configurar click de um botão a partir da imagem</w:t>
       </w:r>
-      <w:commentRangeEnd w:id="1"/>
+      <w:commentRangeEnd w:id="0"/>
       <w:r>
         <w:rPr>
           <w:rStyle w:val="Refdecomentrio"/>
-        </w:rPr>
-        <w:commentReference w:id="1"/>
+          <w:rFonts w:ascii="Candara" w:hAnsi="Candara"/>
+          <w:sz w:val="24"/>
+          <w:szCs w:val="24"/>
+        </w:rPr>
+        <w:commentReference w:id="0"/>
       </w:r>
     </w:p>
     <w:p>
@@ -2941,6 +2895,59 @@
           <w:rFonts w:ascii="Candara" w:hAnsi="Candara"/>
         </w:rPr>
         <w:t>980; 800</w:t>
+      </w:r>
+    </w:p>
+    <w:p>
+      <w:pPr>
+        <w:pStyle w:val="PargrafodaLista"/>
+        <w:numPr>
+          <w:ilvl w:val="0"/>
+          <w:numId w:val="27"/>
+        </w:numPr>
+        <w:rPr>
+          <w:rFonts w:ascii="Candara" w:hAnsi="Candara"/>
+        </w:rPr>
+      </w:pPr>
+      <w:r>
+        <w:rPr>
+          <w:rFonts w:ascii="Candara" w:hAnsi="Candara"/>
+        </w:rPr>
+        <w:t>Criar a tela de orçamento</w:t>
+      </w:r>
+    </w:p>
+    <w:p>
+      <w:pPr>
+        <w:pStyle w:val="PargrafodaLista"/>
+        <w:numPr>
+          <w:ilvl w:val="0"/>
+          <w:numId w:val="27"/>
+        </w:numPr>
+        <w:rPr>
+          <w:rFonts w:ascii="Candara" w:hAnsi="Candara"/>
+        </w:rPr>
+      </w:pPr>
+      <w:r>
+        <w:rPr>
+          <w:rFonts w:ascii="Candara" w:hAnsi="Candara"/>
+        </w:rPr>
+        <w:t xml:space="preserve">Criar o método para </w:t>
+      </w:r>
+      <w:commentRangeStart w:id="1"/>
+      <w:r>
+        <w:rPr>
+          <w:rFonts w:ascii="Candara" w:hAnsi="Candara"/>
+        </w:rPr>
+        <w:t>buscacep</w:t>
+      </w:r>
+      <w:commentRangeEnd w:id="1"/>
+      <w:r>
+        <w:rPr>
+          <w:rStyle w:val="Refdecomentrio"/>
+          <w:rFonts w:ascii="Candara" w:hAnsi="Candara"/>
+          <w:sz w:val="24"/>
+          <w:szCs w:val="24"/>
+        </w:rPr>
+        <w:commentReference w:id="1"/>
       </w:r>
     </w:p>
     <w:sectPr>
@@ -2954,8 +2961,8 @@
 </file>
 
 <file path=word/comments.xml><?xml version="1.0" encoding="utf-8"?>
-<w:comments xmlns:wpc="http://schemas.microsoft.com/office/word/2010/wordprocessingCanvas" xmlns:cx="http://schemas.microsoft.com/office/drawing/2014/chartex" xmlns:cx1="http://schemas.microsoft.com/office/drawing/2015/9/8/chartex" xmlns:mc="http://schemas.openxmlformats.org/markup-compatibility/2006" xmlns:o="urn:schemas-microsoft-com:office:office" xmlns:r="http://schemas.openxmlformats.org/officeDocument/2006/relationships" xmlns:m="http://schemas.openxmlformats.org/officeDocument/2006/math" xmlns:v="urn:schemas-microsoft-com:vml" xmlns:wp14="http://schemas.microsoft.com/office/word/2010/wordprocessingDrawing" xmlns:wp="http://schemas.openxmlformats.org/drawingml/2006/wordprocessingDrawing" xmlns:w10="urn:schemas-microsoft-com:office:word" xmlns:w="http://schemas.openxmlformats.org/wordprocessingml/2006/main" xmlns:w14="http://schemas.microsoft.com/office/word/2010/wordml" xmlns:w15="http://schemas.microsoft.com/office/word/2012/wordml" xmlns:w16se="http://schemas.microsoft.com/office/word/2015/wordml/symex" xmlns:wpg="http://schemas.microsoft.com/office/word/2010/wordprocessingGroup" xmlns:wpi="http://schemas.microsoft.com/office/word/2010/wordprocessingInk" xmlns:wne="http://schemas.microsoft.com/office/word/2006/wordml" xmlns:wps="http://schemas.microsoft.com/office/word/2010/wordprocessingShape" mc:Ignorable="w14 w15 w16se wp14">
-  <w:comment w:id="1" w:author="DB" w:date="2026-09-28T08:49:00Z" w:initials="D">
+<w:comments xmlns:wpc="http://schemas.microsoft.com/office/word/2010/wordprocessingCanvas" xmlns:cx="http://schemas.microsoft.com/office/drawing/2014/chartex" xmlns:cx1="http://schemas.microsoft.com/office/drawing/2015/9/8/chartex" xmlns:cx2="http://schemas.microsoft.com/office/drawing/2015/10/21/chartex" xmlns:cx3="http://schemas.microsoft.com/office/drawing/2016/5/9/chartex" xmlns:cx4="http://schemas.microsoft.com/office/drawing/2016/5/10/chartex" xmlns:cx5="http://schemas.microsoft.com/office/drawing/2016/5/11/chartex" xmlns:cx6="http://schemas.microsoft.com/office/drawing/2016/5/12/chartex" xmlns:cx7="http://schemas.microsoft.com/office/drawing/2016/5/13/chartex" xmlns:cx8="http://schemas.microsoft.com/office/drawing/2016/5/14/chartex" xmlns:mc="http://schemas.openxmlformats.org/markup-compatibility/2006" xmlns:aink="http://schemas.microsoft.com/office/drawing/2016/ink" xmlns:am3d="http://schemas.microsoft.com/office/drawing/2017/model3d" xmlns:o="urn:schemas-microsoft-com:office:office" xmlns:oel="http://schemas.microsoft.com/office/2019/extlst" xmlns:r="http://schemas.openxmlformats.org/officeDocument/2006/relationships" xmlns:m="http://schemas.openxmlformats.org/officeDocument/2006/math" xmlns:v="urn:schemas-microsoft-com:vml" xmlns:wp14="http://schemas.microsoft.com/office/word/2010/wordprocessingDrawing" xmlns:wp="http://schemas.openxmlformats.org/drawingml/2006/wordprocessingDrawing" xmlns:w10="urn:schemas-microsoft-com:office:word" xmlns:w="http://schemas.openxmlformats.org/wordprocessingml/2006/main" xmlns:w14="http://schemas.microsoft.com/office/word/2010/wordml" xmlns:w15="http://schemas.microsoft.com/office/word/2012/wordml" xmlns:w16cex="http://schemas.microsoft.com/office/word/2018/wordml/cex" xmlns:w16cid="http://schemas.microsoft.com/office/word/2016/wordml/cid" xmlns:w16="http://schemas.microsoft.com/office/word/2018/wordml" xmlns:w16du="http://schemas.microsoft.com/office/word/2023/wordml/word16du" xmlns:w16sdtdh="http://schemas.microsoft.com/office/word/2020/wordml/sdtdatahash" xmlns:w16sdtfl="http://schemas.microsoft.com/office/word/2024/wordml/sdtformatlock" xmlns:w16se="http://schemas.microsoft.com/office/word/2015/wordml/symex" xmlns:wpg="http://schemas.microsoft.com/office/word/2010/wordprocessingGroup" xmlns:wpi="http://schemas.microsoft.com/office/word/2010/wordprocessingInk" xmlns:wne="http://schemas.microsoft.com/office/word/2006/wordml" xmlns:wps="http://schemas.microsoft.com/office/word/2010/wordprocessingShape" mc:Ignorable="w14 w15 w16se w16cid w16 w16cex w16sdtdh w16sdtfl w16du wp14">
+  <w:comment w:id="0" w:author="DB" w:date="2026-09-28T08:49:00Z" w:initials="D">
     <w:p>
       <w:pPr>
         <w:pStyle w:val="NormalWeb"/>
@@ -2966,7 +2973,6 @@
         </w:rPr>
         <w:annotationRef/>
       </w:r>
-      <w:proofErr w:type="gramStart"/>
       <w:r>
         <w:rPr>
           <w:rFonts w:hAnsi="Symbol"/>
@@ -2981,15 +2987,7 @@
           <w:b/>
           <w:bCs/>
         </w:rPr>
-        <w:t>Abra</w:t>
-      </w:r>
-      <w:proofErr w:type="gramEnd"/>
-      <w:r>
-        <w:rPr>
-          <w:b/>
-          <w:bCs/>
-        </w:rPr>
-        <w:t xml:space="preserve"> o seu formulário</w:t>
+        <w:t>Abra o seu formulário</w:t>
       </w:r>
       <w:r>
         <w:t xml:space="preserve"> (</w:t>
@@ -3016,7 +3014,6 @@
           <w14:ligatures w14:val="none"/>
         </w:rPr>
       </w:pPr>
-      <w:proofErr w:type="gramStart"/>
       <w:r>
         <w:rPr>
           <w:rFonts w:ascii="Times New Roman" w:eastAsia="Times New Roman" w:hAnsi="Symbol" w:cs="Times New Roman"/>
@@ -3044,9 +3041,66 @@
           <w:lang w:eastAsia="pt-BR"/>
           <w14:ligatures w14:val="none"/>
         </w:rPr>
-        <w:t>Clique</w:t>
-      </w:r>
-      <w:proofErr w:type="gramEnd"/>
+        <w:t>Clique na primeira imagem</w:t>
+      </w:r>
+      <w:r>
+        <w:rPr>
+          <w:rFonts w:ascii="Times New Roman" w:eastAsia="Times New Roman" w:hAnsi="Times New Roman" w:cs="Times New Roman"/>
+          <w:kern w:val="0"/>
+          <w:lang w:eastAsia="pt-BR"/>
+          <w14:ligatures w14:val="none"/>
+        </w:rPr>
+        <w:t xml:space="preserve"> (</w:t>
+      </w:r>
+      <w:r>
+        <w:rPr>
+          <w:rFonts w:ascii="Courier New" w:eastAsia="Times New Roman" w:hAnsi="Courier New" w:cs="Courier New"/>
+          <w:kern w:val="0"/>
+          <w:sz w:val="20"/>
+          <w:szCs w:val="20"/>
+          <w:lang w:eastAsia="pt-BR"/>
+          <w14:ligatures w14:val="none"/>
+        </w:rPr>
+        <w:t>PictureBox</w:t>
+      </w:r>
+      <w:r>
+        <w:rPr>
+          <w:rFonts w:ascii="Times New Roman" w:eastAsia="Times New Roman" w:hAnsi="Times New Roman" w:cs="Times New Roman"/>
+          <w:kern w:val="0"/>
+          <w:lang w:eastAsia="pt-BR"/>
+          <w14:ligatures w14:val="none"/>
+        </w:rPr>
+        <w:t>) que deseja transformar em botão.</w:t>
+      </w:r>
+    </w:p>
+    <w:p>
+      <w:pPr>
+        <w:spacing w:before="100" w:beforeAutospacing="1" w:after="100" w:afterAutospacing="1" w:line="240" w:lineRule="auto"/>
+        <w:rPr>
+          <w:rFonts w:ascii="Times New Roman" w:eastAsia="Times New Roman" w:hAnsi="Times New Roman" w:cs="Times New Roman"/>
+          <w:kern w:val="0"/>
+          <w:lang w:eastAsia="pt-BR"/>
+          <w14:ligatures w14:val="none"/>
+        </w:rPr>
+      </w:pPr>
+      <w:r>
+        <w:rPr>
+          <w:rFonts w:ascii="Times New Roman" w:eastAsia="Times New Roman" w:hAnsi="Symbol" w:cs="Times New Roman"/>
+          <w:kern w:val="0"/>
+          <w:lang w:eastAsia="pt-BR"/>
+          <w14:ligatures w14:val="none"/>
+        </w:rPr>
+        <w:t></w:t>
+      </w:r>
+      <w:r>
+        <w:rPr>
+          <w:rFonts w:ascii="Times New Roman" w:eastAsia="Times New Roman" w:hAnsi="Times New Roman" w:cs="Times New Roman"/>
+          <w:kern w:val="0"/>
+          <w:lang w:eastAsia="pt-BR"/>
+          <w14:ligatures w14:val="none"/>
+        </w:rPr>
+        <w:t xml:space="preserve">  Vá até a janela </w:t>
+      </w:r>
       <w:r>
         <w:rPr>
           <w:rFonts w:ascii="Times New Roman" w:eastAsia="Times New Roman" w:hAnsi="Times New Roman" w:cs="Times New Roman"/>
@@ -3056,7 +3110,7 @@
           <w:lang w:eastAsia="pt-BR"/>
           <w14:ligatures w14:val="none"/>
         </w:rPr>
-        <w:t xml:space="preserve"> na primeira imagem</w:t>
+        <w:t>Propriedades</w:t>
       </w:r>
       <w:r>
         <w:rPr>
@@ -3065,69 +3119,7 @@
           <w:lang w:eastAsia="pt-BR"/>
           <w14:ligatures w14:val="none"/>
         </w:rPr>
-        <w:t xml:space="preserve"> (</w:t>
-      </w:r>
-      <w:proofErr w:type="spellStart"/>
-      <w:r>
-        <w:rPr>
-          <w:rFonts w:ascii="Courier New" w:eastAsia="Times New Roman" w:hAnsi="Courier New" w:cs="Courier New"/>
-          <w:kern w:val="0"/>
-          <w:sz w:val="20"/>
-          <w:szCs w:val="20"/>
-          <w:lang w:eastAsia="pt-BR"/>
-          <w14:ligatures w14:val="none"/>
-        </w:rPr>
-        <w:t>PictureBox</w:t>
-      </w:r>
-      <w:proofErr w:type="spellEnd"/>
-      <w:r>
-        <w:rPr>
-          <w:rFonts w:ascii="Times New Roman" w:eastAsia="Times New Roman" w:hAnsi="Times New Roman" w:cs="Times New Roman"/>
-          <w:kern w:val="0"/>
-          <w:lang w:eastAsia="pt-BR"/>
-          <w14:ligatures w14:val="none"/>
-        </w:rPr>
-        <w:t>) que deseja transformar em botão.</w:t>
-      </w:r>
-    </w:p>
-    <w:p>
-      <w:pPr>
-        <w:spacing w:before="100" w:beforeAutospacing="1" w:after="100" w:afterAutospacing="1" w:line="240" w:lineRule="auto"/>
-        <w:rPr>
-          <w:rFonts w:ascii="Times New Roman" w:eastAsia="Times New Roman" w:hAnsi="Times New Roman" w:cs="Times New Roman"/>
-          <w:kern w:val="0"/>
-          <w:lang w:eastAsia="pt-BR"/>
-          <w14:ligatures w14:val="none"/>
-        </w:rPr>
-      </w:pPr>
-      <w:proofErr w:type="gramStart"/>
-      <w:r>
-        <w:rPr>
-          <w:rFonts w:ascii="Times New Roman" w:eastAsia="Times New Roman" w:hAnsi="Symbol" w:cs="Times New Roman"/>
-          <w:kern w:val="0"/>
-          <w:lang w:eastAsia="pt-BR"/>
-          <w14:ligatures w14:val="none"/>
-        </w:rPr>
-        <w:t></w:t>
-      </w:r>
-      <w:r>
-        <w:rPr>
-          <w:rFonts w:ascii="Times New Roman" w:eastAsia="Times New Roman" w:hAnsi="Times New Roman" w:cs="Times New Roman"/>
-          <w:kern w:val="0"/>
-          <w:lang w:eastAsia="pt-BR"/>
-          <w14:ligatures w14:val="none"/>
-        </w:rPr>
-        <w:t xml:space="preserve">  Vá</w:t>
-      </w:r>
-      <w:proofErr w:type="gramEnd"/>
-      <w:r>
-        <w:rPr>
-          <w:rFonts w:ascii="Times New Roman" w:eastAsia="Times New Roman" w:hAnsi="Times New Roman" w:cs="Times New Roman"/>
-          <w:kern w:val="0"/>
-          <w:lang w:eastAsia="pt-BR"/>
-          <w14:ligatures w14:val="none"/>
-        </w:rPr>
-        <w:t xml:space="preserve"> até a janela </w:t>
+        <w:t xml:space="preserve"> (geralmente fica no canto inferior direito). Caso não esteja aparecendo, aperte </w:t>
       </w:r>
       <w:r>
         <w:rPr>
@@ -3138,7 +3130,7 @@
           <w:lang w:eastAsia="pt-BR"/>
           <w14:ligatures w14:val="none"/>
         </w:rPr>
-        <w:t>Propriedades</w:t>
+        <w:t>F4</w:t>
       </w:r>
       <w:r>
         <w:rPr>
@@ -3147,7 +3139,36 @@
           <w:lang w:eastAsia="pt-BR"/>
           <w14:ligatures w14:val="none"/>
         </w:rPr>
-        <w:t xml:space="preserve"> (geralmente fica no canto inferior direito). Caso não esteja aparecendo, aperte </w:t>
+        <w:t>.</w:t>
+      </w:r>
+    </w:p>
+    <w:p>
+      <w:pPr>
+        <w:spacing w:before="100" w:beforeAutospacing="1" w:after="100" w:afterAutospacing="1" w:line="240" w:lineRule="auto"/>
+        <w:rPr>
+          <w:rFonts w:ascii="Times New Roman" w:eastAsia="Times New Roman" w:hAnsi="Times New Roman" w:cs="Times New Roman"/>
+          <w:kern w:val="0"/>
+          <w:lang w:eastAsia="pt-BR"/>
+          <w14:ligatures w14:val="none"/>
+        </w:rPr>
+      </w:pPr>
+      <w:r>
+        <w:rPr>
+          <w:rFonts w:ascii="Times New Roman" w:eastAsia="Times New Roman" w:hAnsi="Symbol" w:cs="Times New Roman"/>
+          <w:kern w:val="0"/>
+          <w:lang w:eastAsia="pt-BR"/>
+          <w14:ligatures w14:val="none"/>
+        </w:rPr>
+        <w:t></w:t>
+      </w:r>
+      <w:r>
+        <w:rPr>
+          <w:rFonts w:ascii="Times New Roman" w:eastAsia="Times New Roman" w:hAnsi="Times New Roman" w:cs="Times New Roman"/>
+          <w:kern w:val="0"/>
+          <w:lang w:eastAsia="pt-BR"/>
+          <w14:ligatures w14:val="none"/>
+        </w:rPr>
+        <w:t xml:space="preserve">  No topo da janela de Propriedades, clique no ícone de </w:t>
       </w:r>
       <w:r>
         <w:rPr>
@@ -3158,7 +3179,7 @@
           <w:lang w:eastAsia="pt-BR"/>
           <w14:ligatures w14:val="none"/>
         </w:rPr>
-        <w:t>F4</w:t>
+        <w:t>Raio (Eventos)</w:t>
       </w:r>
       <w:r>
         <w:rPr>
@@ -3167,7 +3188,7 @@
           <w:lang w:eastAsia="pt-BR"/>
           <w14:ligatures w14:val="none"/>
         </w:rPr>
-        <w:t>.</w:t>
+        <w:t xml:space="preserve"> para ver os eventos disponíveis.</w:t>
       </w:r>
     </w:p>
     <w:p>
@@ -3180,7 +3201,6 @@
           <w14:ligatures w14:val="none"/>
         </w:rPr>
       </w:pPr>
-      <w:proofErr w:type="gramStart"/>
       <w:r>
         <w:rPr>
           <w:rFonts w:ascii="Times New Roman" w:eastAsia="Times New Roman" w:hAnsi="Symbol" w:cs="Times New Roman"/>
@@ -3197,77 +3217,7 @@
           <w:lang w:eastAsia="pt-BR"/>
           <w14:ligatures w14:val="none"/>
         </w:rPr>
-        <w:t xml:space="preserve">  No</w:t>
-      </w:r>
-      <w:proofErr w:type="gramEnd"/>
-      <w:r>
-        <w:rPr>
-          <w:rFonts w:ascii="Times New Roman" w:eastAsia="Times New Roman" w:hAnsi="Times New Roman" w:cs="Times New Roman"/>
-          <w:kern w:val="0"/>
-          <w:lang w:eastAsia="pt-BR"/>
-          <w14:ligatures w14:val="none"/>
-        </w:rPr>
-        <w:t xml:space="preserve"> topo da janela de Propriedades, clique no ícone de </w:t>
-      </w:r>
-      <w:r>
-        <w:rPr>
-          <w:rFonts w:ascii="Times New Roman" w:eastAsia="Times New Roman" w:hAnsi="Times New Roman" w:cs="Times New Roman"/>
-          <w:b/>
-          <w:bCs/>
-          <w:kern w:val="0"/>
-          <w:lang w:eastAsia="pt-BR"/>
-          <w14:ligatures w14:val="none"/>
-        </w:rPr>
-        <w:t>Raio (Eventos)</w:t>
-      </w:r>
-      <w:r>
-        <w:rPr>
-          <w:rFonts w:ascii="Times New Roman" w:eastAsia="Times New Roman" w:hAnsi="Times New Roman" w:cs="Times New Roman"/>
-          <w:kern w:val="0"/>
-          <w:lang w:eastAsia="pt-BR"/>
-          <w14:ligatures w14:val="none"/>
-        </w:rPr>
-        <w:t xml:space="preserve"> para ver os eventos disponíveis.</w:t>
-      </w:r>
-    </w:p>
-    <w:p>
-      <w:pPr>
-        <w:spacing w:before="100" w:beforeAutospacing="1" w:after="100" w:afterAutospacing="1" w:line="240" w:lineRule="auto"/>
-        <w:rPr>
-          <w:rFonts w:ascii="Times New Roman" w:eastAsia="Times New Roman" w:hAnsi="Times New Roman" w:cs="Times New Roman"/>
-          <w:kern w:val="0"/>
-          <w:lang w:eastAsia="pt-BR"/>
-          <w14:ligatures w14:val="none"/>
-        </w:rPr>
-      </w:pPr>
-      <w:proofErr w:type="gramStart"/>
-      <w:r>
-        <w:rPr>
-          <w:rFonts w:ascii="Times New Roman" w:eastAsia="Times New Roman" w:hAnsi="Symbol" w:cs="Times New Roman"/>
-          <w:kern w:val="0"/>
-          <w:lang w:eastAsia="pt-BR"/>
-          <w14:ligatures w14:val="none"/>
-        </w:rPr>
-        <w:t></w:t>
-      </w:r>
-      <w:r>
-        <w:rPr>
-          <w:rFonts w:ascii="Times New Roman" w:eastAsia="Times New Roman" w:hAnsi="Times New Roman" w:cs="Times New Roman"/>
-          <w:kern w:val="0"/>
-          <w:lang w:eastAsia="pt-BR"/>
-          <w14:ligatures w14:val="none"/>
-        </w:rPr>
-        <w:t xml:space="preserve">  Procure</w:t>
-      </w:r>
-      <w:proofErr w:type="gramEnd"/>
-      <w:r>
-        <w:rPr>
-          <w:rFonts w:ascii="Times New Roman" w:eastAsia="Times New Roman" w:hAnsi="Times New Roman" w:cs="Times New Roman"/>
-          <w:kern w:val="0"/>
-          <w:lang w:eastAsia="pt-BR"/>
-          <w14:ligatures w14:val="none"/>
-        </w:rPr>
-        <w:t xml:space="preserve"> pelo evento </w:t>
+        <w:t xml:space="preserve">  Procure pelo evento </w:t>
       </w:r>
       <w:r>
         <w:rPr>
@@ -3302,7 +3252,6 @@
           <w14:ligatures w14:val="none"/>
         </w:rPr>
       </w:pPr>
-      <w:proofErr w:type="gramStart"/>
       <w:r>
         <w:rPr>
           <w:rFonts w:ascii="Times New Roman" w:eastAsia="Times New Roman" w:hAnsi="Symbol" w:cs="Times New Roman"/>
@@ -3319,17 +3268,7 @@
           <w:lang w:eastAsia="pt-BR"/>
           <w14:ligatures w14:val="none"/>
         </w:rPr>
-        <w:t xml:space="preserve">  Dê</w:t>
-      </w:r>
-      <w:proofErr w:type="gramEnd"/>
-      <w:r>
-        <w:rPr>
-          <w:rFonts w:ascii="Times New Roman" w:eastAsia="Times New Roman" w:hAnsi="Times New Roman" w:cs="Times New Roman"/>
-          <w:kern w:val="0"/>
-          <w:lang w:eastAsia="pt-BR"/>
-          <w14:ligatures w14:val="none"/>
-        </w:rPr>
-        <w:t xml:space="preserve"> um </w:t>
+        <w:t xml:space="preserve">  Dê um </w:t>
       </w:r>
       <w:r>
         <w:rPr>
@@ -3422,17 +3361,1021 @@
       </w:pPr>
     </w:p>
   </w:comment>
+  <w:comment w:id="1" w:author="Aloma Barros" w:date="2026-09-29T15:05:00Z" w:initials="AB">
+    <w:p>
+      <w:pPr>
+        <w:pStyle w:val="Textodecomentrio"/>
+      </w:pPr>
+      <w:r>
+        <w:rPr>
+          <w:rStyle w:val="Refdecomentrio"/>
+        </w:rPr>
+        <w:annotationRef/>
+      </w:r>
+      <w:r>
+        <w:t>using System;</w:t>
+      </w:r>
+    </w:p>
+    <w:p>
+      <w:pPr>
+        <w:pStyle w:val="Textodecomentrio"/>
+      </w:pPr>
+      <w:r>
+        <w:t>using System.Collections.Generic;</w:t>
+      </w:r>
+    </w:p>
+    <w:p>
+      <w:pPr>
+        <w:pStyle w:val="Textodecomentrio"/>
+      </w:pPr>
+      <w:r>
+        <w:t>using System.ComponentModel;</w:t>
+      </w:r>
+    </w:p>
+    <w:p>
+      <w:pPr>
+        <w:pStyle w:val="Textodecomentrio"/>
+      </w:pPr>
+      <w:r>
+        <w:t>using System.Data;</w:t>
+      </w:r>
+    </w:p>
+    <w:p>
+      <w:pPr>
+        <w:pStyle w:val="Textodecomentrio"/>
+      </w:pPr>
+      <w:r>
+        <w:t>using System.Drawing;</w:t>
+      </w:r>
+    </w:p>
+    <w:p>
+      <w:pPr>
+        <w:pStyle w:val="Textodecomentrio"/>
+      </w:pPr>
+      <w:r>
+        <w:t>using System.Linq;</w:t>
+      </w:r>
+    </w:p>
+    <w:p>
+      <w:pPr>
+        <w:pStyle w:val="Textodecomentrio"/>
+      </w:pPr>
+      <w:r>
+        <w:t>using System.Net;</w:t>
+      </w:r>
+    </w:p>
+    <w:p>
+      <w:pPr>
+        <w:pStyle w:val="Textodecomentrio"/>
+      </w:pPr>
+      <w:r>
+        <w:t>using System.Text;</w:t>
+      </w:r>
+    </w:p>
+    <w:p>
+      <w:pPr>
+        <w:pStyle w:val="Textodecomentrio"/>
+      </w:pPr>
+      <w:r>
+        <w:t>using System.Threading.Tasks;</w:t>
+      </w:r>
+    </w:p>
+    <w:p>
+      <w:pPr>
+        <w:pStyle w:val="Textodecomentrio"/>
+      </w:pPr>
+      <w:r>
+        <w:t>using System.Windows.Forms;</w:t>
+      </w:r>
+    </w:p>
+    <w:p>
+      <w:pPr>
+        <w:pStyle w:val="Textodecomentrio"/>
+      </w:pPr>
+    </w:p>
+    <w:p>
+      <w:pPr>
+        <w:pStyle w:val="Textodecomentrio"/>
+      </w:pPr>
+      <w:r>
+        <w:t>namespace ProjetoLogistica</w:t>
+      </w:r>
+    </w:p>
+    <w:p>
+      <w:pPr>
+        <w:pStyle w:val="Textodecomentrio"/>
+      </w:pPr>
+      <w:r>
+        <w:t>{</w:t>
+      </w:r>
+    </w:p>
+    <w:p>
+      <w:pPr>
+        <w:pStyle w:val="Textodecomentrio"/>
+      </w:pPr>
+      <w:r>
+        <w:t xml:space="preserve">    public partial class Frm_orcamento : Form</w:t>
+      </w:r>
+    </w:p>
+    <w:p>
+      <w:pPr>
+        <w:pStyle w:val="Textodecomentrio"/>
+      </w:pPr>
+      <w:r>
+        <w:t xml:space="preserve">    {</w:t>
+      </w:r>
+    </w:p>
+    <w:p>
+      <w:pPr>
+        <w:pStyle w:val="Textodecomentrio"/>
+      </w:pPr>
+      <w:r>
+        <w:t xml:space="preserve">        public Frm_orcamento()</w:t>
+      </w:r>
+    </w:p>
+    <w:p>
+      <w:pPr>
+        <w:pStyle w:val="Textodecomentrio"/>
+      </w:pPr>
+      <w:r>
+        <w:t xml:space="preserve">        {</w:t>
+      </w:r>
+    </w:p>
+    <w:p>
+      <w:pPr>
+        <w:pStyle w:val="Textodecomentrio"/>
+      </w:pPr>
+      <w:r>
+        <w:t xml:space="preserve">            InitializeComponent();</w:t>
+      </w:r>
+    </w:p>
+    <w:p>
+      <w:pPr>
+        <w:pStyle w:val="Textodecomentrio"/>
+      </w:pPr>
+      <w:r>
+        <w:t xml:space="preserve">        }</w:t>
+      </w:r>
+    </w:p>
+    <w:p>
+      <w:pPr>
+        <w:pStyle w:val="Textodecomentrio"/>
+      </w:pPr>
+    </w:p>
+    <w:p>
+      <w:pPr>
+        <w:pStyle w:val="Textodecomentrio"/>
+      </w:pPr>
+      <w:r>
+        <w:t xml:space="preserve">        // ==========================================</w:t>
+      </w:r>
+    </w:p>
+    <w:p>
+      <w:pPr>
+        <w:pStyle w:val="Textodecomentrio"/>
+      </w:pPr>
+      <w:r>
+        <w:t xml:space="preserve">        // BUSCA DE CEP - ORIGEM</w:t>
+      </w:r>
+    </w:p>
+    <w:p>
+      <w:pPr>
+        <w:pStyle w:val="Textodecomentrio"/>
+      </w:pPr>
+      <w:r>
+        <w:t xml:space="preserve">        // ==========================================</w:t>
+      </w:r>
+    </w:p>
+    <w:p>
+      <w:pPr>
+        <w:pStyle w:val="Textodecomentrio"/>
+      </w:pPr>
+      <w:r>
+        <w:t xml:space="preserve">        private void txtCepOrigem_Leave(object sender, EventArgs e)</w:t>
+      </w:r>
+    </w:p>
+    <w:p>
+      <w:pPr>
+        <w:pStyle w:val="Textodecomentrio"/>
+      </w:pPr>
+      <w:r>
+        <w:t xml:space="preserve">        {</w:t>
+      </w:r>
+    </w:p>
+    <w:p>
+      <w:pPr>
+        <w:pStyle w:val="Textodecomentrio"/>
+      </w:pPr>
+      <w:r>
+        <w:t xml:space="preserve">            string cep = txtCepOrigem.Text.Replace("-", "").Trim();</w:t>
+      </w:r>
+    </w:p>
+    <w:p>
+      <w:pPr>
+        <w:pStyle w:val="Textodecomentrio"/>
+      </w:pPr>
+    </w:p>
+    <w:p>
+      <w:pPr>
+        <w:pStyle w:val="Textodecomentrio"/>
+      </w:pPr>
+      <w:r>
+        <w:t xml:space="preserve">            if (cep.Length == 8)</w:t>
+      </w:r>
+    </w:p>
+    <w:p>
+      <w:pPr>
+        <w:pStyle w:val="Textodecomentrio"/>
+      </w:pPr>
+      <w:r>
+        <w:t xml:space="preserve">            {</w:t>
+      </w:r>
+    </w:p>
+    <w:p>
+      <w:pPr>
+        <w:pStyle w:val="Textodecomentrio"/>
+      </w:pPr>
+      <w:r>
+        <w:t xml:space="preserve">                try</w:t>
+      </w:r>
+    </w:p>
+    <w:p>
+      <w:pPr>
+        <w:pStyle w:val="Textodecomentrio"/>
+      </w:pPr>
+      <w:r>
+        <w:t xml:space="preserve">                {</w:t>
+      </w:r>
+    </w:p>
+    <w:p>
+      <w:pPr>
+        <w:pStyle w:val="Textodecomentrio"/>
+      </w:pPr>
+      <w:r>
+        <w:t xml:space="preserve">                    string url = $"https://viacep.com.br/ws/{cep}/json/";</w:t>
+      </w:r>
+    </w:p>
+    <w:p>
+      <w:pPr>
+        <w:pStyle w:val="Textodecomentrio"/>
+      </w:pPr>
+    </w:p>
+    <w:p>
+      <w:pPr>
+        <w:pStyle w:val="Textodecomentrio"/>
+      </w:pPr>
+      <w:r>
+        <w:t xml:space="preserve">                    using (WebClient client = new WebClient())</w:t>
+      </w:r>
+    </w:p>
+    <w:p>
+      <w:pPr>
+        <w:pStyle w:val="Textodecomentrio"/>
+      </w:pPr>
+      <w:r>
+        <w:t xml:space="preserve">                    {</w:t>
+      </w:r>
+    </w:p>
+    <w:p>
+      <w:pPr>
+        <w:pStyle w:val="Textodecomentrio"/>
+      </w:pPr>
+      <w:r>
+        <w:t xml:space="preserve">                        string resposta = client.DownloadString(url);</w:t>
+      </w:r>
+    </w:p>
+    <w:p>
+      <w:pPr>
+        <w:pStyle w:val="Textodecomentrio"/>
+      </w:pPr>
+    </w:p>
+    <w:p>
+      <w:pPr>
+        <w:pStyle w:val="Textodecomentrio"/>
+      </w:pPr>
+      <w:r>
+        <w:t xml:space="preserve">                        if (resposta.Contains("\"erro\":true") || resposta.Contains("\"erro\": true"))</w:t>
+      </w:r>
+    </w:p>
+    <w:p>
+      <w:pPr>
+        <w:pStyle w:val="Textodecomentrio"/>
+      </w:pPr>
+      <w:r>
+        <w:t xml:space="preserve">                        {</w:t>
+      </w:r>
+    </w:p>
+    <w:p>
+      <w:pPr>
+        <w:pStyle w:val="Textodecomentrio"/>
+      </w:pPr>
+      <w:r>
+        <w:t xml:space="preserve">                            MessageBox.Show("CEP de Origem não encontrado!", "Erro", MessageBoxButtons.OK, MessageBoxIcon.Error);</w:t>
+      </w:r>
+    </w:p>
+    <w:p>
+      <w:pPr>
+        <w:pStyle w:val="Textodecomentrio"/>
+      </w:pPr>
+      <w:r>
+        <w:t xml:space="preserve">                            return;</w:t>
+      </w:r>
+    </w:p>
+    <w:p>
+      <w:pPr>
+        <w:pStyle w:val="Textodecomentrio"/>
+      </w:pPr>
+      <w:r>
+        <w:t xml:space="preserve">                        }</w:t>
+      </w:r>
+    </w:p>
+    <w:p>
+      <w:pPr>
+        <w:pStyle w:val="Textodecomentrio"/>
+      </w:pPr>
+    </w:p>
+    <w:p>
+      <w:pPr>
+        <w:pStyle w:val="Textodecomentrio"/>
+      </w:pPr>
+      <w:r>
+        <w:t xml:space="preserve">                        string logradouro = ExtrairValorJson(resposta, "logradouro");</w:t>
+      </w:r>
+    </w:p>
+    <w:p>
+      <w:pPr>
+        <w:pStyle w:val="Textodecomentrio"/>
+      </w:pPr>
+      <w:r>
+        <w:t xml:space="preserve">                        string bairro = ExtrairValorJson(resposta, "bairro");</w:t>
+      </w:r>
+    </w:p>
+    <w:p>
+      <w:pPr>
+        <w:pStyle w:val="Textodecomentrio"/>
+      </w:pPr>
+      <w:r>
+        <w:t xml:space="preserve">                        string cidade = ExtrairValorJson(resposta, "localidade");</w:t>
+      </w:r>
+    </w:p>
+    <w:p>
+      <w:pPr>
+        <w:pStyle w:val="Textodecomentrio"/>
+      </w:pPr>
+      <w:r>
+        <w:t xml:space="preserve">                        string uf = ExtrairValorJson(resposta, "uf");</w:t>
+      </w:r>
+    </w:p>
+    <w:p>
+      <w:pPr>
+        <w:pStyle w:val="Textodecomentrio"/>
+      </w:pPr>
+    </w:p>
+    <w:p>
+      <w:pPr>
+        <w:pStyle w:val="Textodecomentrio"/>
+      </w:pPr>
+      <w:r>
+        <w:t xml:space="preserve">                        // Preenchendo os seus campos exatos de Origem:</w:t>
+      </w:r>
+    </w:p>
+    <w:p>
+      <w:pPr>
+        <w:pStyle w:val="Textodecomentrio"/>
+      </w:pPr>
+      <w:r>
+        <w:t xml:space="preserve">                        txtRuaO.Text = $"{logradouro} - {bairro}";</w:t>
+      </w:r>
+    </w:p>
+    <w:p>
+      <w:pPr>
+        <w:pStyle w:val="Textodecomentrio"/>
+      </w:pPr>
+      <w:r>
+        <w:t xml:space="preserve">                        textCidadeO.Text = cidade;</w:t>
+      </w:r>
+    </w:p>
+    <w:p>
+      <w:pPr>
+        <w:pStyle w:val="Textodecomentrio"/>
+      </w:pPr>
+      <w:r>
+        <w:t xml:space="preserve">                        textUFO.Text = uf;</w:t>
+      </w:r>
+    </w:p>
+    <w:p>
+      <w:pPr>
+        <w:pStyle w:val="Textodecomentrio"/>
+      </w:pPr>
+      <w:r>
+        <w:t xml:space="preserve">                    }</w:t>
+      </w:r>
+    </w:p>
+    <w:p>
+      <w:pPr>
+        <w:pStyle w:val="Textodecomentrio"/>
+      </w:pPr>
+      <w:r>
+        <w:t xml:space="preserve">                }</w:t>
+      </w:r>
+    </w:p>
+    <w:p>
+      <w:pPr>
+        <w:pStyle w:val="Textodecomentrio"/>
+      </w:pPr>
+      <w:r>
+        <w:t xml:space="preserve">                catch (Exception ex)</w:t>
+      </w:r>
+    </w:p>
+    <w:p>
+      <w:pPr>
+        <w:pStyle w:val="Textodecomentrio"/>
+      </w:pPr>
+      <w:r>
+        <w:t xml:space="preserve">                {</w:t>
+      </w:r>
+    </w:p>
+    <w:p>
+      <w:pPr>
+        <w:pStyle w:val="Textodecomentrio"/>
+      </w:pPr>
+      <w:r>
+        <w:t xml:space="preserve">                    MessageBox.Show("Erro ao buscar o CEP de Origem: " + ex.Message, "Erro", MessageBoxButtons.OK, MessageBoxIcon.Error);</w:t>
+      </w:r>
+    </w:p>
+    <w:p>
+      <w:pPr>
+        <w:pStyle w:val="Textodecomentrio"/>
+      </w:pPr>
+      <w:r>
+        <w:t xml:space="preserve">                }</w:t>
+      </w:r>
+    </w:p>
+    <w:p>
+      <w:pPr>
+        <w:pStyle w:val="Textodecomentrio"/>
+      </w:pPr>
+      <w:r>
+        <w:t xml:space="preserve">            }</w:t>
+      </w:r>
+    </w:p>
+    <w:p>
+      <w:pPr>
+        <w:pStyle w:val="Textodecomentrio"/>
+      </w:pPr>
+      <w:r>
+        <w:t xml:space="preserve">        }</w:t>
+      </w:r>
+    </w:p>
+    <w:p>
+      <w:pPr>
+        <w:pStyle w:val="Textodecomentrio"/>
+      </w:pPr>
+    </w:p>
+    <w:p>
+      <w:pPr>
+        <w:pStyle w:val="Textodecomentrio"/>
+      </w:pPr>
+      <w:r>
+        <w:t xml:space="preserve">        // ==========================================</w:t>
+      </w:r>
+    </w:p>
+    <w:p>
+      <w:pPr>
+        <w:pStyle w:val="Textodecomentrio"/>
+      </w:pPr>
+      <w:r>
+        <w:t xml:space="preserve">        // BUSCA DE CEP - DESTINO</w:t>
+      </w:r>
+    </w:p>
+    <w:p>
+      <w:pPr>
+        <w:pStyle w:val="Textodecomentrio"/>
+      </w:pPr>
+      <w:r>
+        <w:t xml:space="preserve">        // ==========================================</w:t>
+      </w:r>
+    </w:p>
+    <w:p>
+      <w:pPr>
+        <w:pStyle w:val="Textodecomentrio"/>
+      </w:pPr>
+      <w:r>
+        <w:t xml:space="preserve">        private void txtCepDestino_Leave(object sender, EventArgs e)</w:t>
+      </w:r>
+    </w:p>
+    <w:p>
+      <w:pPr>
+        <w:pStyle w:val="Textodecomentrio"/>
+      </w:pPr>
+      <w:r>
+        <w:t xml:space="preserve">        {</w:t>
+      </w:r>
+    </w:p>
+    <w:p>
+      <w:pPr>
+        <w:pStyle w:val="Textodecomentrio"/>
+      </w:pPr>
+      <w:r>
+        <w:t xml:space="preserve">            string cep = txtCepDestino.Text.Replace("-", "").Trim();</w:t>
+      </w:r>
+    </w:p>
+    <w:p>
+      <w:pPr>
+        <w:pStyle w:val="Textodecomentrio"/>
+      </w:pPr>
+    </w:p>
+    <w:p>
+      <w:pPr>
+        <w:pStyle w:val="Textodecomentrio"/>
+      </w:pPr>
+      <w:r>
+        <w:t xml:space="preserve">            if (cep.Length == 8)</w:t>
+      </w:r>
+    </w:p>
+    <w:p>
+      <w:pPr>
+        <w:pStyle w:val="Textodecomentrio"/>
+      </w:pPr>
+      <w:r>
+        <w:t xml:space="preserve">            {</w:t>
+      </w:r>
+    </w:p>
+    <w:p>
+      <w:pPr>
+        <w:pStyle w:val="Textodecomentrio"/>
+      </w:pPr>
+      <w:r>
+        <w:t xml:space="preserve">                try</w:t>
+      </w:r>
+    </w:p>
+    <w:p>
+      <w:pPr>
+        <w:pStyle w:val="Textodecomentrio"/>
+      </w:pPr>
+      <w:r>
+        <w:t xml:space="preserve">                {</w:t>
+      </w:r>
+    </w:p>
+    <w:p>
+      <w:pPr>
+        <w:pStyle w:val="Textodecomentrio"/>
+      </w:pPr>
+      <w:r>
+        <w:t xml:space="preserve">                    string url = $"https://viacep.com.br/ws/{cep}/json/";</w:t>
+      </w:r>
+    </w:p>
+    <w:p>
+      <w:pPr>
+        <w:pStyle w:val="Textodecomentrio"/>
+      </w:pPr>
+    </w:p>
+    <w:p>
+      <w:pPr>
+        <w:pStyle w:val="Textodecomentrio"/>
+      </w:pPr>
+      <w:r>
+        <w:t xml:space="preserve">                    using (WebClient client = new WebClient())</w:t>
+      </w:r>
+    </w:p>
+    <w:p>
+      <w:pPr>
+        <w:pStyle w:val="Textodecomentrio"/>
+      </w:pPr>
+      <w:r>
+        <w:t xml:space="preserve">                    {</w:t>
+      </w:r>
+    </w:p>
+    <w:p>
+      <w:pPr>
+        <w:pStyle w:val="Textodecomentrio"/>
+      </w:pPr>
+      <w:r>
+        <w:t xml:space="preserve">                        string resposta = client.DownloadString(url);</w:t>
+      </w:r>
+    </w:p>
+    <w:p>
+      <w:pPr>
+        <w:pStyle w:val="Textodecomentrio"/>
+      </w:pPr>
+    </w:p>
+    <w:p>
+      <w:pPr>
+        <w:pStyle w:val="Textodecomentrio"/>
+      </w:pPr>
+      <w:r>
+        <w:t xml:space="preserve">                        if (resposta.Contains("\"erro\":true") || resposta.Contains("\"erro\": true"))</w:t>
+      </w:r>
+    </w:p>
+    <w:p>
+      <w:pPr>
+        <w:pStyle w:val="Textodecomentrio"/>
+      </w:pPr>
+      <w:r>
+        <w:t xml:space="preserve">                        {</w:t>
+      </w:r>
+    </w:p>
+    <w:p>
+      <w:pPr>
+        <w:pStyle w:val="Textodecomentrio"/>
+      </w:pPr>
+      <w:r>
+        <w:t xml:space="preserve">                            MessageBox.Show("CEP de Destino não encontrado!", "Erro", MessageBoxButtons.OK, MessageBoxIcon.Error);</w:t>
+      </w:r>
+    </w:p>
+    <w:p>
+      <w:pPr>
+        <w:pStyle w:val="Textodecomentrio"/>
+      </w:pPr>
+      <w:r>
+        <w:t xml:space="preserve">                            return;</w:t>
+      </w:r>
+    </w:p>
+    <w:p>
+      <w:pPr>
+        <w:pStyle w:val="Textodecomentrio"/>
+      </w:pPr>
+      <w:r>
+        <w:t xml:space="preserve">                        }</w:t>
+      </w:r>
+    </w:p>
+    <w:p>
+      <w:pPr>
+        <w:pStyle w:val="Textodecomentrio"/>
+      </w:pPr>
+    </w:p>
+    <w:p>
+      <w:pPr>
+        <w:pStyle w:val="Textodecomentrio"/>
+      </w:pPr>
+      <w:r>
+        <w:t xml:space="preserve">                        string logradouro = ExtrairValorJson(resposta, "logradouro");</w:t>
+      </w:r>
+    </w:p>
+    <w:p>
+      <w:pPr>
+        <w:pStyle w:val="Textodecomentrio"/>
+      </w:pPr>
+      <w:r>
+        <w:t xml:space="preserve">                        string bairro = ExtrairValorJson(resposta, "bairro");</w:t>
+      </w:r>
+    </w:p>
+    <w:p>
+      <w:pPr>
+        <w:pStyle w:val="Textodecomentrio"/>
+      </w:pPr>
+      <w:r>
+        <w:t xml:space="preserve">                        string cidade = ExtrairValorJson(resposta, "localidade");</w:t>
+      </w:r>
+    </w:p>
+    <w:p>
+      <w:pPr>
+        <w:pStyle w:val="Textodecomentrio"/>
+      </w:pPr>
+      <w:r>
+        <w:t xml:space="preserve">                        string uf = ExtrairValorJson(resposta, "uf");</w:t>
+      </w:r>
+    </w:p>
+    <w:p>
+      <w:pPr>
+        <w:pStyle w:val="Textodecomentrio"/>
+      </w:pPr>
+    </w:p>
+    <w:p>
+      <w:pPr>
+        <w:pStyle w:val="Textodecomentrio"/>
+      </w:pPr>
+      <w:r>
+        <w:t xml:space="preserve">                        // Preenchendo os seus campos exatos de Destino:</w:t>
+      </w:r>
+    </w:p>
+    <w:p>
+      <w:pPr>
+        <w:pStyle w:val="Textodecomentrio"/>
+      </w:pPr>
+      <w:r>
+        <w:t xml:space="preserve">                        txtRuafim.Text = $"{logradouro} - {bairro}";</w:t>
+      </w:r>
+    </w:p>
+    <w:p>
+      <w:pPr>
+        <w:pStyle w:val="Textodecomentrio"/>
+      </w:pPr>
+      <w:r>
+        <w:t xml:space="preserve">                        textCidadeFim.Text = cidade;</w:t>
+      </w:r>
+    </w:p>
+    <w:p>
+      <w:pPr>
+        <w:pStyle w:val="Textodecomentrio"/>
+      </w:pPr>
+      <w:r>
+        <w:t xml:space="preserve">                        textUFFim.Text = uf;</w:t>
+      </w:r>
+    </w:p>
+    <w:p>
+      <w:pPr>
+        <w:pStyle w:val="Textodecomentrio"/>
+      </w:pPr>
+      <w:r>
+        <w:t xml:space="preserve">                    }</w:t>
+      </w:r>
+    </w:p>
+    <w:p>
+      <w:pPr>
+        <w:pStyle w:val="Textodecomentrio"/>
+      </w:pPr>
+      <w:r>
+        <w:t xml:space="preserve">                }</w:t>
+      </w:r>
+    </w:p>
+    <w:p>
+      <w:pPr>
+        <w:pStyle w:val="Textodecomentrio"/>
+      </w:pPr>
+      <w:r>
+        <w:t xml:space="preserve">                catch (Exception ex)</w:t>
+      </w:r>
+    </w:p>
+    <w:p>
+      <w:pPr>
+        <w:pStyle w:val="Textodecomentrio"/>
+      </w:pPr>
+      <w:r>
+        <w:t xml:space="preserve">                {</w:t>
+      </w:r>
+    </w:p>
+    <w:p>
+      <w:pPr>
+        <w:pStyle w:val="Textodecomentrio"/>
+      </w:pPr>
+      <w:r>
+        <w:t xml:space="preserve">                    MessageBox.Show("Erro ao buscar o CEP de Destino: " + ex.Message, "Erro", MessageBoxButtons.OK, MessageBoxIcon.Error);</w:t>
+      </w:r>
+    </w:p>
+    <w:p>
+      <w:pPr>
+        <w:pStyle w:val="Textodecomentrio"/>
+      </w:pPr>
+      <w:r>
+        <w:t xml:space="preserve">                }</w:t>
+      </w:r>
+    </w:p>
+    <w:p>
+      <w:pPr>
+        <w:pStyle w:val="Textodecomentrio"/>
+      </w:pPr>
+      <w:r>
+        <w:t xml:space="preserve">            }</w:t>
+      </w:r>
+    </w:p>
+    <w:p>
+      <w:pPr>
+        <w:pStyle w:val="Textodecomentrio"/>
+      </w:pPr>
+      <w:r>
+        <w:t xml:space="preserve">        }</w:t>
+      </w:r>
+    </w:p>
+    <w:p>
+      <w:pPr>
+        <w:pStyle w:val="Textodecomentrio"/>
+      </w:pPr>
+    </w:p>
+    <w:p>
+      <w:pPr>
+        <w:pStyle w:val="Textodecomentrio"/>
+      </w:pPr>
+      <w:r>
+        <w:t xml:space="preserve">        // ==========================================</w:t>
+      </w:r>
+    </w:p>
+    <w:p>
+      <w:pPr>
+        <w:pStyle w:val="Textodecomentrio"/>
+      </w:pPr>
+      <w:r>
+        <w:t xml:space="preserve">        // FUNÇÃO AUXILIAR PARA LER O JSON DO VIACEP</w:t>
+      </w:r>
+    </w:p>
+    <w:p>
+      <w:pPr>
+        <w:pStyle w:val="Textodecomentrio"/>
+      </w:pPr>
+      <w:r>
+        <w:t xml:space="preserve">        // ==========================================</w:t>
+      </w:r>
+    </w:p>
+    <w:p>
+      <w:pPr>
+        <w:pStyle w:val="Textodecomentrio"/>
+      </w:pPr>
+      <w:r>
+        <w:t xml:space="preserve">        private string ExtrairValorJson(string json, string chave)</w:t>
+      </w:r>
+    </w:p>
+    <w:p>
+      <w:pPr>
+        <w:pStyle w:val="Textodecomentrio"/>
+      </w:pPr>
+      <w:r>
+        <w:t xml:space="preserve">        {</w:t>
+      </w:r>
+    </w:p>
+    <w:p>
+      <w:pPr>
+        <w:pStyle w:val="Textodecomentrio"/>
+      </w:pPr>
+      <w:r>
+        <w:t xml:space="preserve">            try</w:t>
+      </w:r>
+    </w:p>
+    <w:p>
+      <w:pPr>
+        <w:pStyle w:val="Textodecomentrio"/>
+      </w:pPr>
+      <w:r>
+        <w:t xml:space="preserve">            {</w:t>
+      </w:r>
+    </w:p>
+    <w:p>
+      <w:pPr>
+        <w:pStyle w:val="Textodecomentrio"/>
+      </w:pPr>
+      <w:r>
+        <w:t xml:space="preserve">                string busca = $"\"{chave}\":\"";</w:t>
+      </w:r>
+    </w:p>
+    <w:p>
+      <w:pPr>
+        <w:pStyle w:val="Textodecomentrio"/>
+      </w:pPr>
+      <w:r>
+        <w:t xml:space="preserve">                int inicio = json.IndexOf(busca);</w:t>
+      </w:r>
+    </w:p>
+    <w:p>
+      <w:pPr>
+        <w:pStyle w:val="Textodecomentrio"/>
+      </w:pPr>
+      <w:r>
+        <w:t xml:space="preserve">                if (inicio == -1)</w:t>
+      </w:r>
+    </w:p>
+    <w:p>
+      <w:pPr>
+        <w:pStyle w:val="Textodecomentrio"/>
+      </w:pPr>
+      <w:r>
+        <w:t xml:space="preserve">                {</w:t>
+      </w:r>
+    </w:p>
+    <w:p>
+      <w:pPr>
+        <w:pStyle w:val="Textodecomentrio"/>
+      </w:pPr>
+      <w:r>
+        <w:t xml:space="preserve">                    busca = $"\"{chave}\": \"";</w:t>
+      </w:r>
+    </w:p>
+    <w:p>
+      <w:pPr>
+        <w:pStyle w:val="Textodecomentrio"/>
+      </w:pPr>
+      <w:r>
+        <w:t xml:space="preserve">                    inicio = json.IndexOf(busca);</w:t>
+      </w:r>
+    </w:p>
+    <w:p>
+      <w:pPr>
+        <w:pStyle w:val="Textodecomentrio"/>
+      </w:pPr>
+      <w:r>
+        <w:t xml:space="preserve">                    if (inicio == -1) return "";</w:t>
+      </w:r>
+    </w:p>
+    <w:p>
+      <w:pPr>
+        <w:pStyle w:val="Textodecomentrio"/>
+      </w:pPr>
+      <w:r>
+        <w:t xml:space="preserve">                }</w:t>
+      </w:r>
+    </w:p>
+    <w:p>
+      <w:pPr>
+        <w:pStyle w:val="Textodecomentrio"/>
+      </w:pPr>
+      <w:r>
+        <w:t xml:space="preserve">                inicio += busca.Length;</w:t>
+      </w:r>
+    </w:p>
+    <w:p>
+      <w:pPr>
+        <w:pStyle w:val="Textodecomentrio"/>
+      </w:pPr>
+      <w:r>
+        <w:t xml:space="preserve">                int fim = json.IndexOf("\"", inicio);</w:t>
+      </w:r>
+    </w:p>
+    <w:p>
+      <w:pPr>
+        <w:pStyle w:val="Textodecomentrio"/>
+      </w:pPr>
+      <w:r>
+        <w:t xml:space="preserve">                return json.Substring(inicio, fim - inicio);</w:t>
+      </w:r>
+    </w:p>
+    <w:p>
+      <w:pPr>
+        <w:pStyle w:val="Textodecomentrio"/>
+      </w:pPr>
+      <w:r>
+        <w:t xml:space="preserve">            }</w:t>
+      </w:r>
+    </w:p>
+    <w:p>
+      <w:pPr>
+        <w:pStyle w:val="Textodecomentrio"/>
+      </w:pPr>
+      <w:r>
+        <w:t xml:space="preserve">            catch</w:t>
+      </w:r>
+    </w:p>
+    <w:p>
+      <w:pPr>
+        <w:pStyle w:val="Textodecomentrio"/>
+      </w:pPr>
+      <w:r>
+        <w:t xml:space="preserve">            {</w:t>
+      </w:r>
+    </w:p>
+    <w:p>
+      <w:pPr>
+        <w:pStyle w:val="Textodecomentrio"/>
+      </w:pPr>
+      <w:r>
+        <w:t xml:space="preserve">                return "";</w:t>
+      </w:r>
+    </w:p>
+    <w:p>
+      <w:pPr>
+        <w:pStyle w:val="Textodecomentrio"/>
+      </w:pPr>
+      <w:r>
+        <w:t xml:space="preserve">            }</w:t>
+      </w:r>
+    </w:p>
+    <w:p>
+      <w:pPr>
+        <w:pStyle w:val="Textodecomentrio"/>
+      </w:pPr>
+      <w:r>
+        <w:t xml:space="preserve">        }</w:t>
+      </w:r>
+    </w:p>
+    <w:p>
+      <w:pPr>
+        <w:pStyle w:val="Textodecomentrio"/>
+      </w:pPr>
+      <w:r>
+        <w:t xml:space="preserve">    }</w:t>
+      </w:r>
+    </w:p>
+    <w:p>
+      <w:pPr>
+        <w:pStyle w:val="Textodecomentrio"/>
+      </w:pPr>
+      <w:r>
+        <w:t>}</w:t>
+      </w:r>
+    </w:p>
+  </w:comment>
 </w:comments>
 </file>
 
 <file path=word/commentsExtended.xml><?xml version="1.0" encoding="utf-8"?>
-<w15:commentsEx xmlns:wpc="http://schemas.microsoft.com/office/word/2010/wordprocessingCanvas" xmlns:cx="http://schemas.microsoft.com/office/drawing/2014/chartex" xmlns:cx1="http://schemas.microsoft.com/office/drawing/2015/9/8/chartex" xmlns:mc="http://schemas.openxmlformats.org/markup-compatibility/2006" xmlns:o="urn:schemas-microsoft-com:office:office" xmlns:r="http://schemas.openxmlformats.org/officeDocument/2006/relationships" xmlns:m="http://schemas.openxmlformats.org/officeDocument/2006/math" xmlns:v="urn:schemas-microsoft-com:vml" xmlns:wp14="http://schemas.microsoft.com/office/word/2010/wordprocessingDrawing" xmlns:wp="http://schemas.openxmlformats.org/drawingml/2006/wordprocessingDrawing" xmlns:w10="urn:schemas-microsoft-com:office:word" xmlns:w="http://schemas.openxmlformats.org/wordprocessingml/2006/main" xmlns:w14="http://schemas.microsoft.com/office/word/2010/wordml" xmlns:w15="http://schemas.microsoft.com/office/word/2012/wordml" xmlns:w16se="http://schemas.microsoft.com/office/word/2015/wordml/symex" xmlns:wpg="http://schemas.microsoft.com/office/word/2010/wordprocessingGroup" xmlns:wpi="http://schemas.microsoft.com/office/word/2010/wordprocessingInk" xmlns:wne="http://schemas.microsoft.com/office/word/2006/wordml" xmlns:wps="http://schemas.microsoft.com/office/word/2010/wordprocessingShape" mc:Ignorable="w14 w15 w16se wp14">
+<w15:commentsEx xmlns:wpc="http://schemas.microsoft.com/office/word/2010/wordprocessingCanvas" xmlns:cx="http://schemas.microsoft.com/office/drawing/2014/chartex" xmlns:cx1="http://schemas.microsoft.com/office/drawing/2015/9/8/chartex" xmlns:cx2="http://schemas.microsoft.com/office/drawing/2015/10/21/chartex" xmlns:cx3="http://schemas.microsoft.com/office/drawing/2016/5/9/chartex" xmlns:cx4="http://schemas.microsoft.com/office/drawing/2016/5/10/chartex" xmlns:cx5="http://schemas.microsoft.com/office/drawing/2016/5/11/chartex" xmlns:cx6="http://schemas.microsoft.com/office/drawing/2016/5/12/chartex" xmlns:cx7="http://schemas.microsoft.com/office/drawing/2016/5/13/chartex" xmlns:cx8="http://schemas.microsoft.com/office/drawing/2016/5/14/chartex" xmlns:mc="http://schemas.openxmlformats.org/markup-compatibility/2006" xmlns:aink="http://schemas.microsoft.com/office/drawing/2016/ink" xmlns:am3d="http://schemas.microsoft.com/office/drawing/2017/model3d" xmlns:o="urn:schemas-microsoft-com:office:office" xmlns:oel="http://schemas.microsoft.com/office/2019/extlst" xmlns:r="http://schemas.openxmlformats.org/officeDocument/2006/relationships" xmlns:m="http://schemas.openxmlformats.org/officeDocument/2006/math" xmlns:v="urn:schemas-microsoft-com:vml" xmlns:wp14="http://schemas.microsoft.com/office/word/2010/wordprocessingDrawing" xmlns:wp="http://schemas.openxmlformats.org/drawingml/2006/wordprocessingDrawing" xmlns:w10="urn:schemas-microsoft-com:office:word" xmlns:w="http://schemas.openxmlformats.org/wordprocessingml/2006/main" xmlns:w14="http://schemas.microsoft.com/office/word/2010/wordml" xmlns:w15="http://schemas.microsoft.com/office/word/2012/wordml" xmlns:w16cex="http://schemas.microsoft.com/office/word/2018/wordml/cex" xmlns:w16cid="http://schemas.microsoft.com/office/word/2016/wordml/cid" xmlns:w16="http://schemas.microsoft.com/office/word/2018/wordml" xmlns:w16du="http://schemas.microsoft.com/office/word/2023/wordml/word16du" xmlns:w16sdtdh="http://schemas.microsoft.com/office/word/2020/wordml/sdtdatahash" xmlns:w16sdtfl="http://schemas.microsoft.com/office/word/2024/wordml/sdtformatlock" xmlns:w16se="http://schemas.microsoft.com/office/word/2015/wordml/symex" xmlns:wpg="http://schemas.microsoft.com/office/word/2010/wordprocessingGroup" xmlns:wpi="http://schemas.microsoft.com/office/word/2010/wordprocessingInk" xmlns:wne="http://schemas.microsoft.com/office/word/2006/wordml" xmlns:wps="http://schemas.microsoft.com/office/word/2010/wordprocessingShape" mc:Ignorable="w14 w15 w16se w16cid w16 w16cex w16sdtdh w16sdtfl w16du wp14">
   <w15:commentEx w15:paraId="4C255E8D" w15:done="0"/>
+  <w15:commentEx w15:paraId="1631FEE4" w15:done="0"/>
 </w15:commentsEx>
 </file>
 
+<file path=word/commentsExtensible.xml><?xml version="1.0" encoding="utf-8"?>
+<w16cex:commentsExtensible xmlns:wpc="http://schemas.microsoft.com/office/word/2010/wordprocessingCanvas" xmlns:cx="http://schemas.microsoft.com/office/drawing/2014/chartex" xmlns:cx1="http://schemas.microsoft.com/office/drawing/2015/9/8/chartex" xmlns:cx2="http://schemas.microsoft.com/office/drawing/2015/10/21/chartex" xmlns:cx3="http://schemas.microsoft.com/office/drawing/2016/5/9/chartex" xmlns:cx4="http://schemas.microsoft.com/office/drawing/2016/5/10/chartex" xmlns:cx5="http://schemas.microsoft.com/office/drawing/2016/5/11/chartex" xmlns:cx6="http://schemas.microsoft.com/office/drawing/2016/5/12/chartex" xmlns:cx7="http://schemas.microsoft.com/office/drawing/2016/5/13/chartex" xmlns:cx8="http://schemas.microsoft.com/office/drawing/2016/5/14/chartex" xmlns:cr="http://schemas.microsoft.com/office/comments/2020/reactions" xmlns:mc="http://schemas.openxmlformats.org/markup-compatibility/2006" xmlns:aink="http://schemas.microsoft.com/office/drawing/2016/ink" xmlns:am3d="http://schemas.microsoft.com/office/drawing/2017/model3d" xmlns:o="urn:schemas-microsoft-com:office:office" xmlns:oel="http://schemas.microsoft.com/office/2019/extlst" xmlns:r="http://schemas.openxmlformats.org/officeDocument/2006/relationships" xmlns:m="http://schemas.openxmlformats.org/officeDocument/2006/math" xmlns:v="urn:schemas-microsoft-com:vml" xmlns:wp14="http://schemas.microsoft.com/office/word/2010/wordprocessingDrawing" xmlns:wp="http://schemas.openxmlformats.org/drawingml/2006/wordprocessingDrawing" xmlns:w10="urn:schemas-microsoft-com:office:word" xmlns:w="http://schemas.openxmlformats.org/wordprocessingml/2006/main" xmlns:w14="http://schemas.microsoft.com/office/word/2010/wordml" xmlns:w15="http://schemas.microsoft.com/office/word/2012/wordml" xmlns:w16cex="http://schemas.microsoft.com/office/word/2018/wordml/cex" xmlns:w16cid="http://schemas.microsoft.com/office/word/2016/wordml/cid" xmlns:w16="http://schemas.microsoft.com/office/word/2018/wordml" xmlns:w16du="http://schemas.microsoft.com/office/word/2023/wordml/word16du" xmlns:w16sdtdh="http://schemas.microsoft.com/office/word/2020/wordml/sdtdatahash" xmlns:w16sdtfl="http://schemas.microsoft.com/office/word/2024/wordml/sdtformatlock" xmlns:w16se="http://schemas.microsoft.com/office/word/2015/wordml/symex" xmlns:wpg="http://schemas.microsoft.com/office/word/2010/wordprocessingGroup" xmlns:wpi="http://schemas.microsoft.com/office/word/2010/wordprocessingInk" xmlns:wne="http://schemas.microsoft.com/office/word/2006/wordml" xmlns:wps="http://schemas.microsoft.com/office/word/2010/wordprocessingShape" mc:Ignorable="w14 w15 w16se w16cid w16 w16cex w16sdtdh w16sdtfl cr w16du wp14">
+  <w16cex:commentExtensible w16cex:durableId="1B7C6EBA" w16cex:dateUtc="2026-09-29T18:05:00Z"/>
+</w16cex:commentsExtensible>
+</file>
+
+<file path=word/commentsIds.xml><?xml version="1.0" encoding="utf-8"?>
+<w16cid:commentsIds xmlns:wpc="http://schemas.microsoft.com/office/word/2010/wordprocessingCanvas" xmlns:cx="http://schemas.microsoft.com/office/drawing/2014/chartex" xmlns:cx1="http://schemas.microsoft.com/office/drawing/2015/9/8/chartex" xmlns:cx2="http://schemas.microsoft.com/office/drawing/2015/10/21/chartex" xmlns:cx3="http://schemas.microsoft.com/office/drawing/2016/5/9/chartex" xmlns:cx4="http://schemas.microsoft.com/office/drawing/2016/5/10/chartex" xmlns:cx5="http://schemas.microsoft.com/office/drawing/2016/5/11/chartex" xmlns:cx6="http://schemas.microsoft.com/office/drawing/2016/5/12/chartex" xmlns:cx7="http://schemas.microsoft.com/office/drawing/2016/5/13/chartex" xmlns:cx8="http://schemas.microsoft.com/office/drawing/2016/5/14/chartex" xmlns:mc="http://schemas.openxmlformats.org/markup-compatibility/2006" xmlns:aink="http://schemas.microsoft.com/office/drawing/2016/ink" xmlns:am3d="http://schemas.microsoft.com/office/drawing/2017/model3d" xmlns:o="urn:schemas-microsoft-com:office:office" xmlns:oel="http://schemas.microsoft.com/office/2019/extlst" xmlns:r="http://schemas.openxmlformats.org/officeDocument/2006/relationships" xmlns:m="http://schemas.openxmlformats.org/officeDocument/2006/math" xmlns:v="urn:schemas-microsoft-com:vml" xmlns:wp14="http://schemas.microsoft.com/office/word/2010/wordprocessingDrawing" xmlns:wp="http://schemas.openxmlformats.org/drawingml/2006/wordprocessingDrawing" xmlns:w10="urn:schemas-microsoft-com:office:word" xmlns:w="http://schemas.openxmlformats.org/wordprocessingml/2006/main" xmlns:w14="http://schemas.microsoft.com/office/word/2010/wordml" xmlns:w15="http://schemas.microsoft.com/office/word/2012/wordml" xmlns:w16cex="http://schemas.microsoft.com/office/word/2018/wordml/cex" xmlns:w16cid="http://schemas.microsoft.com/office/word/2016/wordml/cid" xmlns:w16="http://schemas.microsoft.com/office/word/2018/wordml" xmlns:w16du="http://schemas.microsoft.com/office/word/2023/wordml/word16du" xmlns:w16sdtdh="http://schemas.microsoft.com/office/word/2020/wordml/sdtdatahash" xmlns:w16sdtfl="http://schemas.microsoft.com/office/word/2024/wordml/sdtformatlock" xmlns:w16se="http://schemas.microsoft.com/office/word/2015/wordml/symex" xmlns:wpg="http://schemas.microsoft.com/office/word/2010/wordprocessingGroup" xmlns:wpi="http://schemas.microsoft.com/office/word/2010/wordprocessingInk" xmlns:wne="http://schemas.microsoft.com/office/word/2006/wordml" xmlns:wps="http://schemas.microsoft.com/office/word/2010/wordprocessingShape" mc:Ignorable="w14 w15 w16se w16cid w16 w16cex w16sdtdh w16sdtfl w16du wp14">
+  <w16cid:commentId w16cid:paraId="4C255E8D" w16cid:durableId="4C255E8D"/>
+  <w16cid:commentId w16cid:paraId="1631FEE4" w16cid:durableId="1B7C6EBA"/>
+</w16cid:commentsIds>
+</file>
+
 <file path=word/numbering.xml><?xml version="1.0" encoding="utf-8"?>
-<w:numbering xmlns:wpc="http://schemas.microsoft.com/office/word/2010/wordprocessingCanvas" xmlns:cx="http://schemas.microsoft.com/office/drawing/2014/chartex" xmlns:cx1="http://schemas.microsoft.com/office/drawing/2015/9/8/chartex" xmlns:mc="http://schemas.openxmlformats.org/markup-compatibility/2006" xmlns:o="urn:schemas-microsoft-com:office:office" xmlns:r="http://schemas.openxmlformats.org/officeDocument/2006/relationships" xmlns:m="http://schemas.openxmlformats.org/officeDocument/2006/math" xmlns:v="urn:schemas-microsoft-com:vml" xmlns:wp14="http://schemas.microsoft.com/office/word/2010/wordprocessingDrawing" xmlns:wp="http://schemas.openxmlformats.org/drawingml/2006/wordprocessingDrawing" xmlns:w10="urn:schemas-microsoft-com:office:word" xmlns:w="http://schemas.openxmlformats.org/wordprocessingml/2006/main" xmlns:w14="http://schemas.microsoft.com/office/word/2010/wordml" xmlns:w15="http://schemas.microsoft.com/office/word/2012/wordml" xmlns:w16se="http://schemas.microsoft.com/office/word/2015/wordml/symex" xmlns:wpg="http://schemas.microsoft.com/office/word/2010/wordprocessingGroup" xmlns:wpi="http://schemas.microsoft.com/office/word/2010/wordprocessingInk" xmlns:wne="http://schemas.microsoft.com/office/word/2006/wordml" xmlns:wps="http://schemas.microsoft.com/office/word/2010/wordprocessingShape" mc:Ignorable="w14 w15 w16se wp14">
+<w:numbering xmlns:wpc="http://schemas.microsoft.com/office/word/2010/wordprocessingCanvas" xmlns:cx="http://schemas.microsoft.com/office/drawing/2014/chartex" xmlns:cx1="http://schemas.microsoft.com/office/drawing/2015/9/8/chartex" xmlns:cx2="http://schemas.microsoft.com/office/drawing/2015/10/21/chartex" xmlns:cx3="http://schemas.microsoft.com/office/drawing/2016/5/9/chartex" xmlns:cx4="http://schemas.microsoft.com/office/drawing/2016/5/10/chartex" xmlns:cx5="http://schemas.microsoft.com/office/drawing/2016/5/11/chartex" xmlns:cx6="http://schemas.microsoft.com/office/drawing/2016/5/12/chartex" xmlns:cx7="http://schemas.microsoft.com/office/drawing/2016/5/13/chartex" xmlns:cx8="http://schemas.microsoft.com/office/drawing/2016/5/14/chartex" xmlns:mc="http://schemas.openxmlformats.org/markup-compatibility/2006" xmlns:aink="http://schemas.microsoft.com/office/drawing/2016/ink" xmlns:am3d="http://schemas.microsoft.com/office/drawing/2017/model3d" xmlns:o="urn:schemas-microsoft-com:office:office" xmlns:oel="http://schemas.microsoft.com/office/2019/extlst" xmlns:r="http://schemas.openxmlformats.org/officeDocument/2006/relationships" xmlns:m="http://schemas.openxmlformats.org/officeDocument/2006/math" xmlns:v="urn:schemas-microsoft-com:vml" xmlns:wp14="http://schemas.microsoft.com/office/word/2010/wordprocessingDrawing" xmlns:wp="http://schemas.openxmlformats.org/drawingml/2006/wordprocessingDrawing" xmlns:w10="urn:schemas-microsoft-com:office:word" xmlns:w="http://schemas.openxmlformats.org/wordprocessingml/2006/main" xmlns:w14="http://schemas.microsoft.com/office/word/2010/wordml" xmlns:w15="http://schemas.microsoft.com/office/word/2012/wordml" xmlns:w16cex="http://schemas.microsoft.com/office/word/2018/wordml/cex" xmlns:w16cid="http://schemas.microsoft.com/office/word/2016/wordml/cid" xmlns:w16="http://schemas.microsoft.com/office/word/2018/wordml" xmlns:w16du="http://schemas.microsoft.com/office/word/2023/wordml/word16du" xmlns:w16sdtdh="http://schemas.microsoft.com/office/word/2020/wordml/sdtdatahash" xmlns:w16sdtfl="http://schemas.microsoft.com/office/word/2024/wordml/sdtformatlock" xmlns:w16se="http://schemas.microsoft.com/office/word/2015/wordml/symex" xmlns:wpg="http://schemas.microsoft.com/office/word/2010/wordprocessingGroup" xmlns:wpi="http://schemas.microsoft.com/office/word/2010/wordprocessingInk" xmlns:wne="http://schemas.microsoft.com/office/word/2006/wordml" xmlns:wps="http://schemas.microsoft.com/office/word/2010/wordprocessingShape" mc:Ignorable="w14 w15 w16se w16cid w16 w16cex w16sdtdh w16sdtfl w16du wp14">
   <w:abstractNum w:abstractNumId="0" w15:restartNumberingAfterBreak="0">
     <w:nsid w:val="03A57919"/>
     <w:multiLevelType w:val="multilevel"/>
@@ -6569,103 +7512,106 @@
       </w:rPr>
     </w:lvl>
   </w:abstractNum>
-  <w:num w:numId="1">
+  <w:num w:numId="1" w16cid:durableId="559438659">
     <w:abstractNumId w:val="3"/>
   </w:num>
-  <w:num w:numId="2">
+  <w:num w:numId="2" w16cid:durableId="1912084103">
     <w:abstractNumId w:val="25"/>
   </w:num>
-  <w:num w:numId="3">
+  <w:num w:numId="3" w16cid:durableId="1538549039">
     <w:abstractNumId w:val="16"/>
   </w:num>
-  <w:num w:numId="4">
+  <w:num w:numId="4" w16cid:durableId="287593873">
     <w:abstractNumId w:val="4"/>
   </w:num>
-  <w:num w:numId="5">
+  <w:num w:numId="5" w16cid:durableId="472795703">
     <w:abstractNumId w:val="21"/>
   </w:num>
-  <w:num w:numId="6">
+  <w:num w:numId="6" w16cid:durableId="1348025012">
     <w:abstractNumId w:val="6"/>
   </w:num>
-  <w:num w:numId="7">
+  <w:num w:numId="7" w16cid:durableId="412240426">
     <w:abstractNumId w:val="1"/>
   </w:num>
-  <w:num w:numId="8">
+  <w:num w:numId="8" w16cid:durableId="1483235651">
     <w:abstractNumId w:val="12"/>
   </w:num>
-  <w:num w:numId="9">
+  <w:num w:numId="9" w16cid:durableId="1055008012">
     <w:abstractNumId w:val="24"/>
   </w:num>
-  <w:num w:numId="10">
+  <w:num w:numId="10" w16cid:durableId="1913852685">
     <w:abstractNumId w:val="26"/>
   </w:num>
-  <w:num w:numId="11">
+  <w:num w:numId="11" w16cid:durableId="38749392">
     <w:abstractNumId w:val="11"/>
   </w:num>
-  <w:num w:numId="12">
+  <w:num w:numId="12" w16cid:durableId="1225945311">
     <w:abstractNumId w:val="0"/>
   </w:num>
-  <w:num w:numId="13">
+  <w:num w:numId="13" w16cid:durableId="1168180371">
     <w:abstractNumId w:val="10"/>
   </w:num>
-  <w:num w:numId="14">
+  <w:num w:numId="14" w16cid:durableId="1150295141">
     <w:abstractNumId w:val="2"/>
   </w:num>
-  <w:num w:numId="15">
+  <w:num w:numId="15" w16cid:durableId="917135064">
     <w:abstractNumId w:val="20"/>
   </w:num>
-  <w:num w:numId="16">
+  <w:num w:numId="16" w16cid:durableId="1059747647">
     <w:abstractNumId w:val="22"/>
   </w:num>
-  <w:num w:numId="17">
+  <w:num w:numId="17" w16cid:durableId="1164204169">
     <w:abstractNumId w:val="18"/>
   </w:num>
-  <w:num w:numId="18">
+  <w:num w:numId="18" w16cid:durableId="980815485">
     <w:abstractNumId w:val="9"/>
   </w:num>
-  <w:num w:numId="19">
+  <w:num w:numId="19" w16cid:durableId="1542328741">
     <w:abstractNumId w:val="19"/>
   </w:num>
-  <w:num w:numId="20">
+  <w:num w:numId="20" w16cid:durableId="984747861">
     <w:abstractNumId w:val="27"/>
   </w:num>
-  <w:num w:numId="21">
+  <w:num w:numId="21" w16cid:durableId="1741126734">
     <w:abstractNumId w:val="13"/>
   </w:num>
-  <w:num w:numId="22">
+  <w:num w:numId="22" w16cid:durableId="1996911211">
     <w:abstractNumId w:val="5"/>
   </w:num>
-  <w:num w:numId="23">
+  <w:num w:numId="23" w16cid:durableId="1587037045">
     <w:abstractNumId w:val="23"/>
   </w:num>
-  <w:num w:numId="24">
+  <w:num w:numId="24" w16cid:durableId="167720820">
     <w:abstractNumId w:val="14"/>
   </w:num>
-  <w:num w:numId="25">
+  <w:num w:numId="25" w16cid:durableId="1887646489">
     <w:abstractNumId w:val="7"/>
   </w:num>
-  <w:num w:numId="26">
+  <w:num w:numId="26" w16cid:durableId="2084137827">
     <w:abstractNumId w:val="8"/>
   </w:num>
-  <w:num w:numId="27">
+  <w:num w:numId="27" w16cid:durableId="582222226">
     <w:abstractNumId w:val="15"/>
   </w:num>
-  <w:num w:numId="28">
+  <w:num w:numId="28" w16cid:durableId="963341862">
     <w:abstractNumId w:val="17"/>
   </w:num>
 </w:numbering>
 </file>
 
 <file path=word/people.xml><?xml version="1.0" encoding="utf-8"?>
-<w15:people xmlns:wpc="http://schemas.microsoft.com/office/word/2010/wordprocessingCanvas" xmlns:cx="http://schemas.microsoft.com/office/drawing/2014/chartex" xmlns:cx1="http://schemas.microsoft.com/office/drawing/2015/9/8/chartex" xmlns:mc="http://schemas.openxmlformats.org/markup-compatibility/2006" xmlns:o="urn:schemas-microsoft-com:office:office" xmlns:r="http://schemas.openxmlformats.org/officeDocument/2006/relationships" xmlns:m="http://schemas.openxmlformats.org/officeDocument/2006/math" xmlns:v="urn:schemas-microsoft-com:vml" xmlns:wp14="http://schemas.microsoft.com/office/word/2010/wordprocessingDrawing" xmlns:wp="http://schemas.openxmlformats.org/drawingml/2006/wordprocessingDrawing" xmlns:w10="urn:schemas-microsoft-com:office:word" xmlns:w="http://schemas.openxmlformats.org/wordprocessingml/2006/main" xmlns:w14="http://schemas.microsoft.com/office/word/2010/wordml" xmlns:w15="http://schemas.microsoft.com/office/word/2012/wordml" xmlns:w16se="http://schemas.microsoft.com/office/word/2015/wordml/symex" xmlns:wpg="http://schemas.microsoft.com/office/word/2010/wordprocessingGroup" xmlns:wpi="http://schemas.microsoft.com/office/word/2010/wordprocessingInk" xmlns:wne="http://schemas.microsoft.com/office/word/2006/wordml" xmlns:wps="http://schemas.microsoft.com/office/word/2010/wordprocessingShape" mc:Ignorable="w14 w15 w16se wp14">
+<w15:people xmlns:wpc="http://schemas.microsoft.com/office/word/2010/wordprocessingCanvas" xmlns:cx="http://schemas.microsoft.com/office/drawing/2014/chartex" xmlns:cx1="http://schemas.microsoft.com/office/drawing/2015/9/8/chartex" xmlns:cx2="http://schemas.microsoft.com/office/drawing/2015/10/21/chartex" xmlns:cx3="http://schemas.microsoft.com/office/drawing/2016/5/9/chartex" xmlns:cx4="http://schemas.microsoft.com/office/drawing/2016/5/10/chartex" xmlns:cx5="http://schemas.microsoft.com/office/drawing/2016/5/11/chartex" xmlns:cx6="http://schemas.microsoft.com/office/drawing/2016/5/12/chartex" xmlns:cx7="http://schemas.microsoft.com/office/drawing/2016/5/13/chartex" xmlns:cx8="http://schemas.microsoft.com/office/drawing/2016/5/14/chartex" xmlns:mc="http://schemas.openxmlformats.org/markup-compatibility/2006" xmlns:aink="http://schemas.microsoft.com/office/drawing/2016/ink" xmlns:am3d="http://schemas.microsoft.com/office/drawing/2017/model3d" xmlns:o="urn:schemas-microsoft-com:office:office" xmlns:oel="http://schemas.microsoft.com/office/2019/extlst" xmlns:r="http://schemas.openxmlformats.org/officeDocument/2006/relationships" xmlns:m="http://schemas.openxmlformats.org/officeDocument/2006/math" xmlns:v="urn:schemas-microsoft-com:vml" xmlns:wp14="http://schemas.microsoft.com/office/word/2010/wordprocessingDrawing" xmlns:wp="http://schemas.openxmlformats.org/drawingml/2006/wordprocessingDrawing" xmlns:w10="urn:schemas-microsoft-com:office:word" xmlns:w="http://schemas.openxmlformats.org/wordprocessingml/2006/main" xmlns:w14="http://schemas.microsoft.com/office/word/2010/wordml" xmlns:w15="http://schemas.microsoft.com/office/word/2012/wordml" xmlns:w16cex="http://schemas.microsoft.com/office/word/2018/wordml/cex" xmlns:w16cid="http://schemas.microsoft.com/office/word/2016/wordml/cid" xmlns:w16="http://schemas.microsoft.com/office/word/2018/wordml" xmlns:w16du="http://schemas.microsoft.com/office/word/2023/wordml/word16du" xmlns:w16sdtdh="http://schemas.microsoft.com/office/word/2020/wordml/sdtdatahash" xmlns:w16sdtfl="http://schemas.microsoft.com/office/word/2024/wordml/sdtformatlock" xmlns:w16se="http://schemas.microsoft.com/office/word/2015/wordml/symex" xmlns:wpg="http://schemas.microsoft.com/office/word/2010/wordprocessingGroup" xmlns:wpi="http://schemas.microsoft.com/office/word/2010/wordprocessingInk" xmlns:wne="http://schemas.microsoft.com/office/word/2006/wordml" xmlns:wps="http://schemas.microsoft.com/office/word/2010/wordprocessingShape" mc:Ignorable="w14 w15 w16se w16cid w16 w16cex w16sdtdh w16sdtfl w16du wp14">
   <w15:person w15:author="DB">
     <w15:presenceInfo w15:providerId="None" w15:userId="DB"/>
+  </w15:person>
+  <w15:person w15:author="Aloma Barros">
+    <w15:presenceInfo w15:providerId="Windows Live" w15:userId="d639de6b4f83812e"/>
   </w15:person>
 </w15:people>
 </file>
 
 <file path=word/styles.xml><?xml version="1.0" encoding="utf-8"?>
-<w:styles xmlns:mc="http://schemas.openxmlformats.org/markup-compatibility/2006" xmlns:r="http://schemas.openxmlformats.org/officeDocument/2006/relationships" xmlns:w="http://schemas.openxmlformats.org/wordprocessingml/2006/main" xmlns:w14="http://schemas.microsoft.com/office/word/2010/wordml" xmlns:w15="http://schemas.microsoft.com/office/word/2012/wordml" xmlns:w16se="http://schemas.microsoft.com/office/word/2015/wordml/symex" mc:Ignorable="w14 w15 w16se">
+<w:styles xmlns:mc="http://schemas.openxmlformats.org/markup-compatibility/2006" xmlns:r="http://schemas.openxmlformats.org/officeDocument/2006/relationships" xmlns:w="http://schemas.openxmlformats.org/wordprocessingml/2006/main" xmlns:w14="http://schemas.microsoft.com/office/word/2010/wordml" xmlns:w15="http://schemas.microsoft.com/office/word/2012/wordml" xmlns:w16cex="http://schemas.microsoft.com/office/word/2018/wordml/cex" xmlns:w16cid="http://schemas.microsoft.com/office/word/2016/wordml/cid" xmlns:w16="http://schemas.microsoft.com/office/word/2018/wordml" xmlns:w16du="http://schemas.microsoft.com/office/word/2023/wordml/word16du" xmlns:w16sdtdh="http://schemas.microsoft.com/office/word/2020/wordml/sdtdatahash" xmlns:w16sdtfl="http://schemas.microsoft.com/office/word/2024/wordml/sdtformatlock" xmlns:w16se="http://schemas.microsoft.com/office/word/2015/wordml/symex" mc:Ignorable="w14 w15 w16se w16cid w16 w16cex w16sdtdh w16sdtfl w16du">
   <w:docDefaults>
     <w:rPrDefault>
       <w:rPr>
@@ -6683,7 +7629,7 @@
       </w:pPr>
     </w:pPrDefault>
   </w:docDefaults>
-  <w:latentStyles w:defLockedState="0" w:defUIPriority="99" w:defSemiHidden="0" w:defUnhideWhenUsed="0" w:defQFormat="0" w:count="371">
+  <w:latentStyles w:defLockedState="0" w:defUIPriority="99" w:defSemiHidden="0" w:defUnhideWhenUsed="0" w:defQFormat="0" w:count="376">
     <w:lsdException w:name="Normal" w:uiPriority="0" w:qFormat="1"/>
     <w:lsdException w:name="heading 1" w:uiPriority="9" w:qFormat="1"/>
     <w:lsdException w:name="heading 2" w:semiHidden="1" w:uiPriority="9" w:unhideWhenUsed="1" w:qFormat="1"/>
@@ -7055,6 +8001,11 @@
     <w:lsdException w:name="List Table 5 Dark Accent 6" w:uiPriority="50"/>
     <w:lsdException w:name="List Table 6 Colorful Accent 6" w:uiPriority="51"/>
     <w:lsdException w:name="List Table 7 Colorful Accent 6" w:uiPriority="52"/>
+    <w:lsdException w:name="Mention" w:semiHidden="1" w:unhideWhenUsed="1"/>
+    <w:lsdException w:name="Smart Hyperlink" w:semiHidden="1" w:unhideWhenUsed="1"/>
+    <w:lsdException w:name="Hashtag" w:semiHidden="1" w:unhideWhenUsed="1"/>
+    <w:lsdException w:name="Unresolved Mention" w:semiHidden="1" w:unhideWhenUsed="1"/>
+    <w:lsdException w:name="Smart Link" w:semiHidden="1" w:unhideWhenUsed="1"/>
   </w:latentStyles>
   <w:style w:type="paragraph" w:default="1" w:styleId="Normal">
     <w:name w:val="Normal"/>
@@ -7943,7 +8894,6 @@
     <w:basedOn w:val="Normal"/>
     <w:link w:val="TextodecomentrioChar"/>
     <w:uiPriority w:val="99"/>
-    <w:semiHidden/>
     <w:unhideWhenUsed/>
     <w:rsid w:val="00A02C4A"/>
     <w:pPr>
@@ -7959,7 +8909,6 @@
     <w:basedOn w:val="Fontepargpadro"/>
     <w:link w:val="Textodecomentrio"/>
     <w:uiPriority w:val="99"/>
-    <w:semiHidden/>
     <w:rsid w:val="00A02C4A"/>
     <w:rPr>
       <w:sz w:val="20"/>
@@ -8023,6 +8972,16 @@
       <w:sz w:val="18"/>
       <w:szCs w:val="18"/>
     </w:rPr>
+  </w:style>
+  <w:style w:type="paragraph" w:styleId="Reviso">
+    <w:name w:val="Revision"/>
+    <w:hidden/>
+    <w:uiPriority w:val="99"/>
+    <w:semiHidden/>
+    <w:rsid w:val="00817C3D"/>
+    <w:pPr>
+      <w:spacing w:after="0" w:line="240" w:lineRule="auto"/>
+    </w:pPr>
   </w:style>
 </w:styles>
 </file>

</xml_diff>

<commit_message>
Estrutura do cálculo frete
</commit_message>
<xml_diff>
--- a/ProjetoLogistica/Documentação - Logística.docx
+++ b/ProjetoLogistica/Documentação - Logística.docx
@@ -1,6 +1,6 @@
 
 <file path=word/document.xml><?xml version="1.0" encoding="utf-8"?>
-<w:document xmlns:wpc="http://schemas.microsoft.com/office/word/2010/wordprocessingCanvas" xmlns:cx="http://schemas.microsoft.com/office/drawing/2014/chartex" xmlns:cx1="http://schemas.microsoft.com/office/drawing/2015/9/8/chartex" xmlns:mc="http://schemas.openxmlformats.org/markup-compatibility/2006" xmlns:o="urn:schemas-microsoft-com:office:office" xmlns:r="http://schemas.openxmlformats.org/officeDocument/2006/relationships" xmlns:m="http://schemas.openxmlformats.org/officeDocument/2006/math" xmlns:v="urn:schemas-microsoft-com:vml" xmlns:wp14="http://schemas.microsoft.com/office/word/2010/wordprocessingDrawing" xmlns:wp="http://schemas.openxmlformats.org/drawingml/2006/wordprocessingDrawing" xmlns:w10="urn:schemas-microsoft-com:office:word" xmlns:w="http://schemas.openxmlformats.org/wordprocessingml/2006/main" xmlns:w14="http://schemas.microsoft.com/office/word/2010/wordml" xmlns:w15="http://schemas.microsoft.com/office/word/2012/wordml" xmlns:w16se="http://schemas.microsoft.com/office/word/2015/wordml/symex" xmlns:wpg="http://schemas.microsoft.com/office/word/2010/wordprocessingGroup" xmlns:wpi="http://schemas.microsoft.com/office/word/2010/wordprocessingInk" xmlns:wne="http://schemas.microsoft.com/office/word/2006/wordml" xmlns:wps="http://schemas.microsoft.com/office/word/2010/wordprocessingShape" mc:Ignorable="w14 w15 w16se wp14">
+<w:document xmlns:wpc="http://schemas.microsoft.com/office/word/2010/wordprocessingCanvas" xmlns:cx="http://schemas.microsoft.com/office/drawing/2014/chartex" xmlns:cx1="http://schemas.microsoft.com/office/drawing/2015/9/8/chartex" xmlns:cx2="http://schemas.microsoft.com/office/drawing/2015/10/21/chartex" xmlns:cx3="http://schemas.microsoft.com/office/drawing/2016/5/9/chartex" xmlns:cx4="http://schemas.microsoft.com/office/drawing/2016/5/10/chartex" xmlns:cx5="http://schemas.microsoft.com/office/drawing/2016/5/11/chartex" xmlns:cx6="http://schemas.microsoft.com/office/drawing/2016/5/12/chartex" xmlns:cx7="http://schemas.microsoft.com/office/drawing/2016/5/13/chartex" xmlns:cx8="http://schemas.microsoft.com/office/drawing/2016/5/14/chartex" xmlns:mc="http://schemas.openxmlformats.org/markup-compatibility/2006" xmlns:aink="http://schemas.microsoft.com/office/drawing/2016/ink" xmlns:am3d="http://schemas.microsoft.com/office/drawing/2017/model3d" xmlns:o="urn:schemas-microsoft-com:office:office" xmlns:oel="http://schemas.microsoft.com/office/2019/extlst" xmlns:r="http://schemas.openxmlformats.org/officeDocument/2006/relationships" xmlns:m="http://schemas.openxmlformats.org/officeDocument/2006/math" xmlns:v="urn:schemas-microsoft-com:vml" xmlns:wp14="http://schemas.microsoft.com/office/word/2010/wordprocessingDrawing" xmlns:wp="http://schemas.openxmlformats.org/drawingml/2006/wordprocessingDrawing" xmlns:w10="urn:schemas-microsoft-com:office:word" xmlns:w="http://schemas.openxmlformats.org/wordprocessingml/2006/main" xmlns:w14="http://schemas.microsoft.com/office/word/2010/wordml" xmlns:w15="http://schemas.microsoft.com/office/word/2012/wordml" xmlns:w16cex="http://schemas.microsoft.com/office/word/2018/wordml/cex" xmlns:w16cid="http://schemas.microsoft.com/office/word/2016/wordml/cid" xmlns:w16="http://schemas.microsoft.com/office/word/2018/wordml" xmlns:w16du="http://schemas.microsoft.com/office/word/2023/wordml/word16du" xmlns:w16sdtdh="http://schemas.microsoft.com/office/word/2020/wordml/sdtdatahash" xmlns:w16sdtfl="http://schemas.microsoft.com/office/word/2024/wordml/sdtformatlock" xmlns:w16se="http://schemas.microsoft.com/office/word/2015/wordml/symex" xmlns:wpg="http://schemas.microsoft.com/office/word/2010/wordprocessingGroup" xmlns:wpi="http://schemas.microsoft.com/office/word/2010/wordprocessingInk" xmlns:wne="http://schemas.microsoft.com/office/word/2006/wordml" xmlns:wps="http://schemas.microsoft.com/office/word/2010/wordprocessingShape" mc:Ignorable="w14 w15 w16se w16cid w16 w16cex w16sdtdh w16sdtfl w16du wp14">
   <w:body>
     <w:p>
       <w:pPr>
@@ -491,6 +491,7 @@
         <w:rPr>
           <w:rFonts w:ascii="Candara" w:hAnsi="Candara"/>
         </w:rPr>
+        <w:lastRenderedPageBreak/>
         <w:t>Tipo de caminhão escolhido.</w:t>
       </w:r>
     </w:p>
@@ -2292,6 +2293,7 @@
                 <w:b/>
                 <w:bCs/>
               </w:rPr>
+              <w:lastRenderedPageBreak/>
               <w:t>Categoria</w:t>
             </w:r>
           </w:p>
@@ -2475,21 +2477,7 @@
               <w:rPr>
                 <w:rFonts w:ascii="Candara" w:hAnsi="Candara"/>
               </w:rPr>
-              <w:t xml:space="preserve">Carros de passeio, </w:t>
-            </w:r>
-            <w:proofErr w:type="spellStart"/>
-            <w:r>
-              <w:rPr>
-                <w:rFonts w:ascii="Candara" w:hAnsi="Candara"/>
-              </w:rPr>
-              <w:t>SUVs</w:t>
-            </w:r>
-            <w:proofErr w:type="spellEnd"/>
-            <w:r>
-              <w:rPr>
-                <w:rFonts w:ascii="Candara" w:hAnsi="Candara"/>
-              </w:rPr>
-              <w:t>, picapes e vans comuns.</w:t>
+              <w:t>Carros de passeio, SUVs, picapes e vans comuns.</w:t>
             </w:r>
           </w:p>
         </w:tc>
@@ -2605,21 +2593,7 @@
               <w:rPr>
                 <w:rFonts w:ascii="Candara" w:hAnsi="Candara"/>
               </w:rPr>
-              <w:t>Caminhões rígidos, caminhonetes grandes (</w:t>
-            </w:r>
-            <w:proofErr w:type="spellStart"/>
-            <w:r>
-              <w:rPr>
-                <w:rFonts w:ascii="Candara" w:hAnsi="Candara"/>
-              </w:rPr>
-              <w:t>ex</w:t>
-            </w:r>
-            <w:proofErr w:type="spellEnd"/>
-            <w:r>
-              <w:rPr>
-                <w:rFonts w:ascii="Candara" w:hAnsi="Candara"/>
-              </w:rPr>
-              <w:t>: RAM 2500) e vans de carga.</w:t>
+              <w:t>Caminhões rígidos, caminhonetes grandes (ex: RAM 2500) e vans de carga.</w:t>
             </w:r>
           </w:p>
         </w:tc>
@@ -2787,21 +2761,7 @@
               <w:rPr>
                 <w:rFonts w:ascii="Candara" w:hAnsi="Candara"/>
               </w:rPr>
-              <w:t xml:space="preserve">Veículos articulados, carretas, </w:t>
-            </w:r>
-            <w:proofErr w:type="spellStart"/>
-            <w:r>
-              <w:rPr>
-                <w:rFonts w:ascii="Candara" w:hAnsi="Candara"/>
-              </w:rPr>
-              <w:t>bitrens</w:t>
-            </w:r>
-            <w:proofErr w:type="spellEnd"/>
-            <w:r>
-              <w:rPr>
-                <w:rFonts w:ascii="Candara" w:hAnsi="Candara"/>
-              </w:rPr>
-              <w:t xml:space="preserve"> e trailers pesados.</w:t>
+              <w:t>Veículos articulados, carretas, bitrens e trailers pesados.</w:t>
             </w:r>
           </w:p>
         </w:tc>
@@ -2881,16 +2841,8 @@
         <w:rPr>
           <w:rFonts w:ascii="Candara" w:hAnsi="Candara"/>
         </w:rPr>
-        <w:t xml:space="preserve">Criar tela inicial com 3 </w:t>
-      </w:r>
-      <w:proofErr w:type="spellStart"/>
-      <w:r>
-        <w:rPr>
-          <w:rFonts w:ascii="Candara" w:hAnsi="Candara"/>
-        </w:rPr>
-        <w:t>botoes</w:t>
-      </w:r>
-      <w:proofErr w:type="spellEnd"/>
+        <w:t>Criar tela inicial com 3 botoes</w:t>
+      </w:r>
     </w:p>
     <w:p>
       <w:pPr>
@@ -2981,7 +2933,6 @@
         <w:t xml:space="preserve">Criar o método para </w:t>
       </w:r>
       <w:commentRangeStart w:id="1"/>
-      <w:proofErr w:type="spellStart"/>
       <w:r>
         <w:rPr>
           <w:rFonts w:ascii="Candara" w:hAnsi="Candara"/>
@@ -2989,7 +2940,6 @@
         <w:t>buscacep</w:t>
       </w:r>
       <w:commentRangeEnd w:id="1"/>
-      <w:proofErr w:type="spellEnd"/>
       <w:r>
         <w:rPr>
           <w:rStyle w:val="Refdecomentrio"/>
@@ -3040,6 +2990,9 @@
       <w:r>
         <w:rPr>
           <w:rStyle w:val="Refdecomentrio"/>
+          <w:rFonts w:ascii="Candara" w:hAnsi="Candara"/>
+          <w:sz w:val="24"/>
+          <w:szCs w:val="24"/>
         </w:rPr>
         <w:commentReference w:id="2"/>
       </w:r>
@@ -3066,11 +3019,99 @@
       <w:r>
         <w:rPr>
           <w:rStyle w:val="Refdecomentrio"/>
+          <w:sz w:val="24"/>
+          <w:szCs w:val="24"/>
         </w:rPr>
         <w:commentReference w:id="3"/>
       </w:r>
       <w:r>
         <w:t xml:space="preserve"> o Componente na Tela (Design)</w:t>
+      </w:r>
+    </w:p>
+    <w:p>
+      <w:pPr>
+        <w:pStyle w:val="PargrafodaLista"/>
+        <w:numPr>
+          <w:ilvl w:val="0"/>
+          <w:numId w:val="27"/>
+        </w:numPr>
+        <w:rPr>
+          <w:rFonts w:ascii="Candara" w:hAnsi="Candara"/>
+        </w:rPr>
+      </w:pPr>
+      <w:r>
+        <w:t xml:space="preserve">Com a quilometragem criar o calculo de orçamento  – </w:t>
+      </w:r>
+      <w:r>
+        <w:t>txtKm</w:t>
+      </w:r>
+      <w:r>
+        <w:t>,</w:t>
+      </w:r>
+      <w:r>
+        <w:t xml:space="preserve"> Txt_valordanf</w:t>
+      </w:r>
+      <w:r>
+        <w:t>,</w:t>
+      </w:r>
+      <w:r>
+        <w:t xml:space="preserve"> txt_volumes</w:t>
+      </w:r>
+    </w:p>
+    <w:p>
+      <w:pPr>
+        <w:rPr>
+          <w:rFonts w:ascii="Candara" w:hAnsi="Candara"/>
+        </w:rPr>
+      </w:pPr>
+    </w:p>
+    <w:p>
+      <w:pPr>
+        <w:rPr>
+          <w:rFonts w:ascii="Candara" w:hAnsi="Candara"/>
+        </w:rPr>
+      </w:pPr>
+    </w:p>
+    <w:p>
+      <w:pPr>
+        <w:rPr>
+          <w:rFonts w:ascii="Candara" w:hAnsi="Candara"/>
+        </w:rPr>
+      </w:pPr>
+    </w:p>
+    <w:p>
+      <w:pPr>
+        <w:pStyle w:val="ateno"/>
+      </w:pPr>
+      <w:r>
+        <w:t>Cálculo de cubagem</w:t>
+      </w:r>
+    </w:p>
+    <w:p>
+      <w:pPr>
+        <w:rPr>
+          <w:rFonts w:asciiTheme="majorHAnsi" w:eastAsiaTheme="majorEastAsia" w:hAnsiTheme="majorHAnsi" w:cstheme="majorBidi"/>
+          <w:b/>
+          <w:color w:val="000000" w:themeColor="text1"/>
+          <w:sz w:val="26"/>
+          <w:szCs w:val="26"/>
+        </w:rPr>
+      </w:pPr>
+    </w:p>
+    <w:p>
+      <w:pPr>
+        <w:ind w:firstLine="708"/>
+      </w:pPr>
+      <w:r>
+        <w:t>Altura X largura X comprimento / 300 = cubagem de peso</w:t>
+      </w:r>
+    </w:p>
+    <w:p>
+      <w:pPr>
+        <w:ind w:firstLine="708"/>
+      </w:pPr>
+      <w:r>
+        <w:t>Cubagem de peso X taxa de serviço 0,60 ( + 1,00 por km rodado )</w:t>
       </w:r>
     </w:p>
     <w:sectPr>
@@ -3084,7 +3125,7 @@
 </file>
 
 <file path=word/comments.xml><?xml version="1.0" encoding="utf-8"?>
-<w:comments xmlns:wpc="http://schemas.microsoft.com/office/word/2010/wordprocessingCanvas" xmlns:cx="http://schemas.microsoft.com/office/drawing/2014/chartex" xmlns:cx1="http://schemas.microsoft.com/office/drawing/2015/9/8/chartex" xmlns:mc="http://schemas.openxmlformats.org/markup-compatibility/2006" xmlns:o="urn:schemas-microsoft-com:office:office" xmlns:r="http://schemas.openxmlformats.org/officeDocument/2006/relationships" xmlns:m="http://schemas.openxmlformats.org/officeDocument/2006/math" xmlns:v="urn:schemas-microsoft-com:vml" xmlns:wp14="http://schemas.microsoft.com/office/word/2010/wordprocessingDrawing" xmlns:wp="http://schemas.openxmlformats.org/drawingml/2006/wordprocessingDrawing" xmlns:w10="urn:schemas-microsoft-com:office:word" xmlns:w="http://schemas.openxmlformats.org/wordprocessingml/2006/main" xmlns:w14="http://schemas.microsoft.com/office/word/2010/wordml" xmlns:w15="http://schemas.microsoft.com/office/word/2012/wordml" xmlns:w16se="http://schemas.microsoft.com/office/word/2015/wordml/symex" xmlns:wpg="http://schemas.microsoft.com/office/word/2010/wordprocessingGroup" xmlns:wpi="http://schemas.microsoft.com/office/word/2010/wordprocessingInk" xmlns:wne="http://schemas.microsoft.com/office/word/2006/wordml" xmlns:wps="http://schemas.microsoft.com/office/word/2010/wordprocessingShape" mc:Ignorable="w14 w15 w16se wp14">
+<w:comments xmlns:wpc="http://schemas.microsoft.com/office/word/2010/wordprocessingCanvas" xmlns:cx="http://schemas.microsoft.com/office/drawing/2014/chartex" xmlns:cx1="http://schemas.microsoft.com/office/drawing/2015/9/8/chartex" xmlns:cx2="http://schemas.microsoft.com/office/drawing/2015/10/21/chartex" xmlns:cx3="http://schemas.microsoft.com/office/drawing/2016/5/9/chartex" xmlns:cx4="http://schemas.microsoft.com/office/drawing/2016/5/10/chartex" xmlns:cx5="http://schemas.microsoft.com/office/drawing/2016/5/11/chartex" xmlns:cx6="http://schemas.microsoft.com/office/drawing/2016/5/12/chartex" xmlns:cx7="http://schemas.microsoft.com/office/drawing/2016/5/13/chartex" xmlns:cx8="http://schemas.microsoft.com/office/drawing/2016/5/14/chartex" xmlns:mc="http://schemas.openxmlformats.org/markup-compatibility/2006" xmlns:aink="http://schemas.microsoft.com/office/drawing/2016/ink" xmlns:am3d="http://schemas.microsoft.com/office/drawing/2017/model3d" xmlns:o="urn:schemas-microsoft-com:office:office" xmlns:oel="http://schemas.microsoft.com/office/2019/extlst" xmlns:r="http://schemas.openxmlformats.org/officeDocument/2006/relationships" xmlns:m="http://schemas.openxmlformats.org/officeDocument/2006/math" xmlns:v="urn:schemas-microsoft-com:vml" xmlns:wp14="http://schemas.microsoft.com/office/word/2010/wordprocessingDrawing" xmlns:wp="http://schemas.openxmlformats.org/drawingml/2006/wordprocessingDrawing" xmlns:w10="urn:schemas-microsoft-com:office:word" xmlns:w="http://schemas.openxmlformats.org/wordprocessingml/2006/main" xmlns:w14="http://schemas.microsoft.com/office/word/2010/wordml" xmlns:w15="http://schemas.microsoft.com/office/word/2012/wordml" xmlns:w16cex="http://schemas.microsoft.com/office/word/2018/wordml/cex" xmlns:w16cid="http://schemas.microsoft.com/office/word/2016/wordml/cid" xmlns:w16="http://schemas.microsoft.com/office/word/2018/wordml" xmlns:w16du="http://schemas.microsoft.com/office/word/2023/wordml/word16du" xmlns:w16sdtdh="http://schemas.microsoft.com/office/word/2020/wordml/sdtdatahash" xmlns:w16sdtfl="http://schemas.microsoft.com/office/word/2024/wordml/sdtformatlock" xmlns:w16se="http://schemas.microsoft.com/office/word/2015/wordml/symex" xmlns:wpg="http://schemas.microsoft.com/office/word/2010/wordprocessingGroup" xmlns:wpi="http://schemas.microsoft.com/office/word/2010/wordprocessingInk" xmlns:wne="http://schemas.microsoft.com/office/word/2006/wordml" xmlns:wps="http://schemas.microsoft.com/office/word/2010/wordprocessingShape" mc:Ignorable="w14 w15 w16se w16cid w16 w16cex w16sdtdh w16sdtfl w16du wp14">
   <w:comment w:id="0" w:author="DB" w:date="2026-09-28T08:49:00Z" w:initials="D">
     <w:p>
       <w:pPr>
@@ -3096,7 +3137,6 @@
         </w:rPr>
         <w:annotationRef/>
       </w:r>
-      <w:proofErr w:type="gramStart"/>
       <w:r>
         <w:rPr>
           <w:rFonts w:hAnsi="Symbol"/>
@@ -3111,15 +3151,7 @@
           <w:b/>
           <w:bCs/>
         </w:rPr>
-        <w:t>Abra</w:t>
-      </w:r>
-      <w:proofErr w:type="gramEnd"/>
-      <w:r>
-        <w:rPr>
-          <w:b/>
-          <w:bCs/>
-        </w:rPr>
-        <w:t xml:space="preserve"> o seu formulário</w:t>
+        <w:t>Abra o seu formulário</w:t>
       </w:r>
       <w:r>
         <w:t xml:space="preserve"> (</w:t>
@@ -3146,7 +3178,6 @@
           <w14:ligatures w14:val="none"/>
         </w:rPr>
       </w:pPr>
-      <w:proofErr w:type="gramStart"/>
       <w:r>
         <w:rPr>
           <w:rFonts w:ascii="Times New Roman" w:eastAsia="Times New Roman" w:hAnsi="Symbol" w:cs="Times New Roman"/>
@@ -3174,9 +3205,66 @@
           <w:lang w:eastAsia="pt-BR"/>
           <w14:ligatures w14:val="none"/>
         </w:rPr>
-        <w:t>Clique</w:t>
-      </w:r>
-      <w:proofErr w:type="gramEnd"/>
+        <w:t>Clique na primeira imagem</w:t>
+      </w:r>
+      <w:r>
+        <w:rPr>
+          <w:rFonts w:ascii="Times New Roman" w:eastAsia="Times New Roman" w:hAnsi="Times New Roman" w:cs="Times New Roman"/>
+          <w:kern w:val="0"/>
+          <w:lang w:eastAsia="pt-BR"/>
+          <w14:ligatures w14:val="none"/>
+        </w:rPr>
+        <w:t xml:space="preserve"> (</w:t>
+      </w:r>
+      <w:r>
+        <w:rPr>
+          <w:rFonts w:ascii="Courier New" w:eastAsia="Times New Roman" w:hAnsi="Courier New" w:cs="Courier New"/>
+          <w:kern w:val="0"/>
+          <w:sz w:val="20"/>
+          <w:szCs w:val="20"/>
+          <w:lang w:eastAsia="pt-BR"/>
+          <w14:ligatures w14:val="none"/>
+        </w:rPr>
+        <w:t>PictureBox</w:t>
+      </w:r>
+      <w:r>
+        <w:rPr>
+          <w:rFonts w:ascii="Times New Roman" w:eastAsia="Times New Roman" w:hAnsi="Times New Roman" w:cs="Times New Roman"/>
+          <w:kern w:val="0"/>
+          <w:lang w:eastAsia="pt-BR"/>
+          <w14:ligatures w14:val="none"/>
+        </w:rPr>
+        <w:t>) que deseja transformar em botão.</w:t>
+      </w:r>
+    </w:p>
+    <w:p>
+      <w:pPr>
+        <w:spacing w:before="100" w:beforeAutospacing="1" w:after="100" w:afterAutospacing="1" w:line="240" w:lineRule="auto"/>
+        <w:rPr>
+          <w:rFonts w:ascii="Times New Roman" w:eastAsia="Times New Roman" w:hAnsi="Times New Roman" w:cs="Times New Roman"/>
+          <w:kern w:val="0"/>
+          <w:lang w:eastAsia="pt-BR"/>
+          <w14:ligatures w14:val="none"/>
+        </w:rPr>
+      </w:pPr>
+      <w:r>
+        <w:rPr>
+          <w:rFonts w:ascii="Times New Roman" w:eastAsia="Times New Roman" w:hAnsi="Symbol" w:cs="Times New Roman"/>
+          <w:kern w:val="0"/>
+          <w:lang w:eastAsia="pt-BR"/>
+          <w14:ligatures w14:val="none"/>
+        </w:rPr>
+        <w:t></w:t>
+      </w:r>
+      <w:r>
+        <w:rPr>
+          <w:rFonts w:ascii="Times New Roman" w:eastAsia="Times New Roman" w:hAnsi="Times New Roman" w:cs="Times New Roman"/>
+          <w:kern w:val="0"/>
+          <w:lang w:eastAsia="pt-BR"/>
+          <w14:ligatures w14:val="none"/>
+        </w:rPr>
+        <w:t xml:space="preserve">  Vá até a janela </w:t>
+      </w:r>
       <w:r>
         <w:rPr>
           <w:rFonts w:ascii="Times New Roman" w:eastAsia="Times New Roman" w:hAnsi="Times New Roman" w:cs="Times New Roman"/>
@@ -3186,7 +3274,7 @@
           <w:lang w:eastAsia="pt-BR"/>
           <w14:ligatures w14:val="none"/>
         </w:rPr>
-        <w:t xml:space="preserve"> na primeira imagem</w:t>
+        <w:t>Propriedades</w:t>
       </w:r>
       <w:r>
         <w:rPr>
@@ -3195,69 +3283,7 @@
           <w:lang w:eastAsia="pt-BR"/>
           <w14:ligatures w14:val="none"/>
         </w:rPr>
-        <w:t xml:space="preserve"> (</w:t>
-      </w:r>
-      <w:proofErr w:type="spellStart"/>
-      <w:r>
-        <w:rPr>
-          <w:rFonts w:ascii="Courier New" w:eastAsia="Times New Roman" w:hAnsi="Courier New" w:cs="Courier New"/>
-          <w:kern w:val="0"/>
-          <w:sz w:val="20"/>
-          <w:szCs w:val="20"/>
-          <w:lang w:eastAsia="pt-BR"/>
-          <w14:ligatures w14:val="none"/>
-        </w:rPr>
-        <w:t>PictureBox</w:t>
-      </w:r>
-      <w:proofErr w:type="spellEnd"/>
-      <w:r>
-        <w:rPr>
-          <w:rFonts w:ascii="Times New Roman" w:eastAsia="Times New Roman" w:hAnsi="Times New Roman" w:cs="Times New Roman"/>
-          <w:kern w:val="0"/>
-          <w:lang w:eastAsia="pt-BR"/>
-          <w14:ligatures w14:val="none"/>
-        </w:rPr>
-        <w:t>) que deseja transformar em botão.</w:t>
-      </w:r>
-    </w:p>
-    <w:p>
-      <w:pPr>
-        <w:spacing w:before="100" w:beforeAutospacing="1" w:after="100" w:afterAutospacing="1" w:line="240" w:lineRule="auto"/>
-        <w:rPr>
-          <w:rFonts w:ascii="Times New Roman" w:eastAsia="Times New Roman" w:hAnsi="Times New Roman" w:cs="Times New Roman"/>
-          <w:kern w:val="0"/>
-          <w:lang w:eastAsia="pt-BR"/>
-          <w14:ligatures w14:val="none"/>
-        </w:rPr>
-      </w:pPr>
-      <w:proofErr w:type="gramStart"/>
-      <w:r>
-        <w:rPr>
-          <w:rFonts w:ascii="Times New Roman" w:eastAsia="Times New Roman" w:hAnsi="Symbol" w:cs="Times New Roman"/>
-          <w:kern w:val="0"/>
-          <w:lang w:eastAsia="pt-BR"/>
-          <w14:ligatures w14:val="none"/>
-        </w:rPr>
-        <w:t></w:t>
-      </w:r>
-      <w:r>
-        <w:rPr>
-          <w:rFonts w:ascii="Times New Roman" w:eastAsia="Times New Roman" w:hAnsi="Times New Roman" w:cs="Times New Roman"/>
-          <w:kern w:val="0"/>
-          <w:lang w:eastAsia="pt-BR"/>
-          <w14:ligatures w14:val="none"/>
-        </w:rPr>
-        <w:t xml:space="preserve">  Vá</w:t>
-      </w:r>
-      <w:proofErr w:type="gramEnd"/>
-      <w:r>
-        <w:rPr>
-          <w:rFonts w:ascii="Times New Roman" w:eastAsia="Times New Roman" w:hAnsi="Times New Roman" w:cs="Times New Roman"/>
-          <w:kern w:val="0"/>
-          <w:lang w:eastAsia="pt-BR"/>
-          <w14:ligatures w14:val="none"/>
-        </w:rPr>
-        <w:t xml:space="preserve"> até a janela </w:t>
+        <w:t xml:space="preserve"> (geralmente fica no canto inferior direito). Caso não esteja aparecendo, aperte </w:t>
       </w:r>
       <w:r>
         <w:rPr>
@@ -3268,7 +3294,7 @@
           <w:lang w:eastAsia="pt-BR"/>
           <w14:ligatures w14:val="none"/>
         </w:rPr>
-        <w:t>Propriedades</w:t>
+        <w:t>F4</w:t>
       </w:r>
       <w:r>
         <w:rPr>
@@ -3277,7 +3303,36 @@
           <w:lang w:eastAsia="pt-BR"/>
           <w14:ligatures w14:val="none"/>
         </w:rPr>
-        <w:t xml:space="preserve"> (geralmente fica no canto inferior direito). Caso não esteja aparecendo, aperte </w:t>
+        <w:t>.</w:t>
+      </w:r>
+    </w:p>
+    <w:p>
+      <w:pPr>
+        <w:spacing w:before="100" w:beforeAutospacing="1" w:after="100" w:afterAutospacing="1" w:line="240" w:lineRule="auto"/>
+        <w:rPr>
+          <w:rFonts w:ascii="Times New Roman" w:eastAsia="Times New Roman" w:hAnsi="Times New Roman" w:cs="Times New Roman"/>
+          <w:kern w:val="0"/>
+          <w:lang w:eastAsia="pt-BR"/>
+          <w14:ligatures w14:val="none"/>
+        </w:rPr>
+      </w:pPr>
+      <w:r>
+        <w:rPr>
+          <w:rFonts w:ascii="Times New Roman" w:eastAsia="Times New Roman" w:hAnsi="Symbol" w:cs="Times New Roman"/>
+          <w:kern w:val="0"/>
+          <w:lang w:eastAsia="pt-BR"/>
+          <w14:ligatures w14:val="none"/>
+        </w:rPr>
+        <w:t></w:t>
+      </w:r>
+      <w:r>
+        <w:rPr>
+          <w:rFonts w:ascii="Times New Roman" w:eastAsia="Times New Roman" w:hAnsi="Times New Roman" w:cs="Times New Roman"/>
+          <w:kern w:val="0"/>
+          <w:lang w:eastAsia="pt-BR"/>
+          <w14:ligatures w14:val="none"/>
+        </w:rPr>
+        <w:t xml:space="preserve">  No topo da janela de Propriedades, clique no ícone de </w:t>
       </w:r>
       <w:r>
         <w:rPr>
@@ -3288,7 +3343,7 @@
           <w:lang w:eastAsia="pt-BR"/>
           <w14:ligatures w14:val="none"/>
         </w:rPr>
-        <w:t>F4</w:t>
+        <w:t>Raio (Eventos)</w:t>
       </w:r>
       <w:r>
         <w:rPr>
@@ -3297,7 +3352,7 @@
           <w:lang w:eastAsia="pt-BR"/>
           <w14:ligatures w14:val="none"/>
         </w:rPr>
-        <w:t>.</w:t>
+        <w:t xml:space="preserve"> para ver os eventos disponíveis.</w:t>
       </w:r>
     </w:p>
     <w:p>
@@ -3310,7 +3365,6 @@
           <w14:ligatures w14:val="none"/>
         </w:rPr>
       </w:pPr>
-      <w:proofErr w:type="gramStart"/>
       <w:r>
         <w:rPr>
           <w:rFonts w:ascii="Times New Roman" w:eastAsia="Times New Roman" w:hAnsi="Symbol" w:cs="Times New Roman"/>
@@ -3327,77 +3381,7 @@
           <w:lang w:eastAsia="pt-BR"/>
           <w14:ligatures w14:val="none"/>
         </w:rPr>
-        <w:t xml:space="preserve">  No</w:t>
-      </w:r>
-      <w:proofErr w:type="gramEnd"/>
-      <w:r>
-        <w:rPr>
-          <w:rFonts w:ascii="Times New Roman" w:eastAsia="Times New Roman" w:hAnsi="Times New Roman" w:cs="Times New Roman"/>
-          <w:kern w:val="0"/>
-          <w:lang w:eastAsia="pt-BR"/>
-          <w14:ligatures w14:val="none"/>
-        </w:rPr>
-        <w:t xml:space="preserve"> topo da janela de Propriedades, clique no ícone de </w:t>
-      </w:r>
-      <w:r>
-        <w:rPr>
-          <w:rFonts w:ascii="Times New Roman" w:eastAsia="Times New Roman" w:hAnsi="Times New Roman" w:cs="Times New Roman"/>
-          <w:b/>
-          <w:bCs/>
-          <w:kern w:val="0"/>
-          <w:lang w:eastAsia="pt-BR"/>
-          <w14:ligatures w14:val="none"/>
-        </w:rPr>
-        <w:t>Raio (Eventos)</w:t>
-      </w:r>
-      <w:r>
-        <w:rPr>
-          <w:rFonts w:ascii="Times New Roman" w:eastAsia="Times New Roman" w:hAnsi="Times New Roman" w:cs="Times New Roman"/>
-          <w:kern w:val="0"/>
-          <w:lang w:eastAsia="pt-BR"/>
-          <w14:ligatures w14:val="none"/>
-        </w:rPr>
-        <w:t xml:space="preserve"> para ver os eventos disponíveis.</w:t>
-      </w:r>
-    </w:p>
-    <w:p>
-      <w:pPr>
-        <w:spacing w:before="100" w:beforeAutospacing="1" w:after="100" w:afterAutospacing="1" w:line="240" w:lineRule="auto"/>
-        <w:rPr>
-          <w:rFonts w:ascii="Times New Roman" w:eastAsia="Times New Roman" w:hAnsi="Times New Roman" w:cs="Times New Roman"/>
-          <w:kern w:val="0"/>
-          <w:lang w:eastAsia="pt-BR"/>
-          <w14:ligatures w14:val="none"/>
-        </w:rPr>
-      </w:pPr>
-      <w:proofErr w:type="gramStart"/>
-      <w:r>
-        <w:rPr>
-          <w:rFonts w:ascii="Times New Roman" w:eastAsia="Times New Roman" w:hAnsi="Symbol" w:cs="Times New Roman"/>
-          <w:kern w:val="0"/>
-          <w:lang w:eastAsia="pt-BR"/>
-          <w14:ligatures w14:val="none"/>
-        </w:rPr>
-        <w:t></w:t>
-      </w:r>
-      <w:r>
-        <w:rPr>
-          <w:rFonts w:ascii="Times New Roman" w:eastAsia="Times New Roman" w:hAnsi="Times New Roman" w:cs="Times New Roman"/>
-          <w:kern w:val="0"/>
-          <w:lang w:eastAsia="pt-BR"/>
-          <w14:ligatures w14:val="none"/>
-        </w:rPr>
-        <w:t xml:space="preserve">  Procure</w:t>
-      </w:r>
-      <w:proofErr w:type="gramEnd"/>
-      <w:r>
-        <w:rPr>
-          <w:rFonts w:ascii="Times New Roman" w:eastAsia="Times New Roman" w:hAnsi="Times New Roman" w:cs="Times New Roman"/>
-          <w:kern w:val="0"/>
-          <w:lang w:eastAsia="pt-BR"/>
-          <w14:ligatures w14:val="none"/>
-        </w:rPr>
-        <w:t xml:space="preserve"> pelo evento </w:t>
+        <w:t xml:space="preserve">  Procure pelo evento </w:t>
       </w:r>
       <w:r>
         <w:rPr>
@@ -3432,7 +3416,6 @@
           <w14:ligatures w14:val="none"/>
         </w:rPr>
       </w:pPr>
-      <w:proofErr w:type="gramStart"/>
       <w:r>
         <w:rPr>
           <w:rFonts w:ascii="Times New Roman" w:eastAsia="Times New Roman" w:hAnsi="Symbol" w:cs="Times New Roman"/>
@@ -3449,17 +3432,7 @@
           <w:lang w:eastAsia="pt-BR"/>
           <w14:ligatures w14:val="none"/>
         </w:rPr>
-        <w:t xml:space="preserve">  Dê</w:t>
-      </w:r>
-      <w:proofErr w:type="gramEnd"/>
-      <w:r>
-        <w:rPr>
-          <w:rFonts w:ascii="Times New Roman" w:eastAsia="Times New Roman" w:hAnsi="Times New Roman" w:cs="Times New Roman"/>
-          <w:kern w:val="0"/>
-          <w:lang w:eastAsia="pt-BR"/>
-          <w14:ligatures w14:val="none"/>
-        </w:rPr>
-        <w:t xml:space="preserve"> um </w:t>
+        <w:t xml:space="preserve">  Dê um </w:t>
       </w:r>
       <w:r>
         <w:rPr>
@@ -3563,240 +3536,94 @@
         </w:rPr>
         <w:annotationRef/>
       </w:r>
-      <w:proofErr w:type="spellStart"/>
-      <w:proofErr w:type="gramStart"/>
-      <w:r>
-        <w:t>using</w:t>
-      </w:r>
-      <w:proofErr w:type="spellEnd"/>
-      <w:proofErr w:type="gramEnd"/>
-      <w:r>
-        <w:t xml:space="preserve"> System;</w:t>
-      </w:r>
-    </w:p>
-    <w:p>
-      <w:pPr>
-        <w:pStyle w:val="Textodecomentrio"/>
-      </w:pPr>
-      <w:proofErr w:type="spellStart"/>
-      <w:proofErr w:type="gramStart"/>
-      <w:r>
-        <w:t>using</w:t>
-      </w:r>
-      <w:proofErr w:type="spellEnd"/>
-      <w:proofErr w:type="gramEnd"/>
-      <w:r>
-        <w:t xml:space="preserve"> </w:t>
-      </w:r>
-      <w:proofErr w:type="spellStart"/>
-      <w:r>
-        <w:t>System.Collections.Generic</w:t>
-      </w:r>
-      <w:proofErr w:type="spellEnd"/>
-      <w:r>
-        <w:t>;</w:t>
-      </w:r>
-    </w:p>
-    <w:p>
-      <w:pPr>
-        <w:pStyle w:val="Textodecomentrio"/>
-      </w:pPr>
-      <w:proofErr w:type="spellStart"/>
-      <w:proofErr w:type="gramStart"/>
-      <w:r>
-        <w:t>using</w:t>
-      </w:r>
-      <w:proofErr w:type="spellEnd"/>
-      <w:proofErr w:type="gramEnd"/>
-      <w:r>
-        <w:t xml:space="preserve"> </w:t>
-      </w:r>
-      <w:proofErr w:type="spellStart"/>
-      <w:r>
-        <w:t>System.ComponentModel</w:t>
-      </w:r>
-      <w:proofErr w:type="spellEnd"/>
-      <w:r>
-        <w:t>;</w:t>
-      </w:r>
-    </w:p>
-    <w:p>
-      <w:pPr>
-        <w:pStyle w:val="Textodecomentrio"/>
-      </w:pPr>
-      <w:proofErr w:type="spellStart"/>
-      <w:proofErr w:type="gramStart"/>
-      <w:r>
-        <w:t>using</w:t>
-      </w:r>
-      <w:proofErr w:type="spellEnd"/>
-      <w:proofErr w:type="gramEnd"/>
-      <w:r>
-        <w:t xml:space="preserve"> </w:t>
-      </w:r>
-      <w:proofErr w:type="spellStart"/>
-      <w:r>
-        <w:t>System.Data</w:t>
-      </w:r>
-      <w:proofErr w:type="spellEnd"/>
-      <w:r>
-        <w:t>;</w:t>
-      </w:r>
-    </w:p>
-    <w:p>
-      <w:pPr>
-        <w:pStyle w:val="Textodecomentrio"/>
-      </w:pPr>
-      <w:proofErr w:type="spellStart"/>
-      <w:proofErr w:type="gramStart"/>
-      <w:r>
-        <w:t>using</w:t>
-      </w:r>
-      <w:proofErr w:type="spellEnd"/>
-      <w:proofErr w:type="gramEnd"/>
-      <w:r>
-        <w:t xml:space="preserve"> </w:t>
-      </w:r>
-      <w:proofErr w:type="spellStart"/>
-      <w:r>
-        <w:t>System.Drawing</w:t>
-      </w:r>
-      <w:proofErr w:type="spellEnd"/>
-      <w:r>
-        <w:t>;</w:t>
-      </w:r>
-    </w:p>
-    <w:p>
-      <w:pPr>
-        <w:pStyle w:val="Textodecomentrio"/>
-      </w:pPr>
-      <w:proofErr w:type="spellStart"/>
-      <w:proofErr w:type="gramStart"/>
-      <w:r>
-        <w:t>using</w:t>
-      </w:r>
-      <w:proofErr w:type="spellEnd"/>
-      <w:proofErr w:type="gramEnd"/>
-      <w:r>
-        <w:t xml:space="preserve"> </w:t>
-      </w:r>
-      <w:proofErr w:type="spellStart"/>
-      <w:r>
-        <w:t>System.Linq</w:t>
-      </w:r>
-      <w:proofErr w:type="spellEnd"/>
-      <w:r>
-        <w:t>;</w:t>
-      </w:r>
-    </w:p>
-    <w:p>
-      <w:pPr>
-        <w:pStyle w:val="Textodecomentrio"/>
-      </w:pPr>
-      <w:proofErr w:type="spellStart"/>
-      <w:proofErr w:type="gramStart"/>
-      <w:r>
-        <w:t>using</w:t>
-      </w:r>
-      <w:proofErr w:type="spellEnd"/>
-      <w:proofErr w:type="gramEnd"/>
-      <w:r>
-        <w:t xml:space="preserve"> System.Net;</w:t>
-      </w:r>
-    </w:p>
-    <w:p>
-      <w:pPr>
-        <w:pStyle w:val="Textodecomentrio"/>
-      </w:pPr>
-      <w:proofErr w:type="spellStart"/>
-      <w:proofErr w:type="gramStart"/>
-      <w:r>
-        <w:t>using</w:t>
-      </w:r>
-      <w:proofErr w:type="spellEnd"/>
-      <w:proofErr w:type="gramEnd"/>
-      <w:r>
-        <w:t xml:space="preserve"> </w:t>
-      </w:r>
-      <w:proofErr w:type="spellStart"/>
-      <w:r>
-        <w:t>System.Text</w:t>
-      </w:r>
-      <w:proofErr w:type="spellEnd"/>
-      <w:r>
-        <w:t>;</w:t>
-      </w:r>
-    </w:p>
-    <w:p>
-      <w:pPr>
-        <w:pStyle w:val="Textodecomentrio"/>
-      </w:pPr>
-      <w:proofErr w:type="spellStart"/>
-      <w:proofErr w:type="gramStart"/>
-      <w:r>
-        <w:t>using</w:t>
-      </w:r>
-      <w:proofErr w:type="spellEnd"/>
-      <w:proofErr w:type="gramEnd"/>
-      <w:r>
-        <w:t xml:space="preserve"> </w:t>
-      </w:r>
-      <w:proofErr w:type="spellStart"/>
-      <w:r>
-        <w:t>System.Threading.Tasks</w:t>
-      </w:r>
-      <w:proofErr w:type="spellEnd"/>
-      <w:r>
-        <w:t>;</w:t>
-      </w:r>
-    </w:p>
-    <w:p>
-      <w:pPr>
-        <w:pStyle w:val="Textodecomentrio"/>
-      </w:pPr>
-      <w:proofErr w:type="spellStart"/>
-      <w:proofErr w:type="gramStart"/>
-      <w:r>
-        <w:t>using</w:t>
-      </w:r>
-      <w:proofErr w:type="spellEnd"/>
-      <w:proofErr w:type="gramEnd"/>
-      <w:r>
-        <w:t xml:space="preserve"> </w:t>
-      </w:r>
-      <w:proofErr w:type="spellStart"/>
-      <w:r>
-        <w:t>System.Windows.Forms</w:t>
-      </w:r>
-      <w:proofErr w:type="spellEnd"/>
-      <w:r>
-        <w:t>;</w:t>
-      </w:r>
-    </w:p>
-    <w:p>
-      <w:pPr>
-        <w:pStyle w:val="Textodecomentrio"/>
-      </w:pPr>
-    </w:p>
-    <w:p>
-      <w:pPr>
-        <w:pStyle w:val="Textodecomentrio"/>
-      </w:pPr>
-      <w:proofErr w:type="spellStart"/>
-      <w:proofErr w:type="gramStart"/>
-      <w:r>
-        <w:t>namespace</w:t>
-      </w:r>
-      <w:proofErr w:type="spellEnd"/>
-      <w:proofErr w:type="gramEnd"/>
-      <w:r>
-        <w:t xml:space="preserve"> </w:t>
-      </w:r>
-      <w:proofErr w:type="spellStart"/>
-      <w:r>
-        <w:t>ProjetoLogistica</w:t>
-      </w:r>
-      <w:proofErr w:type="spellEnd"/>
+      <w:r>
+        <w:t>using System;</w:t>
+      </w:r>
+    </w:p>
+    <w:p>
+      <w:pPr>
+        <w:pStyle w:val="Textodecomentrio"/>
+      </w:pPr>
+      <w:r>
+        <w:t>using System.Collections.Generic;</w:t>
+      </w:r>
+    </w:p>
+    <w:p>
+      <w:pPr>
+        <w:pStyle w:val="Textodecomentrio"/>
+      </w:pPr>
+      <w:r>
+        <w:t>using System.ComponentModel;</w:t>
+      </w:r>
+    </w:p>
+    <w:p>
+      <w:pPr>
+        <w:pStyle w:val="Textodecomentrio"/>
+      </w:pPr>
+      <w:r>
+        <w:t>using System.Data;</w:t>
+      </w:r>
+    </w:p>
+    <w:p>
+      <w:pPr>
+        <w:pStyle w:val="Textodecomentrio"/>
+      </w:pPr>
+      <w:r>
+        <w:t>using System.Drawing;</w:t>
+      </w:r>
+    </w:p>
+    <w:p>
+      <w:pPr>
+        <w:pStyle w:val="Textodecomentrio"/>
+      </w:pPr>
+      <w:r>
+        <w:t>using System.Linq;</w:t>
+      </w:r>
+    </w:p>
+    <w:p>
+      <w:pPr>
+        <w:pStyle w:val="Textodecomentrio"/>
+      </w:pPr>
+      <w:r>
+        <w:t>using System.Net;</w:t>
+      </w:r>
+    </w:p>
+    <w:p>
+      <w:pPr>
+        <w:pStyle w:val="Textodecomentrio"/>
+      </w:pPr>
+      <w:r>
+        <w:t>using System.Text;</w:t>
+      </w:r>
+    </w:p>
+    <w:p>
+      <w:pPr>
+        <w:pStyle w:val="Textodecomentrio"/>
+      </w:pPr>
+      <w:r>
+        <w:t>using System.Threading.Tasks;</w:t>
+      </w:r>
+    </w:p>
+    <w:p>
+      <w:pPr>
+        <w:pStyle w:val="Textodecomentrio"/>
+      </w:pPr>
+      <w:r>
+        <w:t>using System.Windows.Forms;</w:t>
+      </w:r>
+    </w:p>
+    <w:p>
+      <w:pPr>
+        <w:pStyle w:val="Textodecomentrio"/>
+      </w:pPr>
+    </w:p>
+    <w:p>
+      <w:pPr>
+        <w:pStyle w:val="Textodecomentrio"/>
+      </w:pPr>
+      <w:r>
+        <w:t>namespace ProjetoLogistica</w:t>
+      </w:r>
     </w:p>
     <w:p>
       <w:pPr>
@@ -3811,47 +3638,8 @@
         <w:pStyle w:val="Textodecomentrio"/>
       </w:pPr>
       <w:r>
-        <w:t xml:space="preserve">    </w:t>
-      </w:r>
-      <w:proofErr w:type="spellStart"/>
-      <w:proofErr w:type="gramStart"/>
-      <w:r>
-        <w:t>public</w:t>
-      </w:r>
-      <w:proofErr w:type="spellEnd"/>
-      <w:proofErr w:type="gramEnd"/>
-      <w:r>
-        <w:t xml:space="preserve"> </w:t>
-      </w:r>
-      <w:proofErr w:type="spellStart"/>
-      <w:r>
-        <w:t>partial</w:t>
-      </w:r>
-      <w:proofErr w:type="spellEnd"/>
-      <w:r>
-        <w:t xml:space="preserve"> </w:t>
-      </w:r>
-      <w:proofErr w:type="spellStart"/>
-      <w:r>
-        <w:t>class</w:t>
-      </w:r>
-      <w:proofErr w:type="spellEnd"/>
-      <w:r>
-        <w:t xml:space="preserve"> </w:t>
-      </w:r>
-      <w:proofErr w:type="spellStart"/>
-      <w:r>
-        <w:t>Frm_orcamento</w:t>
-      </w:r>
-      <w:proofErr w:type="spellEnd"/>
-      <w:r>
-        <w:t xml:space="preserve"> : </w:t>
-      </w:r>
-      <w:proofErr w:type="spellStart"/>
-      <w:r>
-        <w:t>Form</w:t>
-      </w:r>
-      <w:proofErr w:type="spellEnd"/>
+        <w:t xml:space="preserve">    public partial class Frm_orcamento : Form</w:t>
+      </w:r>
     </w:p>
     <w:p>
       <w:pPr>
@@ -3866,25 +3654,7 @@
         <w:pStyle w:val="Textodecomentrio"/>
       </w:pPr>
       <w:r>
-        <w:t xml:space="preserve">        </w:t>
-      </w:r>
-      <w:proofErr w:type="spellStart"/>
-      <w:proofErr w:type="gramStart"/>
-      <w:r>
-        <w:t>public</w:t>
-      </w:r>
-      <w:proofErr w:type="spellEnd"/>
-      <w:proofErr w:type="gramEnd"/>
-      <w:r>
-        <w:t xml:space="preserve"> </w:t>
-      </w:r>
-      <w:proofErr w:type="spellStart"/>
-      <w:r>
-        <w:t>Frm_orcamento</w:t>
-      </w:r>
-      <w:proofErr w:type="spellEnd"/>
-      <w:r>
-        <w:t>()</w:t>
+        <w:t xml:space="preserve">        public Frm_orcamento()</w:t>
       </w:r>
     </w:p>
     <w:p>
@@ -3900,20 +3670,7 @@
         <w:pStyle w:val="Textodecomentrio"/>
       </w:pPr>
       <w:r>
-        <w:t xml:space="preserve">            </w:t>
-      </w:r>
-      <w:proofErr w:type="spellStart"/>
-      <w:proofErr w:type="gramStart"/>
-      <w:r>
-        <w:t>InitializeComponent</w:t>
-      </w:r>
-      <w:proofErr w:type="spellEnd"/>
-      <w:r>
-        <w:t>(</w:t>
-      </w:r>
-      <w:proofErr w:type="gramEnd"/>
-      <w:r>
-        <w:t>);</w:t>
+        <w:t xml:space="preserve">            InitializeComponent();</w:t>
       </w:r>
     </w:p>
     <w:p>
@@ -3958,57 +3715,7 @@
         <w:pStyle w:val="Textodecomentrio"/>
       </w:pPr>
       <w:r>
-        <w:t xml:space="preserve">        </w:t>
-      </w:r>
-      <w:proofErr w:type="spellStart"/>
-      <w:proofErr w:type="gramStart"/>
-      <w:r>
-        <w:t>private</w:t>
-      </w:r>
-      <w:proofErr w:type="spellEnd"/>
-      <w:proofErr w:type="gramEnd"/>
-      <w:r>
-        <w:t xml:space="preserve"> </w:t>
-      </w:r>
-      <w:proofErr w:type="spellStart"/>
-      <w:r>
-        <w:t>void</w:t>
-      </w:r>
-      <w:proofErr w:type="spellEnd"/>
-      <w:r>
-        <w:t xml:space="preserve"> </w:t>
-      </w:r>
-      <w:proofErr w:type="spellStart"/>
-      <w:r>
-        <w:t>txtCepOrigem_Leave</w:t>
-      </w:r>
-      <w:proofErr w:type="spellEnd"/>
-      <w:r>
-        <w:t>(</w:t>
-      </w:r>
-      <w:proofErr w:type="spellStart"/>
-      <w:r>
-        <w:t>object</w:t>
-      </w:r>
-      <w:proofErr w:type="spellEnd"/>
-      <w:r>
-        <w:t xml:space="preserve"> </w:t>
-      </w:r>
-      <w:proofErr w:type="spellStart"/>
-      <w:r>
-        <w:t>sender</w:t>
-      </w:r>
-      <w:proofErr w:type="spellEnd"/>
-      <w:r>
-        <w:t xml:space="preserve">, </w:t>
-      </w:r>
-      <w:proofErr w:type="spellStart"/>
-      <w:r>
-        <w:t>EventArgs</w:t>
-      </w:r>
-      <w:proofErr w:type="spellEnd"/>
-      <w:r>
-        <w:t xml:space="preserve"> e)</w:t>
+        <w:t xml:space="preserve">        private void txtCepOrigem_Leave(object sender, EventArgs e)</w:t>
       </w:r>
     </w:p>
     <w:p>
@@ -4024,72 +3731,20 @@
         <w:pStyle w:val="Textodecomentrio"/>
       </w:pPr>
       <w:r>
-        <w:t xml:space="preserve">            </w:t>
-      </w:r>
-      <w:proofErr w:type="spellStart"/>
-      <w:proofErr w:type="gramStart"/>
-      <w:r>
-        <w:t>string</w:t>
-      </w:r>
-      <w:proofErr w:type="spellEnd"/>
-      <w:proofErr w:type="gramEnd"/>
-      <w:r>
-        <w:t xml:space="preserve"> </w:t>
-      </w:r>
-      <w:proofErr w:type="spellStart"/>
-      <w:r>
-        <w:t>cep</w:t>
-      </w:r>
-      <w:proofErr w:type="spellEnd"/>
-      <w:r>
-        <w:t xml:space="preserve"> = </w:t>
-      </w:r>
-      <w:proofErr w:type="spellStart"/>
-      <w:r>
-        <w:t>txtCepOrigem.Text.Replace</w:t>
-      </w:r>
-      <w:proofErr w:type="spellEnd"/>
-      <w:r>
-        <w:t>("-", "").</w:t>
-      </w:r>
-      <w:proofErr w:type="spellStart"/>
-      <w:r>
-        <w:t>Trim</w:t>
-      </w:r>
-      <w:proofErr w:type="spellEnd"/>
-      <w:r>
-        <w:t>();</w:t>
-      </w:r>
-    </w:p>
-    <w:p>
-      <w:pPr>
-        <w:pStyle w:val="Textodecomentrio"/>
-      </w:pPr>
-    </w:p>
-    <w:p>
-      <w:pPr>
-        <w:pStyle w:val="Textodecomentrio"/>
-      </w:pPr>
-      <w:r>
-        <w:t xml:space="preserve">            </w:t>
-      </w:r>
-      <w:proofErr w:type="spellStart"/>
-      <w:proofErr w:type="gramStart"/>
-      <w:r>
-        <w:t>if</w:t>
-      </w:r>
-      <w:proofErr w:type="spellEnd"/>
-      <w:proofErr w:type="gramEnd"/>
-      <w:r>
-        <w:t xml:space="preserve"> (</w:t>
-      </w:r>
-      <w:proofErr w:type="spellStart"/>
-      <w:r>
-        <w:t>cep.Length</w:t>
-      </w:r>
-      <w:proofErr w:type="spellEnd"/>
-      <w:r>
-        <w:t xml:space="preserve"> == 8)</w:t>
+        <w:t xml:space="preserve">            string cep = txtCepOrigem.Text.Replace("-", "").Trim();</w:t>
+      </w:r>
+    </w:p>
+    <w:p>
+      <w:pPr>
+        <w:pStyle w:val="Textodecomentrio"/>
+      </w:pPr>
+    </w:p>
+    <w:p>
+      <w:pPr>
+        <w:pStyle w:val="Textodecomentrio"/>
+      </w:pPr>
+      <w:r>
+        <w:t xml:space="preserve">            if (cep.Length == 8)</w:t>
       </w:r>
     </w:p>
     <w:p>
@@ -4105,15 +3760,8 @@
         <w:pStyle w:val="Textodecomentrio"/>
       </w:pPr>
       <w:r>
-        <w:t xml:space="preserve">                </w:t>
-      </w:r>
-      <w:proofErr w:type="spellStart"/>
-      <w:proofErr w:type="gramStart"/>
-      <w:r>
-        <w:t>try</w:t>
-      </w:r>
-      <w:proofErr w:type="spellEnd"/>
-      <w:proofErr w:type="gramEnd"/>
+        <w:t xml:space="preserve">                try</w:t>
+      </w:r>
     </w:p>
     <w:p>
       <w:pPr>
@@ -4128,72 +3776,20 @@
         <w:pStyle w:val="Textodecomentrio"/>
       </w:pPr>
       <w:r>
-        <w:t xml:space="preserve">                    </w:t>
-      </w:r>
-      <w:proofErr w:type="spellStart"/>
-      <w:proofErr w:type="gramStart"/>
-      <w:r>
-        <w:t>string</w:t>
-      </w:r>
-      <w:proofErr w:type="spellEnd"/>
-      <w:proofErr w:type="gramEnd"/>
-      <w:r>
-        <w:t xml:space="preserve"> </w:t>
-      </w:r>
-      <w:proofErr w:type="spellStart"/>
-      <w:r>
-        <w:t>url</w:t>
-      </w:r>
-      <w:proofErr w:type="spellEnd"/>
-      <w:r>
-        <w:t xml:space="preserve"> = $"https://viacep.com.br/ws/{cep}/json/";</w:t>
-      </w:r>
-    </w:p>
-    <w:p>
-      <w:pPr>
-        <w:pStyle w:val="Textodecomentrio"/>
-      </w:pPr>
-    </w:p>
-    <w:p>
-      <w:pPr>
-        <w:pStyle w:val="Textodecomentrio"/>
-      </w:pPr>
-      <w:r>
-        <w:t xml:space="preserve">                    </w:t>
-      </w:r>
-      <w:proofErr w:type="spellStart"/>
-      <w:proofErr w:type="gramStart"/>
-      <w:r>
-        <w:t>using</w:t>
-      </w:r>
-      <w:proofErr w:type="spellEnd"/>
-      <w:proofErr w:type="gramEnd"/>
-      <w:r>
-        <w:t xml:space="preserve"> (</w:t>
-      </w:r>
-      <w:proofErr w:type="spellStart"/>
-      <w:r>
-        <w:t>WebClient</w:t>
-      </w:r>
-      <w:proofErr w:type="spellEnd"/>
-      <w:r>
-        <w:t xml:space="preserve"> </w:t>
-      </w:r>
-      <w:proofErr w:type="spellStart"/>
-      <w:r>
-        <w:t>client</w:t>
-      </w:r>
-      <w:proofErr w:type="spellEnd"/>
-      <w:r>
-        <w:t xml:space="preserve"> = new </w:t>
-      </w:r>
-      <w:proofErr w:type="spellStart"/>
-      <w:r>
-        <w:t>WebClient</w:t>
-      </w:r>
-      <w:proofErr w:type="spellEnd"/>
-      <w:r>
-        <w:t>())</w:t>
+        <w:t xml:space="preserve">                    string url = $"https://viacep.com.br/ws/{cep}/json/";</w:t>
+      </w:r>
+    </w:p>
+    <w:p>
+      <w:pPr>
+        <w:pStyle w:val="Textodecomentrio"/>
+      </w:pPr>
+    </w:p>
+    <w:p>
+      <w:pPr>
+        <w:pStyle w:val="Textodecomentrio"/>
+      </w:pPr>
+      <w:r>
+        <w:t xml:space="preserve">                    using (WebClient client = new WebClient())</w:t>
       </w:r>
     </w:p>
     <w:p>
@@ -4209,88 +3805,20 @@
         <w:pStyle w:val="Textodecomentrio"/>
       </w:pPr>
       <w:r>
-        <w:t xml:space="preserve">                        </w:t>
-      </w:r>
-      <w:proofErr w:type="spellStart"/>
-      <w:proofErr w:type="gramStart"/>
-      <w:r>
-        <w:t>string</w:t>
-      </w:r>
-      <w:proofErr w:type="spellEnd"/>
-      <w:proofErr w:type="gramEnd"/>
-      <w:r>
-        <w:t xml:space="preserve"> resposta = </w:t>
-      </w:r>
-      <w:proofErr w:type="spellStart"/>
-      <w:r>
-        <w:t>client.DownloadString</w:t>
-      </w:r>
-      <w:proofErr w:type="spellEnd"/>
-      <w:r>
-        <w:t>(</w:t>
-      </w:r>
-      <w:proofErr w:type="spellStart"/>
-      <w:r>
-        <w:t>url</w:t>
-      </w:r>
-      <w:proofErr w:type="spellEnd"/>
-      <w:r>
-        <w:t>);</w:t>
-      </w:r>
-    </w:p>
-    <w:p>
-      <w:pPr>
-        <w:pStyle w:val="Textodecomentrio"/>
-      </w:pPr>
-    </w:p>
-    <w:p>
-      <w:pPr>
-        <w:pStyle w:val="Textodecomentrio"/>
-      </w:pPr>
-      <w:r>
-        <w:t xml:space="preserve">                        </w:t>
-      </w:r>
-      <w:proofErr w:type="spellStart"/>
-      <w:proofErr w:type="gramStart"/>
-      <w:r>
-        <w:t>if</w:t>
-      </w:r>
-      <w:proofErr w:type="spellEnd"/>
-      <w:proofErr w:type="gramEnd"/>
-      <w:r>
-        <w:t xml:space="preserve"> (</w:t>
-      </w:r>
-      <w:proofErr w:type="spellStart"/>
-      <w:r>
-        <w:t>resposta.Contains</w:t>
-      </w:r>
-      <w:proofErr w:type="spellEnd"/>
-      <w:r>
-        <w:t>("\"erro\":</w:t>
-      </w:r>
-      <w:proofErr w:type="spellStart"/>
-      <w:r>
-        <w:t>true</w:t>
-      </w:r>
-      <w:proofErr w:type="spellEnd"/>
-      <w:r>
-        <w:t xml:space="preserve">") || </w:t>
-      </w:r>
-      <w:proofErr w:type="spellStart"/>
-      <w:r>
-        <w:t>resposta.Contains</w:t>
-      </w:r>
-      <w:proofErr w:type="spellEnd"/>
-      <w:r>
-        <w:t xml:space="preserve">("\"erro\": </w:t>
-      </w:r>
-      <w:proofErr w:type="spellStart"/>
-      <w:r>
-        <w:t>true</w:t>
-      </w:r>
-      <w:proofErr w:type="spellEnd"/>
-      <w:r>
-        <w:t>"))</w:t>
+        <w:t xml:space="preserve">                        string resposta = client.DownloadString(url);</w:t>
+      </w:r>
+    </w:p>
+    <w:p>
+      <w:pPr>
+        <w:pStyle w:val="Textodecomentrio"/>
+      </w:pPr>
+    </w:p>
+    <w:p>
+      <w:pPr>
+        <w:pStyle w:val="Textodecomentrio"/>
+      </w:pPr>
+      <w:r>
+        <w:t xml:space="preserve">                        if (resposta.Contains("\"erro\":true") || resposta.Contains("\"erro\": true"))</w:t>
       </w:r>
     </w:p>
     <w:p>
@@ -4306,49 +3834,15 @@
         <w:pStyle w:val="Textodecomentrio"/>
       </w:pPr>
       <w:r>
-        <w:t xml:space="preserve">                            </w:t>
-      </w:r>
-      <w:proofErr w:type="spellStart"/>
-      <w:r>
-        <w:t>MessageBox.Show</w:t>
-      </w:r>
-      <w:proofErr w:type="spellEnd"/>
-      <w:r>
-        <w:t xml:space="preserve">("CEP de Origem não encontrado!", "Erro", </w:t>
-      </w:r>
-      <w:proofErr w:type="spellStart"/>
-      <w:r>
-        <w:t>MessageBoxButtons.OK</w:t>
-      </w:r>
-      <w:proofErr w:type="spellEnd"/>
-      <w:r>
-        <w:t xml:space="preserve">, </w:t>
-      </w:r>
-      <w:proofErr w:type="spellStart"/>
-      <w:r>
-        <w:t>MessageBoxIcon.Error</w:t>
-      </w:r>
-      <w:proofErr w:type="spellEnd"/>
-      <w:r>
-        <w:t>);</w:t>
-      </w:r>
-    </w:p>
-    <w:p>
-      <w:pPr>
-        <w:pStyle w:val="Textodecomentrio"/>
-      </w:pPr>
-      <w:r>
-        <w:t xml:space="preserve">                            </w:t>
-      </w:r>
-      <w:proofErr w:type="spellStart"/>
-      <w:proofErr w:type="gramStart"/>
-      <w:r>
-        <w:t>return</w:t>
-      </w:r>
-      <w:proofErr w:type="spellEnd"/>
-      <w:proofErr w:type="gramEnd"/>
-      <w:r>
-        <w:t>;</w:t>
+        <w:t xml:space="preserve">                            MessageBox.Show("CEP de Origem não encontrado!", "Erro", MessageBoxButtons.OK, MessageBoxIcon.Error);</w:t>
+      </w:r>
+    </w:p>
+    <w:p>
+      <w:pPr>
+        <w:pStyle w:val="Textodecomentrio"/>
+      </w:pPr>
+      <w:r>
+        <w:t xml:space="preserve">                            return;</w:t>
       </w:r>
     </w:p>
     <w:p>
@@ -4369,103 +3863,31 @@
         <w:pStyle w:val="Textodecomentrio"/>
       </w:pPr>
       <w:r>
-        <w:t xml:space="preserve">                        </w:t>
-      </w:r>
-      <w:proofErr w:type="spellStart"/>
-      <w:proofErr w:type="gramStart"/>
-      <w:r>
-        <w:t>string</w:t>
-      </w:r>
-      <w:proofErr w:type="spellEnd"/>
-      <w:proofErr w:type="gramEnd"/>
-      <w:r>
-        <w:t xml:space="preserve"> logradouro = </w:t>
-      </w:r>
-      <w:proofErr w:type="spellStart"/>
-      <w:r>
-        <w:t>ExtrairValorJson</w:t>
-      </w:r>
-      <w:proofErr w:type="spellEnd"/>
-      <w:r>
-        <w:t>(resposta, "logradouro");</w:t>
-      </w:r>
-    </w:p>
-    <w:p>
-      <w:pPr>
-        <w:pStyle w:val="Textodecomentrio"/>
-      </w:pPr>
-      <w:r>
-        <w:t xml:space="preserve">                        </w:t>
-      </w:r>
-      <w:proofErr w:type="spellStart"/>
-      <w:proofErr w:type="gramStart"/>
-      <w:r>
-        <w:t>string</w:t>
-      </w:r>
-      <w:proofErr w:type="spellEnd"/>
-      <w:proofErr w:type="gramEnd"/>
-      <w:r>
-        <w:t xml:space="preserve"> bairro = </w:t>
-      </w:r>
-      <w:proofErr w:type="spellStart"/>
-      <w:r>
-        <w:t>ExtrairValorJson</w:t>
-      </w:r>
-      <w:proofErr w:type="spellEnd"/>
-      <w:r>
-        <w:t>(resposta, "bairro");</w:t>
-      </w:r>
-    </w:p>
-    <w:p>
-      <w:pPr>
-        <w:pStyle w:val="Textodecomentrio"/>
-      </w:pPr>
-      <w:r>
-        <w:t xml:space="preserve">                        </w:t>
-      </w:r>
-      <w:proofErr w:type="spellStart"/>
-      <w:proofErr w:type="gramStart"/>
-      <w:r>
-        <w:t>string</w:t>
-      </w:r>
-      <w:proofErr w:type="spellEnd"/>
-      <w:proofErr w:type="gramEnd"/>
-      <w:r>
-        <w:t xml:space="preserve"> cidade = </w:t>
-      </w:r>
-      <w:proofErr w:type="spellStart"/>
-      <w:r>
-        <w:t>ExtrairValorJson</w:t>
-      </w:r>
-      <w:proofErr w:type="spellEnd"/>
-      <w:r>
-        <w:t>(resposta, "localidade");</w:t>
-      </w:r>
-    </w:p>
-    <w:p>
-      <w:pPr>
-        <w:pStyle w:val="Textodecomentrio"/>
-      </w:pPr>
-      <w:r>
-        <w:t xml:space="preserve">                        </w:t>
-      </w:r>
-      <w:proofErr w:type="spellStart"/>
-      <w:proofErr w:type="gramStart"/>
-      <w:r>
-        <w:t>string</w:t>
-      </w:r>
-      <w:proofErr w:type="spellEnd"/>
-      <w:proofErr w:type="gramEnd"/>
-      <w:r>
-        <w:t xml:space="preserve"> uf = </w:t>
-      </w:r>
-      <w:proofErr w:type="spellStart"/>
-      <w:r>
-        <w:t>ExtrairValorJson</w:t>
-      </w:r>
-      <w:proofErr w:type="spellEnd"/>
-      <w:r>
-        <w:t>(resposta, "uf");</w:t>
+        <w:t xml:space="preserve">                        string logradouro = ExtrairValorJson(resposta, "logradouro");</w:t>
+      </w:r>
+    </w:p>
+    <w:p>
+      <w:pPr>
+        <w:pStyle w:val="Textodecomentrio"/>
+      </w:pPr>
+      <w:r>
+        <w:t xml:space="preserve">                        string bairro = ExtrairValorJson(resposta, "bairro");</w:t>
+      </w:r>
+    </w:p>
+    <w:p>
+      <w:pPr>
+        <w:pStyle w:val="Textodecomentrio"/>
+      </w:pPr>
+      <w:r>
+        <w:t xml:space="preserve">                        string cidade = ExtrairValorJson(resposta, "localidade");</w:t>
+      </w:r>
+    </w:p>
+    <w:p>
+      <w:pPr>
+        <w:pStyle w:val="Textodecomentrio"/>
+      </w:pPr>
+      <w:r>
+        <w:t xml:space="preserve">                        string uf = ExtrairValorJson(resposta, "uf");</w:t>
       </w:r>
     </w:p>
     <w:p>
@@ -4486,47 +3908,23 @@
         <w:pStyle w:val="Textodecomentrio"/>
       </w:pPr>
       <w:r>
-        <w:t xml:space="preserve">                        </w:t>
-      </w:r>
-      <w:proofErr w:type="spellStart"/>
-      <w:r>
-        <w:t>txtRuaO.Text</w:t>
-      </w:r>
-      <w:proofErr w:type="spellEnd"/>
-      <w:r>
-        <w:t xml:space="preserve"> = $"{logradouro} - {bairro}";</w:t>
-      </w:r>
-    </w:p>
-    <w:p>
-      <w:pPr>
-        <w:pStyle w:val="Textodecomentrio"/>
-      </w:pPr>
-      <w:r>
-        <w:t xml:space="preserve">                        </w:t>
-      </w:r>
-      <w:proofErr w:type="spellStart"/>
-      <w:r>
-        <w:t>textCidadeO.Text</w:t>
-      </w:r>
-      <w:proofErr w:type="spellEnd"/>
-      <w:r>
-        <w:t xml:space="preserve"> = cidade;</w:t>
-      </w:r>
-    </w:p>
-    <w:p>
-      <w:pPr>
-        <w:pStyle w:val="Textodecomentrio"/>
-      </w:pPr>
-      <w:r>
-        <w:t xml:space="preserve">                        </w:t>
-      </w:r>
-      <w:proofErr w:type="spellStart"/>
-      <w:r>
-        <w:t>textUFO.Text</w:t>
-      </w:r>
-      <w:proofErr w:type="spellEnd"/>
-      <w:r>
-        <w:t xml:space="preserve"> = uf;</w:t>
+        <w:t xml:space="preserve">                        txtRuaO.Text = $"{logradouro} - {bairro}";</w:t>
+      </w:r>
+    </w:p>
+    <w:p>
+      <w:pPr>
+        <w:pStyle w:val="Textodecomentrio"/>
+      </w:pPr>
+      <w:r>
+        <w:t xml:space="preserve">                        textCidadeO.Text = cidade;</w:t>
+      </w:r>
+    </w:p>
+    <w:p>
+      <w:pPr>
+        <w:pStyle w:val="Textodecomentrio"/>
+      </w:pPr>
+      <w:r>
+        <w:t xml:space="preserve">                        textUFO.Text = uf;</w:t>
       </w:r>
     </w:p>
     <w:p>
@@ -4550,31 +3948,7 @@
         <w:pStyle w:val="Textodecomentrio"/>
       </w:pPr>
       <w:r>
-        <w:t xml:space="preserve">                </w:t>
-      </w:r>
-      <w:proofErr w:type="gramStart"/>
-      <w:r>
-        <w:t>catch</w:t>
-      </w:r>
-      <w:proofErr w:type="gramEnd"/>
-      <w:r>
-        <w:t xml:space="preserve"> (</w:t>
-      </w:r>
-      <w:proofErr w:type="spellStart"/>
-      <w:r>
-        <w:t>Exception</w:t>
-      </w:r>
-      <w:proofErr w:type="spellEnd"/>
-      <w:r>
-        <w:t xml:space="preserve"> </w:t>
-      </w:r>
-      <w:proofErr w:type="spellStart"/>
-      <w:r>
-        <w:t>ex</w:t>
-      </w:r>
-      <w:proofErr w:type="spellEnd"/>
-      <w:r>
-        <w:t>)</w:t>
+        <w:t xml:space="preserve">                catch (Exception ex)</w:t>
       </w:r>
     </w:p>
     <w:p>
@@ -4590,41 +3964,7 @@
         <w:pStyle w:val="Textodecomentrio"/>
       </w:pPr>
       <w:r>
-        <w:t xml:space="preserve">                    </w:t>
-      </w:r>
-      <w:proofErr w:type="spellStart"/>
-      <w:r>
-        <w:t>MessageBox.Show</w:t>
-      </w:r>
-      <w:proofErr w:type="spellEnd"/>
-      <w:r>
-        <w:t xml:space="preserve">("Erro ao buscar o CEP de Origem: " + </w:t>
-      </w:r>
-      <w:proofErr w:type="spellStart"/>
-      <w:proofErr w:type="gramStart"/>
-      <w:r>
-        <w:t>ex.Message</w:t>
-      </w:r>
-      <w:proofErr w:type="spellEnd"/>
-      <w:proofErr w:type="gramEnd"/>
-      <w:r>
-        <w:t xml:space="preserve">, "Erro", </w:t>
-      </w:r>
-      <w:proofErr w:type="spellStart"/>
-      <w:r>
-        <w:t>MessageBoxButtons.OK</w:t>
-      </w:r>
-      <w:proofErr w:type="spellEnd"/>
-      <w:r>
-        <w:t xml:space="preserve">, </w:t>
-      </w:r>
-      <w:proofErr w:type="spellStart"/>
-      <w:r>
-        <w:t>MessageBoxIcon.Error</w:t>
-      </w:r>
-      <w:proofErr w:type="spellEnd"/>
-      <w:r>
-        <w:t>);</w:t>
+        <w:t xml:space="preserve">                    MessageBox.Show("Erro ao buscar o CEP de Origem: " + ex.Message, "Erro", MessageBoxButtons.OK, MessageBoxIcon.Error);</w:t>
       </w:r>
     </w:p>
     <w:p>
@@ -4685,57 +4025,7 @@
         <w:pStyle w:val="Textodecomentrio"/>
       </w:pPr>
       <w:r>
-        <w:t xml:space="preserve">        </w:t>
-      </w:r>
-      <w:proofErr w:type="spellStart"/>
-      <w:proofErr w:type="gramStart"/>
-      <w:r>
-        <w:t>private</w:t>
-      </w:r>
-      <w:proofErr w:type="spellEnd"/>
-      <w:proofErr w:type="gramEnd"/>
-      <w:r>
-        <w:t xml:space="preserve"> </w:t>
-      </w:r>
-      <w:proofErr w:type="spellStart"/>
-      <w:r>
-        <w:t>void</w:t>
-      </w:r>
-      <w:proofErr w:type="spellEnd"/>
-      <w:r>
-        <w:t xml:space="preserve"> </w:t>
-      </w:r>
-      <w:proofErr w:type="spellStart"/>
-      <w:r>
-        <w:t>txtCepDestino_Leave</w:t>
-      </w:r>
-      <w:proofErr w:type="spellEnd"/>
-      <w:r>
-        <w:t>(</w:t>
-      </w:r>
-      <w:proofErr w:type="spellStart"/>
-      <w:r>
-        <w:t>object</w:t>
-      </w:r>
-      <w:proofErr w:type="spellEnd"/>
-      <w:r>
-        <w:t xml:space="preserve"> </w:t>
-      </w:r>
-      <w:proofErr w:type="spellStart"/>
-      <w:r>
-        <w:t>sender</w:t>
-      </w:r>
-      <w:proofErr w:type="spellEnd"/>
-      <w:r>
-        <w:t xml:space="preserve">, </w:t>
-      </w:r>
-      <w:proofErr w:type="spellStart"/>
-      <w:r>
-        <w:t>EventArgs</w:t>
-      </w:r>
-      <w:proofErr w:type="spellEnd"/>
-      <w:r>
-        <w:t xml:space="preserve"> e)</w:t>
+        <w:t xml:space="preserve">        private void txtCepDestino_Leave(object sender, EventArgs e)</w:t>
       </w:r>
     </w:p>
     <w:p>
@@ -4751,72 +4041,20 @@
         <w:pStyle w:val="Textodecomentrio"/>
       </w:pPr>
       <w:r>
-        <w:t xml:space="preserve">            </w:t>
-      </w:r>
-      <w:proofErr w:type="spellStart"/>
-      <w:proofErr w:type="gramStart"/>
-      <w:r>
-        <w:t>string</w:t>
-      </w:r>
-      <w:proofErr w:type="spellEnd"/>
-      <w:proofErr w:type="gramEnd"/>
-      <w:r>
-        <w:t xml:space="preserve"> </w:t>
-      </w:r>
-      <w:proofErr w:type="spellStart"/>
-      <w:r>
-        <w:t>cep</w:t>
-      </w:r>
-      <w:proofErr w:type="spellEnd"/>
-      <w:r>
-        <w:t xml:space="preserve"> = </w:t>
-      </w:r>
-      <w:proofErr w:type="spellStart"/>
-      <w:r>
-        <w:t>txtCepDestino.Text.Replace</w:t>
-      </w:r>
-      <w:proofErr w:type="spellEnd"/>
-      <w:r>
-        <w:t>("-", "").</w:t>
-      </w:r>
-      <w:proofErr w:type="spellStart"/>
-      <w:r>
-        <w:t>Trim</w:t>
-      </w:r>
-      <w:proofErr w:type="spellEnd"/>
-      <w:r>
-        <w:t>();</w:t>
-      </w:r>
-    </w:p>
-    <w:p>
-      <w:pPr>
-        <w:pStyle w:val="Textodecomentrio"/>
-      </w:pPr>
-    </w:p>
-    <w:p>
-      <w:pPr>
-        <w:pStyle w:val="Textodecomentrio"/>
-      </w:pPr>
-      <w:r>
-        <w:t xml:space="preserve">            </w:t>
-      </w:r>
-      <w:proofErr w:type="spellStart"/>
-      <w:proofErr w:type="gramStart"/>
-      <w:r>
-        <w:t>if</w:t>
-      </w:r>
-      <w:proofErr w:type="spellEnd"/>
-      <w:proofErr w:type="gramEnd"/>
-      <w:r>
-        <w:t xml:space="preserve"> (</w:t>
-      </w:r>
-      <w:proofErr w:type="spellStart"/>
-      <w:r>
-        <w:t>cep.Length</w:t>
-      </w:r>
-      <w:proofErr w:type="spellEnd"/>
-      <w:r>
-        <w:t xml:space="preserve"> == 8)</w:t>
+        <w:t xml:space="preserve">            string cep = txtCepDestino.Text.Replace("-", "").Trim();</w:t>
+      </w:r>
+    </w:p>
+    <w:p>
+      <w:pPr>
+        <w:pStyle w:val="Textodecomentrio"/>
+      </w:pPr>
+    </w:p>
+    <w:p>
+      <w:pPr>
+        <w:pStyle w:val="Textodecomentrio"/>
+      </w:pPr>
+      <w:r>
+        <w:t xml:space="preserve">            if (cep.Length == 8)</w:t>
       </w:r>
     </w:p>
     <w:p>
@@ -4832,15 +4070,8 @@
         <w:pStyle w:val="Textodecomentrio"/>
       </w:pPr>
       <w:r>
-        <w:t xml:space="preserve">                </w:t>
-      </w:r>
-      <w:proofErr w:type="spellStart"/>
-      <w:proofErr w:type="gramStart"/>
-      <w:r>
-        <w:t>try</w:t>
-      </w:r>
-      <w:proofErr w:type="spellEnd"/>
-      <w:proofErr w:type="gramEnd"/>
+        <w:t xml:space="preserve">                try</w:t>
+      </w:r>
     </w:p>
     <w:p>
       <w:pPr>
@@ -4855,72 +4086,20 @@
         <w:pStyle w:val="Textodecomentrio"/>
       </w:pPr>
       <w:r>
-        <w:t xml:space="preserve">                    </w:t>
-      </w:r>
-      <w:proofErr w:type="spellStart"/>
-      <w:proofErr w:type="gramStart"/>
-      <w:r>
-        <w:t>string</w:t>
-      </w:r>
-      <w:proofErr w:type="spellEnd"/>
-      <w:proofErr w:type="gramEnd"/>
-      <w:r>
-        <w:t xml:space="preserve"> </w:t>
-      </w:r>
-      <w:proofErr w:type="spellStart"/>
-      <w:r>
-        <w:t>url</w:t>
-      </w:r>
-      <w:proofErr w:type="spellEnd"/>
-      <w:r>
-        <w:t xml:space="preserve"> = $"https://viacep.com.br/ws/{cep}/json/";</w:t>
-      </w:r>
-    </w:p>
-    <w:p>
-      <w:pPr>
-        <w:pStyle w:val="Textodecomentrio"/>
-      </w:pPr>
-    </w:p>
-    <w:p>
-      <w:pPr>
-        <w:pStyle w:val="Textodecomentrio"/>
-      </w:pPr>
-      <w:r>
-        <w:t xml:space="preserve">                    </w:t>
-      </w:r>
-      <w:proofErr w:type="spellStart"/>
-      <w:proofErr w:type="gramStart"/>
-      <w:r>
-        <w:t>using</w:t>
-      </w:r>
-      <w:proofErr w:type="spellEnd"/>
-      <w:proofErr w:type="gramEnd"/>
-      <w:r>
-        <w:t xml:space="preserve"> (</w:t>
-      </w:r>
-      <w:proofErr w:type="spellStart"/>
-      <w:r>
-        <w:t>WebClient</w:t>
-      </w:r>
-      <w:proofErr w:type="spellEnd"/>
-      <w:r>
-        <w:t xml:space="preserve"> </w:t>
-      </w:r>
-      <w:proofErr w:type="spellStart"/>
-      <w:r>
-        <w:t>client</w:t>
-      </w:r>
-      <w:proofErr w:type="spellEnd"/>
-      <w:r>
-        <w:t xml:space="preserve"> = new </w:t>
-      </w:r>
-      <w:proofErr w:type="spellStart"/>
-      <w:r>
-        <w:t>WebClient</w:t>
-      </w:r>
-      <w:proofErr w:type="spellEnd"/>
-      <w:r>
-        <w:t>())</w:t>
+        <w:t xml:space="preserve">                    string url = $"https://viacep.com.br/ws/{cep}/json/";</w:t>
+      </w:r>
+    </w:p>
+    <w:p>
+      <w:pPr>
+        <w:pStyle w:val="Textodecomentrio"/>
+      </w:pPr>
+    </w:p>
+    <w:p>
+      <w:pPr>
+        <w:pStyle w:val="Textodecomentrio"/>
+      </w:pPr>
+      <w:r>
+        <w:t xml:space="preserve">                    using (WebClient client = new WebClient())</w:t>
       </w:r>
     </w:p>
     <w:p>
@@ -4936,88 +4115,20 @@
         <w:pStyle w:val="Textodecomentrio"/>
       </w:pPr>
       <w:r>
-        <w:t xml:space="preserve">                        </w:t>
-      </w:r>
-      <w:proofErr w:type="spellStart"/>
-      <w:proofErr w:type="gramStart"/>
-      <w:r>
-        <w:t>string</w:t>
-      </w:r>
-      <w:proofErr w:type="spellEnd"/>
-      <w:proofErr w:type="gramEnd"/>
-      <w:r>
-        <w:t xml:space="preserve"> resposta = </w:t>
-      </w:r>
-      <w:proofErr w:type="spellStart"/>
-      <w:r>
-        <w:t>client.DownloadString</w:t>
-      </w:r>
-      <w:proofErr w:type="spellEnd"/>
-      <w:r>
-        <w:t>(</w:t>
-      </w:r>
-      <w:proofErr w:type="spellStart"/>
-      <w:r>
-        <w:t>url</w:t>
-      </w:r>
-      <w:proofErr w:type="spellEnd"/>
-      <w:r>
-        <w:t>);</w:t>
-      </w:r>
-    </w:p>
-    <w:p>
-      <w:pPr>
-        <w:pStyle w:val="Textodecomentrio"/>
-      </w:pPr>
-    </w:p>
-    <w:p>
-      <w:pPr>
-        <w:pStyle w:val="Textodecomentrio"/>
-      </w:pPr>
-      <w:r>
-        <w:t xml:space="preserve">                        </w:t>
-      </w:r>
-      <w:proofErr w:type="spellStart"/>
-      <w:proofErr w:type="gramStart"/>
-      <w:r>
-        <w:t>if</w:t>
-      </w:r>
-      <w:proofErr w:type="spellEnd"/>
-      <w:proofErr w:type="gramEnd"/>
-      <w:r>
-        <w:t xml:space="preserve"> (</w:t>
-      </w:r>
-      <w:proofErr w:type="spellStart"/>
-      <w:r>
-        <w:t>resposta.Contains</w:t>
-      </w:r>
-      <w:proofErr w:type="spellEnd"/>
-      <w:r>
-        <w:t>("\"erro\":</w:t>
-      </w:r>
-      <w:proofErr w:type="spellStart"/>
-      <w:r>
-        <w:t>true</w:t>
-      </w:r>
-      <w:proofErr w:type="spellEnd"/>
-      <w:r>
-        <w:t xml:space="preserve">") || </w:t>
-      </w:r>
-      <w:proofErr w:type="spellStart"/>
-      <w:r>
-        <w:t>resposta.Contains</w:t>
-      </w:r>
-      <w:proofErr w:type="spellEnd"/>
-      <w:r>
-        <w:t xml:space="preserve">("\"erro\": </w:t>
-      </w:r>
-      <w:proofErr w:type="spellStart"/>
-      <w:r>
-        <w:t>true</w:t>
-      </w:r>
-      <w:proofErr w:type="spellEnd"/>
-      <w:r>
-        <w:t>"))</w:t>
+        <w:t xml:space="preserve">                        string resposta = client.DownloadString(url);</w:t>
+      </w:r>
+    </w:p>
+    <w:p>
+      <w:pPr>
+        <w:pStyle w:val="Textodecomentrio"/>
+      </w:pPr>
+    </w:p>
+    <w:p>
+      <w:pPr>
+        <w:pStyle w:val="Textodecomentrio"/>
+      </w:pPr>
+      <w:r>
+        <w:t xml:space="preserve">                        if (resposta.Contains("\"erro\":true") || resposta.Contains("\"erro\": true"))</w:t>
       </w:r>
     </w:p>
     <w:p>
@@ -5033,49 +4144,15 @@
         <w:pStyle w:val="Textodecomentrio"/>
       </w:pPr>
       <w:r>
-        <w:t xml:space="preserve">                            </w:t>
-      </w:r>
-      <w:proofErr w:type="spellStart"/>
-      <w:r>
-        <w:t>MessageBox.Show</w:t>
-      </w:r>
-      <w:proofErr w:type="spellEnd"/>
-      <w:r>
-        <w:t xml:space="preserve">("CEP de Destino não encontrado!", "Erro", </w:t>
-      </w:r>
-      <w:proofErr w:type="spellStart"/>
-      <w:r>
-        <w:t>MessageBoxButtons.OK</w:t>
-      </w:r>
-      <w:proofErr w:type="spellEnd"/>
-      <w:r>
-        <w:t xml:space="preserve">, </w:t>
-      </w:r>
-      <w:proofErr w:type="spellStart"/>
-      <w:r>
-        <w:t>MessageBoxIcon.Error</w:t>
-      </w:r>
-      <w:proofErr w:type="spellEnd"/>
-      <w:r>
-        <w:t>);</w:t>
-      </w:r>
-    </w:p>
-    <w:p>
-      <w:pPr>
-        <w:pStyle w:val="Textodecomentrio"/>
-      </w:pPr>
-      <w:r>
-        <w:t xml:space="preserve">                            </w:t>
-      </w:r>
-      <w:proofErr w:type="spellStart"/>
-      <w:proofErr w:type="gramStart"/>
-      <w:r>
-        <w:t>return</w:t>
-      </w:r>
-      <w:proofErr w:type="spellEnd"/>
-      <w:proofErr w:type="gramEnd"/>
-      <w:r>
-        <w:t>;</w:t>
+        <w:t xml:space="preserve">                            MessageBox.Show("CEP de Destino não encontrado!", "Erro", MessageBoxButtons.OK, MessageBoxIcon.Error);</w:t>
+      </w:r>
+    </w:p>
+    <w:p>
+      <w:pPr>
+        <w:pStyle w:val="Textodecomentrio"/>
+      </w:pPr>
+      <w:r>
+        <w:t xml:space="preserve">                            return;</w:t>
       </w:r>
     </w:p>
     <w:p>
@@ -5096,103 +4173,31 @@
         <w:pStyle w:val="Textodecomentrio"/>
       </w:pPr>
       <w:r>
-        <w:t xml:space="preserve">                        </w:t>
-      </w:r>
-      <w:proofErr w:type="spellStart"/>
-      <w:proofErr w:type="gramStart"/>
-      <w:r>
-        <w:t>string</w:t>
-      </w:r>
-      <w:proofErr w:type="spellEnd"/>
-      <w:proofErr w:type="gramEnd"/>
-      <w:r>
-        <w:t xml:space="preserve"> logradouro = </w:t>
-      </w:r>
-      <w:proofErr w:type="spellStart"/>
-      <w:r>
-        <w:t>ExtrairValorJson</w:t>
-      </w:r>
-      <w:proofErr w:type="spellEnd"/>
-      <w:r>
-        <w:t>(resposta, "logradouro");</w:t>
-      </w:r>
-    </w:p>
-    <w:p>
-      <w:pPr>
-        <w:pStyle w:val="Textodecomentrio"/>
-      </w:pPr>
-      <w:r>
-        <w:t xml:space="preserve">                        </w:t>
-      </w:r>
-      <w:proofErr w:type="spellStart"/>
-      <w:proofErr w:type="gramStart"/>
-      <w:r>
-        <w:t>string</w:t>
-      </w:r>
-      <w:proofErr w:type="spellEnd"/>
-      <w:proofErr w:type="gramEnd"/>
-      <w:r>
-        <w:t xml:space="preserve"> bairro = </w:t>
-      </w:r>
-      <w:proofErr w:type="spellStart"/>
-      <w:r>
-        <w:t>ExtrairValorJson</w:t>
-      </w:r>
-      <w:proofErr w:type="spellEnd"/>
-      <w:r>
-        <w:t>(resposta, "bairro");</w:t>
-      </w:r>
-    </w:p>
-    <w:p>
-      <w:pPr>
-        <w:pStyle w:val="Textodecomentrio"/>
-      </w:pPr>
-      <w:r>
-        <w:t xml:space="preserve">                        </w:t>
-      </w:r>
-      <w:proofErr w:type="spellStart"/>
-      <w:proofErr w:type="gramStart"/>
-      <w:r>
-        <w:t>string</w:t>
-      </w:r>
-      <w:proofErr w:type="spellEnd"/>
-      <w:proofErr w:type="gramEnd"/>
-      <w:r>
-        <w:t xml:space="preserve"> cidade = </w:t>
-      </w:r>
-      <w:proofErr w:type="spellStart"/>
-      <w:r>
-        <w:t>ExtrairValorJson</w:t>
-      </w:r>
-      <w:proofErr w:type="spellEnd"/>
-      <w:r>
-        <w:t>(resposta, "localidade");</w:t>
-      </w:r>
-    </w:p>
-    <w:p>
-      <w:pPr>
-        <w:pStyle w:val="Textodecomentrio"/>
-      </w:pPr>
-      <w:r>
-        <w:t xml:space="preserve">                        </w:t>
-      </w:r>
-      <w:proofErr w:type="spellStart"/>
-      <w:proofErr w:type="gramStart"/>
-      <w:r>
-        <w:t>string</w:t>
-      </w:r>
-      <w:proofErr w:type="spellEnd"/>
-      <w:proofErr w:type="gramEnd"/>
-      <w:r>
-        <w:t xml:space="preserve"> uf = </w:t>
-      </w:r>
-      <w:proofErr w:type="spellStart"/>
-      <w:r>
-        <w:t>ExtrairValorJson</w:t>
-      </w:r>
-      <w:proofErr w:type="spellEnd"/>
-      <w:r>
-        <w:t>(resposta, "uf");</w:t>
+        <w:t xml:space="preserve">                        string logradouro = ExtrairValorJson(resposta, "logradouro");</w:t>
+      </w:r>
+    </w:p>
+    <w:p>
+      <w:pPr>
+        <w:pStyle w:val="Textodecomentrio"/>
+      </w:pPr>
+      <w:r>
+        <w:t xml:space="preserve">                        string bairro = ExtrairValorJson(resposta, "bairro");</w:t>
+      </w:r>
+    </w:p>
+    <w:p>
+      <w:pPr>
+        <w:pStyle w:val="Textodecomentrio"/>
+      </w:pPr>
+      <w:r>
+        <w:t xml:space="preserve">                        string cidade = ExtrairValorJson(resposta, "localidade");</w:t>
+      </w:r>
+    </w:p>
+    <w:p>
+      <w:pPr>
+        <w:pStyle w:val="Textodecomentrio"/>
+      </w:pPr>
+      <w:r>
+        <w:t xml:space="preserve">                        string uf = ExtrairValorJson(resposta, "uf");</w:t>
       </w:r>
     </w:p>
     <w:p>
@@ -5213,47 +4218,23 @@
         <w:pStyle w:val="Textodecomentrio"/>
       </w:pPr>
       <w:r>
-        <w:t xml:space="preserve">                        </w:t>
-      </w:r>
-      <w:proofErr w:type="spellStart"/>
-      <w:r>
-        <w:t>txtRuafim.Text</w:t>
-      </w:r>
-      <w:proofErr w:type="spellEnd"/>
-      <w:r>
-        <w:t xml:space="preserve"> = $"{logradouro} - {bairro}";</w:t>
-      </w:r>
-    </w:p>
-    <w:p>
-      <w:pPr>
-        <w:pStyle w:val="Textodecomentrio"/>
-      </w:pPr>
-      <w:r>
-        <w:t xml:space="preserve">                        </w:t>
-      </w:r>
-      <w:proofErr w:type="spellStart"/>
-      <w:r>
-        <w:t>textCidadeFim.Text</w:t>
-      </w:r>
-      <w:proofErr w:type="spellEnd"/>
-      <w:r>
-        <w:t xml:space="preserve"> = cidade;</w:t>
-      </w:r>
-    </w:p>
-    <w:p>
-      <w:pPr>
-        <w:pStyle w:val="Textodecomentrio"/>
-      </w:pPr>
-      <w:r>
-        <w:t xml:space="preserve">                        </w:t>
-      </w:r>
-      <w:proofErr w:type="spellStart"/>
-      <w:r>
-        <w:t>textUFFim.Text</w:t>
-      </w:r>
-      <w:proofErr w:type="spellEnd"/>
-      <w:r>
-        <w:t xml:space="preserve"> = uf;</w:t>
+        <w:t xml:space="preserve">                        txtRuafim.Text = $"{logradouro} - {bairro}";</w:t>
+      </w:r>
+    </w:p>
+    <w:p>
+      <w:pPr>
+        <w:pStyle w:val="Textodecomentrio"/>
+      </w:pPr>
+      <w:r>
+        <w:t xml:space="preserve">                        textCidadeFim.Text = cidade;</w:t>
+      </w:r>
+    </w:p>
+    <w:p>
+      <w:pPr>
+        <w:pStyle w:val="Textodecomentrio"/>
+      </w:pPr>
+      <w:r>
+        <w:t xml:space="preserve">                        textUFFim.Text = uf;</w:t>
       </w:r>
     </w:p>
     <w:p>
@@ -5277,31 +4258,7 @@
         <w:pStyle w:val="Textodecomentrio"/>
       </w:pPr>
       <w:r>
-        <w:t xml:space="preserve">                </w:t>
-      </w:r>
-      <w:proofErr w:type="gramStart"/>
-      <w:r>
-        <w:t>catch</w:t>
-      </w:r>
-      <w:proofErr w:type="gramEnd"/>
-      <w:r>
-        <w:t xml:space="preserve"> (</w:t>
-      </w:r>
-      <w:proofErr w:type="spellStart"/>
-      <w:r>
-        <w:t>Exception</w:t>
-      </w:r>
-      <w:proofErr w:type="spellEnd"/>
-      <w:r>
-        <w:t xml:space="preserve"> </w:t>
-      </w:r>
-      <w:proofErr w:type="spellStart"/>
-      <w:r>
-        <w:t>ex</w:t>
-      </w:r>
-      <w:proofErr w:type="spellEnd"/>
-      <w:r>
-        <w:t>)</w:t>
+        <w:t xml:space="preserve">                catch (Exception ex)</w:t>
       </w:r>
     </w:p>
     <w:p>
@@ -5317,41 +4274,7 @@
         <w:pStyle w:val="Textodecomentrio"/>
       </w:pPr>
       <w:r>
-        <w:t xml:space="preserve">                    </w:t>
-      </w:r>
-      <w:proofErr w:type="spellStart"/>
-      <w:r>
-        <w:t>MessageBox.Show</w:t>
-      </w:r>
-      <w:proofErr w:type="spellEnd"/>
-      <w:r>
-        <w:t xml:space="preserve">("Erro ao buscar o CEP de Destino: " + </w:t>
-      </w:r>
-      <w:proofErr w:type="spellStart"/>
-      <w:proofErr w:type="gramStart"/>
-      <w:r>
-        <w:t>ex.Message</w:t>
-      </w:r>
-      <w:proofErr w:type="spellEnd"/>
-      <w:proofErr w:type="gramEnd"/>
-      <w:r>
-        <w:t xml:space="preserve">, "Erro", </w:t>
-      </w:r>
-      <w:proofErr w:type="spellStart"/>
-      <w:r>
-        <w:t>MessageBoxButtons.OK</w:t>
-      </w:r>
-      <w:proofErr w:type="spellEnd"/>
-      <w:r>
-        <w:t xml:space="preserve">, </w:t>
-      </w:r>
-      <w:proofErr w:type="spellStart"/>
-      <w:r>
-        <w:t>MessageBoxIcon.Error</w:t>
-      </w:r>
-      <w:proofErr w:type="spellEnd"/>
-      <w:r>
-        <w:t>);</w:t>
+        <w:t xml:space="preserve">                    MessageBox.Show("Erro ao buscar o CEP de Destino: " + ex.Message, "Erro", MessageBoxButtons.OK, MessageBoxIcon.Error);</w:t>
       </w:r>
     </w:p>
     <w:p>
@@ -5412,57 +4335,7 @@
         <w:pStyle w:val="Textodecomentrio"/>
       </w:pPr>
       <w:r>
-        <w:t xml:space="preserve">        </w:t>
-      </w:r>
-      <w:proofErr w:type="spellStart"/>
-      <w:proofErr w:type="gramStart"/>
-      <w:r>
-        <w:t>private</w:t>
-      </w:r>
-      <w:proofErr w:type="spellEnd"/>
-      <w:proofErr w:type="gramEnd"/>
-      <w:r>
-        <w:t xml:space="preserve"> </w:t>
-      </w:r>
-      <w:proofErr w:type="spellStart"/>
-      <w:r>
-        <w:t>string</w:t>
-      </w:r>
-      <w:proofErr w:type="spellEnd"/>
-      <w:r>
-        <w:t xml:space="preserve"> </w:t>
-      </w:r>
-      <w:proofErr w:type="spellStart"/>
-      <w:r>
-        <w:t>ExtrairValorJson</w:t>
-      </w:r>
-      <w:proofErr w:type="spellEnd"/>
-      <w:r>
-        <w:t>(</w:t>
-      </w:r>
-      <w:proofErr w:type="spellStart"/>
-      <w:r>
-        <w:t>string</w:t>
-      </w:r>
-      <w:proofErr w:type="spellEnd"/>
-      <w:r>
-        <w:t xml:space="preserve"> </w:t>
-      </w:r>
-      <w:proofErr w:type="spellStart"/>
-      <w:r>
-        <w:t>json</w:t>
-      </w:r>
-      <w:proofErr w:type="spellEnd"/>
-      <w:r>
-        <w:t xml:space="preserve">, </w:t>
-      </w:r>
-      <w:proofErr w:type="spellStart"/>
-      <w:r>
-        <w:t>string</w:t>
-      </w:r>
-      <w:proofErr w:type="spellEnd"/>
-      <w:r>
-        <w:t xml:space="preserve"> chave)</w:t>
+        <w:t xml:space="preserve">        private string ExtrairValorJson(string json, string chave)</w:t>
       </w:r>
     </w:p>
     <w:p>
@@ -5478,15 +4351,8 @@
         <w:pStyle w:val="Textodecomentrio"/>
       </w:pPr>
       <w:r>
-        <w:t xml:space="preserve">            </w:t>
-      </w:r>
-      <w:proofErr w:type="spellStart"/>
-      <w:proofErr w:type="gramStart"/>
-      <w:r>
-        <w:t>try</w:t>
-      </w:r>
-      <w:proofErr w:type="spellEnd"/>
-      <w:proofErr w:type="gramEnd"/>
+        <w:t xml:space="preserve">            try</w:t>
+      </w:r>
     </w:p>
     <w:p>
       <w:pPr>
@@ -5501,69 +4367,23 @@
         <w:pStyle w:val="Textodecomentrio"/>
       </w:pPr>
       <w:r>
-        <w:t xml:space="preserve">                </w:t>
-      </w:r>
-      <w:proofErr w:type="spellStart"/>
-      <w:proofErr w:type="gramStart"/>
-      <w:r>
-        <w:t>string</w:t>
-      </w:r>
-      <w:proofErr w:type="spellEnd"/>
-      <w:proofErr w:type="gramEnd"/>
-      <w:r>
-        <w:t xml:space="preserve"> busca = $"\"{chave}\":\"";</w:t>
-      </w:r>
-    </w:p>
-    <w:p>
-      <w:pPr>
-        <w:pStyle w:val="Textodecomentrio"/>
-      </w:pPr>
-      <w:r>
-        <w:t xml:space="preserve">                </w:t>
-      </w:r>
-      <w:proofErr w:type="spellStart"/>
-      <w:proofErr w:type="gramStart"/>
-      <w:r>
-        <w:t>int</w:t>
-      </w:r>
-      <w:proofErr w:type="spellEnd"/>
-      <w:proofErr w:type="gramEnd"/>
-      <w:r>
-        <w:t xml:space="preserve"> </w:t>
-      </w:r>
-      <w:proofErr w:type="spellStart"/>
-      <w:r>
-        <w:t>inicio</w:t>
-      </w:r>
-      <w:proofErr w:type="spellEnd"/>
-      <w:r>
-        <w:t xml:space="preserve"> = </w:t>
-      </w:r>
-      <w:proofErr w:type="spellStart"/>
-      <w:r>
-        <w:t>json.IndexOf</w:t>
-      </w:r>
-      <w:proofErr w:type="spellEnd"/>
-      <w:r>
-        <w:t>(busca);</w:t>
-      </w:r>
-    </w:p>
-    <w:p>
-      <w:pPr>
-        <w:pStyle w:val="Textodecomentrio"/>
-      </w:pPr>
-      <w:r>
-        <w:t xml:space="preserve">                </w:t>
-      </w:r>
-      <w:proofErr w:type="spellStart"/>
-      <w:proofErr w:type="gramStart"/>
-      <w:r>
-        <w:t>if</w:t>
-      </w:r>
-      <w:proofErr w:type="spellEnd"/>
-      <w:proofErr w:type="gramEnd"/>
-      <w:r>
-        <w:t xml:space="preserve"> (inicio == -1)</w:t>
+        <w:t xml:space="preserve">                string busca = $"\"{chave}\":\"";</w:t>
+      </w:r>
+    </w:p>
+    <w:p>
+      <w:pPr>
+        <w:pStyle w:val="Textodecomentrio"/>
+      </w:pPr>
+      <w:r>
+        <w:t xml:space="preserve">                int inicio = json.IndexOf(busca);</w:t>
+      </w:r>
+    </w:p>
+    <w:p>
+      <w:pPr>
+        <w:pStyle w:val="Textodecomentrio"/>
+      </w:pPr>
+      <w:r>
+        <w:t xml:space="preserve">                if (inicio == -1)</w:t>
       </w:r>
     </w:p>
     <w:p>
@@ -5579,65 +4399,23 @@
         <w:pStyle w:val="Textodecomentrio"/>
       </w:pPr>
       <w:r>
-        <w:t xml:space="preserve">                    </w:t>
-      </w:r>
-      <w:proofErr w:type="gramStart"/>
-      <w:r>
-        <w:t>busca</w:t>
-      </w:r>
-      <w:proofErr w:type="gramEnd"/>
-      <w:r>
-        <w:t xml:space="preserve"> = $"\"{chave}\": \"";</w:t>
-      </w:r>
-    </w:p>
-    <w:p>
-      <w:pPr>
-        <w:pStyle w:val="Textodecomentrio"/>
-      </w:pPr>
-      <w:r>
-        <w:t xml:space="preserve">                    </w:t>
-      </w:r>
-      <w:proofErr w:type="gramStart"/>
-      <w:r>
-        <w:t>inicio</w:t>
-      </w:r>
-      <w:proofErr w:type="gramEnd"/>
-      <w:r>
-        <w:t xml:space="preserve"> = </w:t>
-      </w:r>
-      <w:proofErr w:type="spellStart"/>
-      <w:r>
-        <w:t>json.IndexOf</w:t>
-      </w:r>
-      <w:proofErr w:type="spellEnd"/>
-      <w:r>
-        <w:t>(busca);</w:t>
-      </w:r>
-    </w:p>
-    <w:p>
-      <w:pPr>
-        <w:pStyle w:val="Textodecomentrio"/>
-      </w:pPr>
-      <w:r>
-        <w:t xml:space="preserve">                    </w:t>
-      </w:r>
-      <w:proofErr w:type="spellStart"/>
-      <w:proofErr w:type="gramStart"/>
-      <w:r>
-        <w:t>if</w:t>
-      </w:r>
-      <w:proofErr w:type="spellEnd"/>
-      <w:proofErr w:type="gramEnd"/>
-      <w:r>
-        <w:t xml:space="preserve"> (inicio == -1) </w:t>
-      </w:r>
-      <w:proofErr w:type="spellStart"/>
-      <w:r>
-        <w:t>return</w:t>
-      </w:r>
-      <w:proofErr w:type="spellEnd"/>
-      <w:r>
-        <w:t xml:space="preserve"> "";</w:t>
+        <w:t xml:space="preserve">                    busca = $"\"{chave}\": \"";</w:t>
+      </w:r>
+    </w:p>
+    <w:p>
+      <w:pPr>
+        <w:pStyle w:val="Textodecomentrio"/>
+      </w:pPr>
+      <w:r>
+        <w:t xml:space="preserve">                    inicio = json.IndexOf(busca);</w:t>
+      </w:r>
+    </w:p>
+    <w:p>
+      <w:pPr>
+        <w:pStyle w:val="Textodecomentrio"/>
+      </w:pPr>
+      <w:r>
+        <w:t xml:space="preserve">                    if (inicio == -1) return "";</w:t>
       </w:r>
     </w:p>
     <w:p>
@@ -5653,83 +4431,23 @@
         <w:pStyle w:val="Textodecomentrio"/>
       </w:pPr>
       <w:r>
-        <w:t xml:space="preserve">                </w:t>
-      </w:r>
-      <w:proofErr w:type="gramStart"/>
-      <w:r>
-        <w:t>inicio</w:t>
-      </w:r>
-      <w:proofErr w:type="gramEnd"/>
-      <w:r>
-        <w:t xml:space="preserve"> += </w:t>
-      </w:r>
-      <w:proofErr w:type="spellStart"/>
-      <w:r>
-        <w:t>busca.Length</w:t>
-      </w:r>
-      <w:proofErr w:type="spellEnd"/>
-      <w:r>
-        <w:t>;</w:t>
-      </w:r>
-    </w:p>
-    <w:p>
-      <w:pPr>
-        <w:pStyle w:val="Textodecomentrio"/>
-      </w:pPr>
-      <w:r>
-        <w:t xml:space="preserve">                </w:t>
-      </w:r>
-      <w:proofErr w:type="spellStart"/>
-      <w:proofErr w:type="gramStart"/>
-      <w:r>
-        <w:t>int</w:t>
-      </w:r>
-      <w:proofErr w:type="spellEnd"/>
-      <w:proofErr w:type="gramEnd"/>
-      <w:r>
-        <w:t xml:space="preserve"> fim = </w:t>
-      </w:r>
-      <w:proofErr w:type="spellStart"/>
-      <w:r>
-        <w:t>json.IndexOf</w:t>
-      </w:r>
-      <w:proofErr w:type="spellEnd"/>
-      <w:r>
-        <w:t>("\"", inicio);</w:t>
-      </w:r>
-    </w:p>
-    <w:p>
-      <w:pPr>
-        <w:pStyle w:val="Textodecomentrio"/>
-      </w:pPr>
-      <w:r>
-        <w:t xml:space="preserve">                </w:t>
-      </w:r>
-      <w:proofErr w:type="spellStart"/>
-      <w:proofErr w:type="gramStart"/>
-      <w:r>
-        <w:t>return</w:t>
-      </w:r>
-      <w:proofErr w:type="spellEnd"/>
-      <w:proofErr w:type="gramEnd"/>
-      <w:r>
-        <w:t xml:space="preserve"> </w:t>
-      </w:r>
-      <w:proofErr w:type="spellStart"/>
-      <w:r>
-        <w:t>json.Substring</w:t>
-      </w:r>
-      <w:proofErr w:type="spellEnd"/>
-      <w:r>
-        <w:t>(</w:t>
-      </w:r>
-      <w:proofErr w:type="spellStart"/>
-      <w:r>
-        <w:t>inicio</w:t>
-      </w:r>
-      <w:proofErr w:type="spellEnd"/>
-      <w:r>
-        <w:t>, fim - inicio);</w:t>
+        <w:t xml:space="preserve">                inicio += busca.Length;</w:t>
+      </w:r>
+    </w:p>
+    <w:p>
+      <w:pPr>
+        <w:pStyle w:val="Textodecomentrio"/>
+      </w:pPr>
+      <w:r>
+        <w:t xml:space="preserve">                int fim = json.IndexOf("\"", inicio);</w:t>
+      </w:r>
+    </w:p>
+    <w:p>
+      <w:pPr>
+        <w:pStyle w:val="Textodecomentrio"/>
+      </w:pPr>
+      <w:r>
+        <w:t xml:space="preserve">                return json.Substring(inicio, fim - inicio);</w:t>
       </w:r>
     </w:p>
     <w:p>
@@ -5745,13 +4463,8 @@
         <w:pStyle w:val="Textodecomentrio"/>
       </w:pPr>
       <w:r>
-        <w:t xml:space="preserve">            </w:t>
-      </w:r>
-      <w:proofErr w:type="gramStart"/>
-      <w:r>
-        <w:t>catch</w:t>
-      </w:r>
-      <w:proofErr w:type="gramEnd"/>
+        <w:t xml:space="preserve">            catch</w:t>
+      </w:r>
     </w:p>
     <w:p>
       <w:pPr>
@@ -5766,17 +4479,7 @@
         <w:pStyle w:val="Textodecomentrio"/>
       </w:pPr>
       <w:r>
-        <w:t xml:space="preserve">                </w:t>
-      </w:r>
-      <w:proofErr w:type="spellStart"/>
-      <w:proofErr w:type="gramStart"/>
-      <w:r>
-        <w:t>return</w:t>
-      </w:r>
-      <w:proofErr w:type="spellEnd"/>
-      <w:proofErr w:type="gramEnd"/>
-      <w:r>
-        <w:t xml:space="preserve"> "";</w:t>
+        <w:t xml:space="preserve">                return "";</w:t>
       </w:r>
     </w:p>
     <w:p>
@@ -5853,42 +4556,17 @@
           <w:b/>
           <w:bCs/>
         </w:rPr>
-        <w:t xml:space="preserve">Gerenciador de Pacotes </w:t>
-      </w:r>
-      <w:proofErr w:type="spellStart"/>
+        <w:t>Gerenciador de Pacotes NuGet</w:t>
+      </w:r>
+      <w:r>
+        <w:t xml:space="preserve"> &gt; </w:t>
+      </w:r>
       <w:r>
         <w:rPr>
           <w:b/>
           <w:bCs/>
         </w:rPr>
-        <w:t>NuGet</w:t>
-      </w:r>
-      <w:proofErr w:type="spellEnd"/>
-      <w:r>
-        <w:t xml:space="preserve"> &gt; </w:t>
-      </w:r>
-      <w:r>
-        <w:rPr>
-          <w:b/>
-          <w:bCs/>
-        </w:rPr>
-        <w:t xml:space="preserve">Gerenciar Pacotes </w:t>
-      </w:r>
-      <w:proofErr w:type="spellStart"/>
-      <w:r>
-        <w:rPr>
-          <w:b/>
-          <w:bCs/>
-        </w:rPr>
-        <w:t>NuGet</w:t>
-      </w:r>
-      <w:proofErr w:type="spellEnd"/>
-      <w:r>
-        <w:rPr>
-          <w:b/>
-          <w:bCs/>
-        </w:rPr>
-        <w:t xml:space="preserve"> para a Solução</w:t>
+        <w:t>Gerenciar Pacotes NuGet para a Solução</w:t>
       </w:r>
       <w:r>
         <w:t>.</w:t>
@@ -5913,31 +4591,14 @@
         <w:t>Procurar</w:t>
       </w:r>
       <w:r>
-        <w:t xml:space="preserve"> (</w:t>
-      </w:r>
-      <w:proofErr w:type="spellStart"/>
-      <w:r>
-        <w:t>Browse</w:t>
-      </w:r>
-      <w:proofErr w:type="spellEnd"/>
-      <w:r>
-        <w:t xml:space="preserve">) e digite: </w:t>
-      </w:r>
-      <w:proofErr w:type="gramStart"/>
+        <w:t xml:space="preserve"> (Browse) e digite: </w:t>
+      </w:r>
       <w:r>
         <w:rPr>
           <w:rStyle w:val="CdigoHTML"/>
           <w:rFonts w:eastAsiaTheme="majorEastAsia"/>
         </w:rPr>
-        <w:t>Microsoft.Web.WebView</w:t>
-      </w:r>
-      <w:proofErr w:type="gramEnd"/>
-      <w:r>
-        <w:rPr>
-          <w:rStyle w:val="CdigoHTML"/>
-          <w:rFonts w:eastAsiaTheme="majorEastAsia"/>
-        </w:rPr>
-        <w:t>2</w:t>
+        <w:t>Microsoft.Web.WebView2</w:t>
       </w:r>
       <w:r>
         <w:t>.</w:t>
@@ -5954,30 +4615,21 @@
       <w:r>
         <w:t xml:space="preserve">Selecione o pacote </w:t>
       </w:r>
-      <w:proofErr w:type="gramStart"/>
       <w:r>
         <w:rPr>
           <w:b/>
           <w:bCs/>
         </w:rPr>
-        <w:t>Microsoft.Web.WebView</w:t>
-      </w:r>
-      <w:proofErr w:type="gramEnd"/>
+        <w:t>Microsoft.Web.WebView2</w:t>
+      </w:r>
+      <w:r>
+        <w:t xml:space="preserve"> da Microsoft e clique em </w:t>
+      </w:r>
       <w:r>
         <w:rPr>
           <w:b/>
           <w:bCs/>
         </w:rPr>
-        <w:t>2</w:t>
-      </w:r>
-      <w:r>
-        <w:t xml:space="preserve"> da Microsoft e clique em </w:t>
-      </w:r>
-      <w:r>
-        <w:rPr>
-          <w:b/>
-          <w:bCs/>
-        </w:rPr>
         <w:t>Instalar</w:t>
       </w:r>
       <w:r>
@@ -6006,7 +4658,6 @@
         </w:rPr>
         <w:annotationRef/>
       </w:r>
-      <w:proofErr w:type="gramStart"/>
       <w:r>
         <w:rPr>
           <w:rFonts w:hAnsi="Symbol"/>
@@ -6014,11 +4665,7 @@
         <w:t></w:t>
       </w:r>
       <w:r>
-        <w:t xml:space="preserve">  Abra</w:t>
-      </w:r>
-      <w:proofErr w:type="gramEnd"/>
-      <w:r>
-        <w:t xml:space="preserve"> o arquivo do seu formulário em modo </w:t>
+        <w:t xml:space="preserve">  Abra o arquivo do seu formulário em modo </w:t>
       </w:r>
       <w:r>
         <w:rPr>
@@ -6041,7 +4688,6 @@
           <w14:ligatures w14:val="none"/>
         </w:rPr>
       </w:pPr>
-      <w:proofErr w:type="gramStart"/>
       <w:r>
         <w:rPr>
           <w:rFonts w:ascii="Times New Roman" w:eastAsia="Times New Roman" w:hAnsi="Symbol" w:cs="Times New Roman"/>
@@ -6058,17 +4704,7 @@
           <w:lang w:eastAsia="pt-BR"/>
           <w14:ligatures w14:val="none"/>
         </w:rPr>
-        <w:t xml:space="preserve">  Vá</w:t>
-      </w:r>
-      <w:proofErr w:type="gramEnd"/>
-      <w:r>
-        <w:rPr>
-          <w:rFonts w:ascii="Times New Roman" w:eastAsia="Times New Roman" w:hAnsi="Times New Roman" w:cs="Times New Roman"/>
-          <w:kern w:val="0"/>
-          <w:lang w:eastAsia="pt-BR"/>
-          <w14:ligatures w14:val="none"/>
-        </w:rPr>
-        <w:t xml:space="preserve"> até a </w:t>
+        <w:t xml:space="preserve">  Vá até a </w:t>
       </w:r>
       <w:r>
         <w:rPr>
@@ -6088,27 +4724,7 @@
           <w:lang w:eastAsia="pt-BR"/>
           <w14:ligatures w14:val="none"/>
         </w:rPr>
-        <w:t xml:space="preserve">. Se você já instalou o pacote </w:t>
-      </w:r>
-      <w:proofErr w:type="spellStart"/>
-      <w:r>
-        <w:rPr>
-          <w:rFonts w:ascii="Times New Roman" w:eastAsia="Times New Roman" w:hAnsi="Times New Roman" w:cs="Times New Roman"/>
-          <w:kern w:val="0"/>
-          <w:lang w:eastAsia="pt-BR"/>
-          <w14:ligatures w14:val="none"/>
-        </w:rPr>
-        <w:t>NuGet</w:t>
-      </w:r>
-      <w:proofErr w:type="spellEnd"/>
-      <w:r>
-        <w:rPr>
-          <w:rFonts w:ascii="Times New Roman" w:eastAsia="Times New Roman" w:hAnsi="Times New Roman" w:cs="Times New Roman"/>
-          <w:kern w:val="0"/>
-          <w:lang w:eastAsia="pt-BR"/>
-          <w14:ligatures w14:val="none"/>
-        </w:rPr>
-        <w:t xml:space="preserve">, uma nova categoria chamada </w:t>
+        <w:t xml:space="preserve">. Se você já instalou o pacote NuGet, uma nova categoria chamada </w:t>
       </w:r>
       <w:r>
         <w:rPr>
@@ -6130,7 +4746,6 @@
         </w:rPr>
         <w:t xml:space="preserve"> (ou </w:t>
       </w:r>
-      <w:proofErr w:type="gramStart"/>
       <w:r>
         <w:rPr>
           <w:rFonts w:ascii="Times New Roman" w:eastAsia="Times New Roman" w:hAnsi="Times New Roman" w:cs="Times New Roman"/>
@@ -6140,19 +4755,7 @@
           <w:lang w:eastAsia="pt-BR"/>
           <w14:ligatures w14:val="none"/>
         </w:rPr>
-        <w:t>Microsoft.Web.WebView</w:t>
-      </w:r>
-      <w:proofErr w:type="gramEnd"/>
-      <w:r>
-        <w:rPr>
-          <w:rFonts w:ascii="Times New Roman" w:eastAsia="Times New Roman" w:hAnsi="Times New Roman" w:cs="Times New Roman"/>
-          <w:i/>
-          <w:iCs/>
-          <w:kern w:val="0"/>
-          <w:lang w:eastAsia="pt-BR"/>
-          <w14:ligatures w14:val="none"/>
-        </w:rPr>
-        <w:t>2</w:t>
+        <w:t>Microsoft.Web.WebView2</w:t>
       </w:r>
       <w:r>
         <w:rPr>
@@ -6174,7 +4777,6 @@
           <w14:ligatures w14:val="none"/>
         </w:rPr>
       </w:pPr>
-      <w:proofErr w:type="gramStart"/>
       <w:r>
         <w:rPr>
           <w:rFonts w:ascii="Times New Roman" w:eastAsia="Times New Roman" w:hAnsi="Symbol" w:cs="Times New Roman"/>
@@ -6191,17 +4793,7 @@
           <w:lang w:eastAsia="pt-BR"/>
           <w14:ligatures w14:val="none"/>
         </w:rPr>
-        <w:t xml:space="preserve">  Arraste</w:t>
-      </w:r>
-      <w:proofErr w:type="gramEnd"/>
-      <w:r>
-        <w:rPr>
-          <w:rFonts w:ascii="Times New Roman" w:eastAsia="Times New Roman" w:hAnsi="Times New Roman" w:cs="Times New Roman"/>
-          <w:kern w:val="0"/>
-          <w:lang w:eastAsia="pt-BR"/>
-          <w14:ligatures w14:val="none"/>
-        </w:rPr>
-        <w:t xml:space="preserve"> o componente </w:t>
+        <w:t xml:space="preserve">  Arraste o componente </w:t>
       </w:r>
       <w:r>
         <w:rPr>
@@ -6254,7 +4846,6 @@
           <w14:ligatures w14:val="none"/>
         </w:rPr>
       </w:pPr>
-      <w:proofErr w:type="gramStart"/>
       <w:r>
         <w:rPr>
           <w:rFonts w:ascii="Times New Roman" w:eastAsia="Times New Roman" w:hAnsi="Symbol" w:cs="Times New Roman"/>
@@ -6271,19 +4862,8 @@
           <w:lang w:eastAsia="pt-BR"/>
           <w14:ligatures w14:val="none"/>
         </w:rPr>
-        <w:t xml:space="preserve">  Defina</w:t>
-      </w:r>
-      <w:proofErr w:type="gramEnd"/>
-      <w:r>
-        <w:rPr>
-          <w:rFonts w:ascii="Times New Roman" w:eastAsia="Times New Roman" w:hAnsi="Times New Roman" w:cs="Times New Roman"/>
-          <w:kern w:val="0"/>
-          <w:lang w:eastAsia="pt-BR"/>
-          <w14:ligatures w14:val="none"/>
-        </w:rPr>
-        <w:t xml:space="preserve"> a propriedade </w:t>
-      </w:r>
-      <w:proofErr w:type="spellStart"/>
+        <w:t xml:space="preserve">  Defina a propriedade </w:t>
+      </w:r>
       <w:r>
         <w:rPr>
           <w:rFonts w:ascii="Courier New" w:eastAsia="Times New Roman" w:hAnsi="Courier New" w:cs="Courier New"/>
@@ -6295,7 +4875,6 @@
         </w:rPr>
         <w:t>Name</w:t>
       </w:r>
-      <w:proofErr w:type="spellEnd"/>
       <w:r>
         <w:rPr>
           <w:rFonts w:ascii="Times New Roman" w:eastAsia="Times New Roman" w:hAnsi="Times New Roman" w:cs="Times New Roman"/>
@@ -6332,15 +4911,13 @@
       <w:pPr>
         <w:pStyle w:val="Textodecomentrio"/>
       </w:pPr>
-      <w:bookmarkStart w:id="4" w:name="_GoBack"/>
-      <w:bookmarkEnd w:id="4"/>
     </w:p>
   </w:comment>
 </w:comments>
 </file>
 
 <file path=word/commentsExtended.xml><?xml version="1.0" encoding="utf-8"?>
-<w15:commentsEx xmlns:wpc="http://schemas.microsoft.com/office/word/2010/wordprocessingCanvas" xmlns:cx="http://schemas.microsoft.com/office/drawing/2014/chartex" xmlns:cx1="http://schemas.microsoft.com/office/drawing/2015/9/8/chartex" xmlns:mc="http://schemas.openxmlformats.org/markup-compatibility/2006" xmlns:o="urn:schemas-microsoft-com:office:office" xmlns:r="http://schemas.openxmlformats.org/officeDocument/2006/relationships" xmlns:m="http://schemas.openxmlformats.org/officeDocument/2006/math" xmlns:v="urn:schemas-microsoft-com:vml" xmlns:wp14="http://schemas.microsoft.com/office/word/2010/wordprocessingDrawing" xmlns:wp="http://schemas.openxmlformats.org/drawingml/2006/wordprocessingDrawing" xmlns:w10="urn:schemas-microsoft-com:office:word" xmlns:w="http://schemas.openxmlformats.org/wordprocessingml/2006/main" xmlns:w14="http://schemas.microsoft.com/office/word/2010/wordml" xmlns:w15="http://schemas.microsoft.com/office/word/2012/wordml" xmlns:w16se="http://schemas.microsoft.com/office/word/2015/wordml/symex" xmlns:wpg="http://schemas.microsoft.com/office/word/2010/wordprocessingGroup" xmlns:wpi="http://schemas.microsoft.com/office/word/2010/wordprocessingInk" xmlns:wne="http://schemas.microsoft.com/office/word/2006/wordml" xmlns:wps="http://schemas.microsoft.com/office/word/2010/wordprocessingShape" mc:Ignorable="w14 w15 w16se wp14">
+<w15:commentsEx xmlns:wpc="http://schemas.microsoft.com/office/word/2010/wordprocessingCanvas" xmlns:cx="http://schemas.microsoft.com/office/drawing/2014/chartex" xmlns:cx1="http://schemas.microsoft.com/office/drawing/2015/9/8/chartex" xmlns:cx2="http://schemas.microsoft.com/office/drawing/2015/10/21/chartex" xmlns:cx3="http://schemas.microsoft.com/office/drawing/2016/5/9/chartex" xmlns:cx4="http://schemas.microsoft.com/office/drawing/2016/5/10/chartex" xmlns:cx5="http://schemas.microsoft.com/office/drawing/2016/5/11/chartex" xmlns:cx6="http://schemas.microsoft.com/office/drawing/2016/5/12/chartex" xmlns:cx7="http://schemas.microsoft.com/office/drawing/2016/5/13/chartex" xmlns:cx8="http://schemas.microsoft.com/office/drawing/2016/5/14/chartex" xmlns:mc="http://schemas.openxmlformats.org/markup-compatibility/2006" xmlns:aink="http://schemas.microsoft.com/office/drawing/2016/ink" xmlns:am3d="http://schemas.microsoft.com/office/drawing/2017/model3d" xmlns:o="urn:schemas-microsoft-com:office:office" xmlns:oel="http://schemas.microsoft.com/office/2019/extlst" xmlns:r="http://schemas.openxmlformats.org/officeDocument/2006/relationships" xmlns:m="http://schemas.openxmlformats.org/officeDocument/2006/math" xmlns:v="urn:schemas-microsoft-com:vml" xmlns:wp14="http://schemas.microsoft.com/office/word/2010/wordprocessingDrawing" xmlns:wp="http://schemas.openxmlformats.org/drawingml/2006/wordprocessingDrawing" xmlns:w10="urn:schemas-microsoft-com:office:word" xmlns:w="http://schemas.openxmlformats.org/wordprocessingml/2006/main" xmlns:w14="http://schemas.microsoft.com/office/word/2010/wordml" xmlns:w15="http://schemas.microsoft.com/office/word/2012/wordml" xmlns:w16cex="http://schemas.microsoft.com/office/word/2018/wordml/cex" xmlns:w16cid="http://schemas.microsoft.com/office/word/2016/wordml/cid" xmlns:w16="http://schemas.microsoft.com/office/word/2018/wordml" xmlns:w16du="http://schemas.microsoft.com/office/word/2023/wordml/word16du" xmlns:w16sdtdh="http://schemas.microsoft.com/office/word/2020/wordml/sdtdatahash" xmlns:w16sdtfl="http://schemas.microsoft.com/office/word/2024/wordml/sdtformatlock" xmlns:w16se="http://schemas.microsoft.com/office/word/2015/wordml/symex" xmlns:wpg="http://schemas.microsoft.com/office/word/2010/wordprocessingGroup" xmlns:wpi="http://schemas.microsoft.com/office/word/2010/wordprocessingInk" xmlns:wne="http://schemas.microsoft.com/office/word/2006/wordml" xmlns:wps="http://schemas.microsoft.com/office/word/2010/wordprocessingShape" mc:Ignorable="w14 w15 w16se w16cid w16 w16cex w16sdtdh w16sdtfl w16du wp14">
   <w15:commentEx w15:paraId="4C255E8D" w15:done="0"/>
   <w15:commentEx w15:paraId="1631FEE4" w15:done="0"/>
   <w15:commentEx w15:paraId="724129C6" w15:done="0"/>
@@ -6358,11 +4935,13 @@
 <w16cid:commentsIds xmlns:wpc="http://schemas.microsoft.com/office/word/2010/wordprocessingCanvas" xmlns:cx="http://schemas.microsoft.com/office/drawing/2014/chartex" xmlns:cx1="http://schemas.microsoft.com/office/drawing/2015/9/8/chartex" xmlns:cx2="http://schemas.microsoft.com/office/drawing/2015/10/21/chartex" xmlns:cx3="http://schemas.microsoft.com/office/drawing/2016/5/9/chartex" xmlns:cx4="http://schemas.microsoft.com/office/drawing/2016/5/10/chartex" xmlns:cx5="http://schemas.microsoft.com/office/drawing/2016/5/11/chartex" xmlns:cx6="http://schemas.microsoft.com/office/drawing/2016/5/12/chartex" xmlns:cx7="http://schemas.microsoft.com/office/drawing/2016/5/13/chartex" xmlns:cx8="http://schemas.microsoft.com/office/drawing/2016/5/14/chartex" xmlns:mc="http://schemas.openxmlformats.org/markup-compatibility/2006" xmlns:aink="http://schemas.microsoft.com/office/drawing/2016/ink" xmlns:am3d="http://schemas.microsoft.com/office/drawing/2017/model3d" xmlns:o="urn:schemas-microsoft-com:office:office" xmlns:oel="http://schemas.microsoft.com/office/2019/extlst" xmlns:r="http://schemas.openxmlformats.org/officeDocument/2006/relationships" xmlns:m="http://schemas.openxmlformats.org/officeDocument/2006/math" xmlns:v="urn:schemas-microsoft-com:vml" xmlns:wp14="http://schemas.microsoft.com/office/word/2010/wordprocessingDrawing" xmlns:wp="http://schemas.openxmlformats.org/drawingml/2006/wordprocessingDrawing" xmlns:w10="urn:schemas-microsoft-com:office:word" xmlns:w="http://schemas.openxmlformats.org/wordprocessingml/2006/main" xmlns:w14="http://schemas.microsoft.com/office/word/2010/wordml" xmlns:w15="http://schemas.microsoft.com/office/word/2012/wordml" xmlns:w16cex="http://schemas.microsoft.com/office/word/2018/wordml/cex" xmlns:w16cid="http://schemas.microsoft.com/office/word/2016/wordml/cid" xmlns:w16="http://schemas.microsoft.com/office/word/2018/wordml" xmlns:w16du="http://schemas.microsoft.com/office/word/2023/wordml/word16du" xmlns:w16sdtdh="http://schemas.microsoft.com/office/word/2020/wordml/sdtdatahash" xmlns:w16sdtfl="http://schemas.microsoft.com/office/word/2024/wordml/sdtformatlock" xmlns:w16se="http://schemas.microsoft.com/office/word/2015/wordml/symex" xmlns:wpg="http://schemas.microsoft.com/office/word/2010/wordprocessingGroup" xmlns:wpi="http://schemas.microsoft.com/office/word/2010/wordprocessingInk" xmlns:wne="http://schemas.microsoft.com/office/word/2006/wordml" xmlns:wps="http://schemas.microsoft.com/office/word/2010/wordprocessingShape" mc:Ignorable="w14 w15 w16se w16cid w16 w16cex w16sdtdh w16sdtfl w16du wp14">
   <w16cid:commentId w16cid:paraId="4C255E8D" w16cid:durableId="4C255E8D"/>
   <w16cid:commentId w16cid:paraId="1631FEE4" w16cid:durableId="1B7C6EBA"/>
+  <w16cid:commentId w16cid:paraId="724129C6" w16cid:durableId="724129C6"/>
+  <w16cid:commentId w16cid:paraId="394E3C89" w16cid:durableId="394E3C89"/>
 </w16cid:commentsIds>
 </file>
 
 <file path=word/numbering.xml><?xml version="1.0" encoding="utf-8"?>
-<w:numbering xmlns:wpc="http://schemas.microsoft.com/office/word/2010/wordprocessingCanvas" xmlns:cx="http://schemas.microsoft.com/office/drawing/2014/chartex" xmlns:cx1="http://schemas.microsoft.com/office/drawing/2015/9/8/chartex" xmlns:mc="http://schemas.openxmlformats.org/markup-compatibility/2006" xmlns:o="urn:schemas-microsoft-com:office:office" xmlns:r="http://schemas.openxmlformats.org/officeDocument/2006/relationships" xmlns:m="http://schemas.openxmlformats.org/officeDocument/2006/math" xmlns:v="urn:schemas-microsoft-com:vml" xmlns:wp14="http://schemas.microsoft.com/office/word/2010/wordprocessingDrawing" xmlns:wp="http://schemas.openxmlformats.org/drawingml/2006/wordprocessingDrawing" xmlns:w10="urn:schemas-microsoft-com:office:word" xmlns:w="http://schemas.openxmlformats.org/wordprocessingml/2006/main" xmlns:w14="http://schemas.microsoft.com/office/word/2010/wordml" xmlns:w15="http://schemas.microsoft.com/office/word/2012/wordml" xmlns:w16se="http://schemas.microsoft.com/office/word/2015/wordml/symex" xmlns:wpg="http://schemas.microsoft.com/office/word/2010/wordprocessingGroup" xmlns:wpi="http://schemas.microsoft.com/office/word/2010/wordprocessingInk" xmlns:wne="http://schemas.microsoft.com/office/word/2006/wordml" xmlns:wps="http://schemas.microsoft.com/office/word/2010/wordprocessingShape" mc:Ignorable="w14 w15 w16se wp14">
+<w:numbering xmlns:wpc="http://schemas.microsoft.com/office/word/2010/wordprocessingCanvas" xmlns:cx="http://schemas.microsoft.com/office/drawing/2014/chartex" xmlns:cx1="http://schemas.microsoft.com/office/drawing/2015/9/8/chartex" xmlns:cx2="http://schemas.microsoft.com/office/drawing/2015/10/21/chartex" xmlns:cx3="http://schemas.microsoft.com/office/drawing/2016/5/9/chartex" xmlns:cx4="http://schemas.microsoft.com/office/drawing/2016/5/10/chartex" xmlns:cx5="http://schemas.microsoft.com/office/drawing/2016/5/11/chartex" xmlns:cx6="http://schemas.microsoft.com/office/drawing/2016/5/12/chartex" xmlns:cx7="http://schemas.microsoft.com/office/drawing/2016/5/13/chartex" xmlns:cx8="http://schemas.microsoft.com/office/drawing/2016/5/14/chartex" xmlns:mc="http://schemas.openxmlformats.org/markup-compatibility/2006" xmlns:aink="http://schemas.microsoft.com/office/drawing/2016/ink" xmlns:am3d="http://schemas.microsoft.com/office/drawing/2017/model3d" xmlns:o="urn:schemas-microsoft-com:office:office" xmlns:oel="http://schemas.microsoft.com/office/2019/extlst" xmlns:r="http://schemas.openxmlformats.org/officeDocument/2006/relationships" xmlns:m="http://schemas.openxmlformats.org/officeDocument/2006/math" xmlns:v="urn:schemas-microsoft-com:vml" xmlns:wp14="http://schemas.microsoft.com/office/word/2010/wordprocessingDrawing" xmlns:wp="http://schemas.openxmlformats.org/drawingml/2006/wordprocessingDrawing" xmlns:w10="urn:schemas-microsoft-com:office:word" xmlns:w="http://schemas.openxmlformats.org/wordprocessingml/2006/main" xmlns:w14="http://schemas.microsoft.com/office/word/2010/wordml" xmlns:w15="http://schemas.microsoft.com/office/word/2012/wordml" xmlns:w16cex="http://schemas.microsoft.com/office/word/2018/wordml/cex" xmlns:w16cid="http://schemas.microsoft.com/office/word/2016/wordml/cid" xmlns:w16="http://schemas.microsoft.com/office/word/2018/wordml" xmlns:w16du="http://schemas.microsoft.com/office/word/2023/wordml/word16du" xmlns:w16sdtdh="http://schemas.microsoft.com/office/word/2020/wordml/sdtdatahash" xmlns:w16sdtfl="http://schemas.microsoft.com/office/word/2024/wordml/sdtformatlock" xmlns:w16se="http://schemas.microsoft.com/office/word/2015/wordml/symex" xmlns:wpg="http://schemas.microsoft.com/office/word/2010/wordprocessingGroup" xmlns:wpi="http://schemas.microsoft.com/office/word/2010/wordprocessingInk" xmlns:wne="http://schemas.microsoft.com/office/word/2006/wordml" xmlns:wps="http://schemas.microsoft.com/office/word/2010/wordprocessingShape" mc:Ignorable="w14 w15 w16se w16cid w16 w16cex w16sdtdh w16sdtfl w16du wp14">
   <w:abstractNum w:abstractNumId="0" w15:restartNumberingAfterBreak="0">
     <w:nsid w:val="03A57919"/>
     <w:multiLevelType w:val="multilevel"/>
@@ -9612,98 +8191,98 @@
       </w:rPr>
     </w:lvl>
   </w:abstractNum>
-  <w:num w:numId="1">
+  <w:num w:numId="1" w16cid:durableId="415052247">
     <w:abstractNumId w:val="3"/>
   </w:num>
-  <w:num w:numId="2">
+  <w:num w:numId="2" w16cid:durableId="1103065697">
     <w:abstractNumId w:val="25"/>
   </w:num>
-  <w:num w:numId="3">
+  <w:num w:numId="3" w16cid:durableId="432554470">
     <w:abstractNumId w:val="16"/>
   </w:num>
-  <w:num w:numId="4">
+  <w:num w:numId="4" w16cid:durableId="1211454891">
     <w:abstractNumId w:val="4"/>
   </w:num>
-  <w:num w:numId="5">
+  <w:num w:numId="5" w16cid:durableId="909121263">
     <w:abstractNumId w:val="21"/>
   </w:num>
-  <w:num w:numId="6">
+  <w:num w:numId="6" w16cid:durableId="414983436">
     <w:abstractNumId w:val="6"/>
   </w:num>
-  <w:num w:numId="7">
+  <w:num w:numId="7" w16cid:durableId="1711875392">
     <w:abstractNumId w:val="1"/>
   </w:num>
-  <w:num w:numId="8">
+  <w:num w:numId="8" w16cid:durableId="659818433">
     <w:abstractNumId w:val="12"/>
   </w:num>
-  <w:num w:numId="9">
+  <w:num w:numId="9" w16cid:durableId="194735490">
     <w:abstractNumId w:val="24"/>
   </w:num>
-  <w:num w:numId="10">
+  <w:num w:numId="10" w16cid:durableId="1909922814">
     <w:abstractNumId w:val="27"/>
   </w:num>
-  <w:num w:numId="11">
+  <w:num w:numId="11" w16cid:durableId="477653766">
     <w:abstractNumId w:val="11"/>
   </w:num>
-  <w:num w:numId="12">
+  <w:num w:numId="12" w16cid:durableId="1447313505">
     <w:abstractNumId w:val="0"/>
   </w:num>
-  <w:num w:numId="13">
+  <w:num w:numId="13" w16cid:durableId="1865711550">
     <w:abstractNumId w:val="10"/>
   </w:num>
-  <w:num w:numId="14">
+  <w:num w:numId="14" w16cid:durableId="998390909">
     <w:abstractNumId w:val="2"/>
   </w:num>
-  <w:num w:numId="15">
+  <w:num w:numId="15" w16cid:durableId="236593857">
     <w:abstractNumId w:val="20"/>
   </w:num>
-  <w:num w:numId="16">
+  <w:num w:numId="16" w16cid:durableId="1052926270">
     <w:abstractNumId w:val="22"/>
   </w:num>
-  <w:num w:numId="17">
+  <w:num w:numId="17" w16cid:durableId="1279025987">
     <w:abstractNumId w:val="18"/>
   </w:num>
-  <w:num w:numId="18">
+  <w:num w:numId="18" w16cid:durableId="733091012">
     <w:abstractNumId w:val="9"/>
   </w:num>
-  <w:num w:numId="19">
+  <w:num w:numId="19" w16cid:durableId="1719088011">
     <w:abstractNumId w:val="19"/>
   </w:num>
-  <w:num w:numId="20">
+  <w:num w:numId="20" w16cid:durableId="322855467">
     <w:abstractNumId w:val="28"/>
   </w:num>
-  <w:num w:numId="21">
+  <w:num w:numId="21" w16cid:durableId="726151374">
     <w:abstractNumId w:val="13"/>
   </w:num>
-  <w:num w:numId="22">
+  <w:num w:numId="22" w16cid:durableId="1392070746">
     <w:abstractNumId w:val="5"/>
   </w:num>
-  <w:num w:numId="23">
+  <w:num w:numId="23" w16cid:durableId="798306761">
     <w:abstractNumId w:val="23"/>
   </w:num>
-  <w:num w:numId="24">
+  <w:num w:numId="24" w16cid:durableId="402682870">
     <w:abstractNumId w:val="14"/>
   </w:num>
-  <w:num w:numId="25">
+  <w:num w:numId="25" w16cid:durableId="823474077">
     <w:abstractNumId w:val="7"/>
   </w:num>
-  <w:num w:numId="26">
+  <w:num w:numId="26" w16cid:durableId="1149320305">
     <w:abstractNumId w:val="8"/>
   </w:num>
-  <w:num w:numId="27">
+  <w:num w:numId="27" w16cid:durableId="1881933012">
     <w:abstractNumId w:val="15"/>
   </w:num>
-  <w:num w:numId="28">
+  <w:num w:numId="28" w16cid:durableId="1359354713">
     <w:abstractNumId w:val="17"/>
   </w:num>
-  <w:num w:numId="29">
+  <w:num w:numId="29" w16cid:durableId="523131652">
     <w:abstractNumId w:val="26"/>
   </w:num>
 </w:numbering>
 </file>
 
 <file path=word/people.xml><?xml version="1.0" encoding="utf-8"?>
-<w15:people xmlns:wpc="http://schemas.microsoft.com/office/word/2010/wordprocessingCanvas" xmlns:cx="http://schemas.microsoft.com/office/drawing/2014/chartex" xmlns:cx1="http://schemas.microsoft.com/office/drawing/2015/9/8/chartex" xmlns:mc="http://schemas.openxmlformats.org/markup-compatibility/2006" xmlns:o="urn:schemas-microsoft-com:office:office" xmlns:r="http://schemas.openxmlformats.org/officeDocument/2006/relationships" xmlns:m="http://schemas.openxmlformats.org/officeDocument/2006/math" xmlns:v="urn:schemas-microsoft-com:vml" xmlns:wp14="http://schemas.microsoft.com/office/word/2010/wordprocessingDrawing" xmlns:wp="http://schemas.openxmlformats.org/drawingml/2006/wordprocessingDrawing" xmlns:w10="urn:schemas-microsoft-com:office:word" xmlns:w="http://schemas.openxmlformats.org/wordprocessingml/2006/main" xmlns:w14="http://schemas.microsoft.com/office/word/2010/wordml" xmlns:w15="http://schemas.microsoft.com/office/word/2012/wordml" xmlns:w16se="http://schemas.microsoft.com/office/word/2015/wordml/symex" xmlns:wpg="http://schemas.microsoft.com/office/word/2010/wordprocessingGroup" xmlns:wpi="http://schemas.microsoft.com/office/word/2010/wordprocessingInk" xmlns:wne="http://schemas.microsoft.com/office/word/2006/wordml" xmlns:wps="http://schemas.microsoft.com/office/word/2010/wordprocessingShape" mc:Ignorable="w14 w15 w16se wp14">
+<w15:people xmlns:wpc="http://schemas.microsoft.com/office/word/2010/wordprocessingCanvas" xmlns:cx="http://schemas.microsoft.com/office/drawing/2014/chartex" xmlns:cx1="http://schemas.microsoft.com/office/drawing/2015/9/8/chartex" xmlns:cx2="http://schemas.microsoft.com/office/drawing/2015/10/21/chartex" xmlns:cx3="http://schemas.microsoft.com/office/drawing/2016/5/9/chartex" xmlns:cx4="http://schemas.microsoft.com/office/drawing/2016/5/10/chartex" xmlns:cx5="http://schemas.microsoft.com/office/drawing/2016/5/11/chartex" xmlns:cx6="http://schemas.microsoft.com/office/drawing/2016/5/12/chartex" xmlns:cx7="http://schemas.microsoft.com/office/drawing/2016/5/13/chartex" xmlns:cx8="http://schemas.microsoft.com/office/drawing/2016/5/14/chartex" xmlns:mc="http://schemas.openxmlformats.org/markup-compatibility/2006" xmlns:aink="http://schemas.microsoft.com/office/drawing/2016/ink" xmlns:am3d="http://schemas.microsoft.com/office/drawing/2017/model3d" xmlns:o="urn:schemas-microsoft-com:office:office" xmlns:oel="http://schemas.microsoft.com/office/2019/extlst" xmlns:r="http://schemas.openxmlformats.org/officeDocument/2006/relationships" xmlns:m="http://schemas.openxmlformats.org/officeDocument/2006/math" xmlns:v="urn:schemas-microsoft-com:vml" xmlns:wp14="http://schemas.microsoft.com/office/word/2010/wordprocessingDrawing" xmlns:wp="http://schemas.openxmlformats.org/drawingml/2006/wordprocessingDrawing" xmlns:w10="urn:schemas-microsoft-com:office:word" xmlns:w="http://schemas.openxmlformats.org/wordprocessingml/2006/main" xmlns:w14="http://schemas.microsoft.com/office/word/2010/wordml" xmlns:w15="http://schemas.microsoft.com/office/word/2012/wordml" xmlns:w16cex="http://schemas.microsoft.com/office/word/2018/wordml/cex" xmlns:w16cid="http://schemas.microsoft.com/office/word/2016/wordml/cid" xmlns:w16="http://schemas.microsoft.com/office/word/2018/wordml" xmlns:w16du="http://schemas.microsoft.com/office/word/2023/wordml/word16du" xmlns:w16sdtdh="http://schemas.microsoft.com/office/word/2020/wordml/sdtdatahash" xmlns:w16sdtfl="http://schemas.microsoft.com/office/word/2024/wordml/sdtformatlock" xmlns:w16se="http://schemas.microsoft.com/office/word/2015/wordml/symex" xmlns:wpg="http://schemas.microsoft.com/office/word/2010/wordprocessingGroup" xmlns:wpi="http://schemas.microsoft.com/office/word/2010/wordprocessingInk" xmlns:wne="http://schemas.microsoft.com/office/word/2006/wordml" xmlns:wps="http://schemas.microsoft.com/office/word/2010/wordprocessingShape" mc:Ignorable="w14 w15 w16se w16cid w16 w16cex w16sdtdh w16sdtfl w16du wp14">
   <w15:person w15:author="DB">
     <w15:presenceInfo w15:providerId="None" w15:userId="DB"/>
   </w15:person>
@@ -9714,7 +8293,7 @@
 </file>
 
 <file path=word/styles.xml><?xml version="1.0" encoding="utf-8"?>
-<w:styles xmlns:mc="http://schemas.openxmlformats.org/markup-compatibility/2006" xmlns:r="http://schemas.openxmlformats.org/officeDocument/2006/relationships" xmlns:w="http://schemas.openxmlformats.org/wordprocessingml/2006/main" xmlns:w14="http://schemas.microsoft.com/office/word/2010/wordml" xmlns:w15="http://schemas.microsoft.com/office/word/2012/wordml" xmlns:w16se="http://schemas.microsoft.com/office/word/2015/wordml/symex" mc:Ignorable="w14 w15 w16se">
+<w:styles xmlns:mc="http://schemas.openxmlformats.org/markup-compatibility/2006" xmlns:r="http://schemas.openxmlformats.org/officeDocument/2006/relationships" xmlns:w="http://schemas.openxmlformats.org/wordprocessingml/2006/main" xmlns:w14="http://schemas.microsoft.com/office/word/2010/wordml" xmlns:w15="http://schemas.microsoft.com/office/word/2012/wordml" xmlns:w16cex="http://schemas.microsoft.com/office/word/2018/wordml/cex" xmlns:w16cid="http://schemas.microsoft.com/office/word/2016/wordml/cid" xmlns:w16="http://schemas.microsoft.com/office/word/2018/wordml" xmlns:w16du="http://schemas.microsoft.com/office/word/2023/wordml/word16du" xmlns:w16sdtdh="http://schemas.microsoft.com/office/word/2020/wordml/sdtdatahash" xmlns:w16sdtfl="http://schemas.microsoft.com/office/word/2024/wordml/sdtformatlock" xmlns:w16se="http://schemas.microsoft.com/office/word/2015/wordml/symex" mc:Ignorable="w14 w15 w16se w16cid w16 w16cex w16sdtdh w16sdtfl w16du">
   <w:docDefaults>
     <w:rPrDefault>
       <w:rPr>
@@ -9732,7 +8311,7 @@
       </w:pPr>
     </w:pPrDefault>
   </w:docDefaults>
-  <w:latentStyles w:defLockedState="0" w:defUIPriority="99" w:defSemiHidden="0" w:defUnhideWhenUsed="0" w:defQFormat="0" w:count="371">
+  <w:latentStyles w:defLockedState="0" w:defUIPriority="99" w:defSemiHidden="0" w:defUnhideWhenUsed="0" w:defQFormat="0" w:count="376">
     <w:lsdException w:name="Normal" w:uiPriority="0" w:qFormat="1"/>
     <w:lsdException w:name="heading 1" w:uiPriority="9" w:qFormat="1"/>
     <w:lsdException w:name="heading 2" w:semiHidden="1" w:uiPriority="9" w:unhideWhenUsed="1" w:qFormat="1"/>
@@ -10104,6 +8683,11 @@
     <w:lsdException w:name="List Table 5 Dark Accent 6" w:uiPriority="50"/>
     <w:lsdException w:name="List Table 6 Colorful Accent 6" w:uiPriority="51"/>
     <w:lsdException w:name="List Table 7 Colorful Accent 6" w:uiPriority="52"/>
+    <w:lsdException w:name="Mention" w:semiHidden="1" w:unhideWhenUsed="1"/>
+    <w:lsdException w:name="Smart Hyperlink" w:semiHidden="1" w:unhideWhenUsed="1"/>
+    <w:lsdException w:name="Hashtag" w:semiHidden="1" w:unhideWhenUsed="1"/>
+    <w:lsdException w:name="Unresolved Mention" w:semiHidden="1" w:unhideWhenUsed="1"/>
+    <w:lsdException w:name="Smart Link" w:semiHidden="1" w:unhideWhenUsed="1"/>
   </w:latentStyles>
   <w:style w:type="paragraph" w:default="1" w:styleId="Normal">
     <w:name w:val="Normal"/>
@@ -10318,6 +8902,7 @@
   <w:style w:type="character" w:default="1" w:styleId="Fontepargpadro">
     <w:name w:val="Default Paragraph Font"/>
     <w:uiPriority w:val="1"/>
+    <w:semiHidden/>
     <w:unhideWhenUsed/>
   </w:style>
   <w:style w:type="table" w:default="1" w:styleId="Tabelanormal">

</xml_diff>